<commit_message>
se agrega captura wireshark
</commit_message>
<xml_diff>
--- a/Madrid_Darien_CIB302_Semana5.docx
+++ b/Madrid_Darien_CIB302_Semana5.docx
@@ -1,6 +1,6 @@
 
 <file path=word/document.xml><?xml version="1.0" encoding="utf-8"?>
-<w:document xmlns:wpc="http://schemas.microsoft.com/office/word/2010/wordprocessingCanvas" xmlns:cx="http://schemas.microsoft.com/office/drawing/2014/chartex" xmlns:mc="http://schemas.openxmlformats.org/markup-compatibility/2006" xmlns:o="urn:schemas-microsoft-com:office:office" xmlns:r="http://schemas.openxmlformats.org/officeDocument/2006/relationships" xmlns:m="http://schemas.openxmlformats.org/officeDocument/2006/math" xmlns:v="urn:schemas-microsoft-com:vml" xmlns:wp14="http://schemas.microsoft.com/office/word/2010/wordprocessingDrawing" xmlns:wp="http://schemas.openxmlformats.org/drawingml/2006/wordprocessingDrawing" xmlns:w10="urn:schemas-microsoft-com:office:word" xmlns:w="http://schemas.openxmlformats.org/wordprocessingml/2006/main" xmlns:w14="http://schemas.microsoft.com/office/word/2010/wordml" xmlns:w15="http://schemas.microsoft.com/office/word/2012/wordml" xmlns:w16se="http://schemas.microsoft.com/office/word/2015/wordml/symex" xmlns:wpg="http://schemas.microsoft.com/office/word/2010/wordprocessingGroup" xmlns:wpi="http://schemas.microsoft.com/office/word/2010/wordprocessingInk" xmlns:wne="http://schemas.microsoft.com/office/word/2006/wordml" xmlns:wps="http://schemas.microsoft.com/office/word/2010/wordprocessingShape" mc:Ignorable="w14 w15 w16se wp14">
+<w:document xmlns:wpc="http://schemas.microsoft.com/office/word/2010/wordprocessingCanvas" xmlns:cx="http://schemas.microsoft.com/office/drawing/2014/chartex" xmlns:cx1="http://schemas.microsoft.com/office/drawing/2015/9/8/chartex" xmlns:cx2="http://schemas.microsoft.com/office/drawing/2015/10/21/chartex" xmlns:cx3="http://schemas.microsoft.com/office/drawing/2016/5/9/chartex" xmlns:cx4="http://schemas.microsoft.com/office/drawing/2016/5/10/chartex" xmlns:cx5="http://schemas.microsoft.com/office/drawing/2016/5/11/chartex" xmlns:cx6="http://schemas.microsoft.com/office/drawing/2016/5/12/chartex" xmlns:cx7="http://schemas.microsoft.com/office/drawing/2016/5/13/chartex" xmlns:cx8="http://schemas.microsoft.com/office/drawing/2016/5/14/chartex" xmlns:mc="http://schemas.openxmlformats.org/markup-compatibility/2006" xmlns:aink="http://schemas.microsoft.com/office/drawing/2016/ink" xmlns:am3d="http://schemas.microsoft.com/office/drawing/2017/model3d" xmlns:o="urn:schemas-microsoft-com:office:office" xmlns:oel="http://schemas.microsoft.com/office/2019/extlst" xmlns:r="http://schemas.openxmlformats.org/officeDocument/2006/relationships" xmlns:m="http://schemas.openxmlformats.org/officeDocument/2006/math" xmlns:v="urn:schemas-microsoft-com:vml" xmlns:wp14="http://schemas.microsoft.com/office/word/2010/wordprocessingDrawing" xmlns:wp="http://schemas.openxmlformats.org/drawingml/2006/wordprocessingDrawing" xmlns:w10="urn:schemas-microsoft-com:office:word" xmlns:w="http://schemas.openxmlformats.org/wordprocessingml/2006/main" xmlns:w14="http://schemas.microsoft.com/office/word/2010/wordml" xmlns:w15="http://schemas.microsoft.com/office/word/2012/wordml" xmlns:w16cex="http://schemas.microsoft.com/office/word/2018/wordml/cex" xmlns:w16cid="http://schemas.microsoft.com/office/word/2016/wordml/cid" xmlns:w16="http://schemas.microsoft.com/office/word/2018/wordml" xmlns:w16du="http://schemas.microsoft.com/office/word/2023/wordml/word16du" xmlns:w16sdtdh="http://schemas.microsoft.com/office/word/2020/wordml/sdtdatahash" xmlns:w16sdtfl="http://schemas.microsoft.com/office/word/2024/wordml/sdtformatlock" xmlns:w16se="http://schemas.microsoft.com/office/word/2015/wordml/symex" xmlns:wpg="http://schemas.microsoft.com/office/word/2010/wordprocessingGroup" xmlns:wpi="http://schemas.microsoft.com/office/word/2010/wordprocessingInk" xmlns:wne="http://schemas.microsoft.com/office/word/2006/wordml" xmlns:wps="http://schemas.microsoft.com/office/word/2010/wordprocessingShape" mc:Ignorable="w14 w15 w16se w16cid w16 w16cex w16sdtdh w16sdtfl w16du wp14">
   <w:body>
     <w:p>
       <w:pPr>
@@ -57,7 +57,7 @@
                     <pic:cNvPicPr/>
                   </pic:nvPicPr>
                   <pic:blipFill>
-                    <a:blip r:embed="rId8">
+                    <a:blip r:embed="rId10">
                       <a:extLst>
                         <a:ext uri="{28A0092B-C50C-407E-A947-70E740481C1C}">
                           <a14:useLocalDpi xmlns:a14="http://schemas.microsoft.com/office/drawing/2010/main"/>
@@ -1277,7 +1277,22 @@
           <w:b/>
         </w:rPr>
         <w:lastRenderedPageBreak/>
-        <w:t>TABLA DE ILUSTRACIONES</w:t>
+        <w:t>TABLA DE ILUS</w:t>
+      </w:r>
+      <w:r>
+        <w:rPr>
+          <w:rStyle w:val="Refdenotaalpie"/>
+          <w:rFonts w:ascii="Arial" w:hAnsi="Arial" w:cs="Arial"/>
+          <w:b/>
+        </w:rPr>
+        <w:footnoteReference w:id="1"/>
+      </w:r>
+      <w:r>
+        <w:rPr>
+          <w:rFonts w:ascii="Arial" w:hAnsi="Arial" w:cs="Arial"/>
+          <w:b/>
+        </w:rPr>
+        <w:t>TRACIONES</w:t>
       </w:r>
     </w:p>
     <w:p>
@@ -1286,10 +1301,11 @@
         <w:tabs>
           <w:tab w:val="right" w:leader="dot" w:pos="8828"/>
         </w:tabs>
-        <w:spacing w:line="480" w:lineRule="auto"/>
-        <w:rPr>
-          <w:rFonts w:ascii="Arial" w:hAnsi="Arial" w:cs="Arial"/>
+        <w:spacing w:line="360" w:lineRule="auto"/>
+        <w:rPr>
+          <w:rFonts w:eastAsiaTheme="minorEastAsia"/>
           <w:noProof/>
+          <w:lang w:eastAsia="es-CL"/>
         </w:rPr>
       </w:pPr>
       <w:r>
@@ -1313,18 +1329,18 @@
         </w:rPr>
         <w:fldChar w:fldCharType="separate"/>
       </w:r>
-      <w:hyperlink w:anchor="_Toc227449322" w:history="1">
+      <w:hyperlink w:anchor="_Toc227603158" w:history="1">
         <w:r>
           <w:rPr>
             <w:rStyle w:val="Hipervnculo"/>
             <w:rFonts w:ascii="Arial" w:hAnsi="Arial" w:cs="Arial"/>
-            <w:noProof/>
-          </w:rPr>
-          <w:t>Ilustración 1. Terminal de OpenSSL en Windows 11.</w:t>
-        </w:r>
-        <w:r>
-          <w:rPr>
-            <w:rFonts w:ascii="Arial" w:hAnsi="Arial" w:cs="Arial"/>
+            <w:b/>
+            <w:noProof/>
+          </w:rPr>
+          <w:t>Imagen 1. Terminal de OpenSSL en Windows 11.</w:t>
+        </w:r>
+        <w:r>
+          <w:rPr>
             <w:noProof/>
             <w:webHidden/>
           </w:rPr>
@@ -1332,7 +1348,6 @@
         </w:r>
         <w:r>
           <w:rPr>
-            <w:rFonts w:ascii="Arial" w:hAnsi="Arial" w:cs="Arial"/>
             <w:noProof/>
             <w:webHidden/>
           </w:rPr>
@@ -1340,22 +1355,19 @@
         </w:r>
         <w:r>
           <w:rPr>
-            <w:rFonts w:ascii="Arial" w:hAnsi="Arial" w:cs="Arial"/>
             <w:noProof/>
             <w:webHidden/>
           </w:rPr>
-          <w:instrText xml:space="preserve"> PAGEREF _Toc227449322 \h </w:instrText>
-        </w:r>
-        <w:r>
-          <w:rPr>
-            <w:rFonts w:ascii="Arial" w:hAnsi="Arial" w:cs="Arial"/>
+          <w:instrText xml:space="preserve"> PAGEREF _Toc227603158 \h </w:instrText>
+        </w:r>
+        <w:r>
+          <w:rPr>
             <w:noProof/>
             <w:webHidden/>
           </w:rPr>
         </w:r>
         <w:r>
           <w:rPr>
-            <w:rFonts w:ascii="Arial" w:hAnsi="Arial" w:cs="Arial"/>
             <w:noProof/>
             <w:webHidden/>
           </w:rPr>
@@ -1363,7 +1375,6 @@
         </w:r>
         <w:r>
           <w:rPr>
-            <w:rFonts w:ascii="Arial" w:hAnsi="Arial" w:cs="Arial"/>
             <w:noProof/>
             <w:webHidden/>
           </w:rPr>
@@ -1371,7 +1382,6 @@
         </w:r>
         <w:r>
           <w:rPr>
-            <w:rFonts w:ascii="Arial" w:hAnsi="Arial" w:cs="Arial"/>
             <w:noProof/>
             <w:webHidden/>
           </w:rPr>
@@ -1385,24 +1395,25 @@
         <w:tabs>
           <w:tab w:val="right" w:leader="dot" w:pos="8828"/>
         </w:tabs>
-        <w:spacing w:line="480" w:lineRule="auto"/>
-        <w:rPr>
-          <w:rFonts w:ascii="Arial" w:hAnsi="Arial" w:cs="Arial"/>
+        <w:spacing w:line="360" w:lineRule="auto"/>
+        <w:rPr>
+          <w:rFonts w:eastAsiaTheme="minorEastAsia"/>
           <w:noProof/>
-        </w:rPr>
-      </w:pPr>
-      <w:hyperlink w:anchor="_Toc227449323" w:history="1">
+          <w:lang w:eastAsia="es-CL"/>
+        </w:rPr>
+      </w:pPr>
+      <w:hyperlink w:anchor="_Toc227603159" w:history="1">
         <w:r>
           <w:rPr>
             <w:rStyle w:val="Hipervnculo"/>
             <w:rFonts w:ascii="Arial" w:hAnsi="Arial" w:cs="Arial"/>
-            <w:noProof/>
-          </w:rPr>
-          <w:t>Ilustración 2. Código para generar clave secreta del servidor y certificado auto</w:t>
-        </w:r>
-        <w:r>
-          <w:rPr>
-            <w:rFonts w:ascii="Arial" w:hAnsi="Arial" w:cs="Arial"/>
+            <w:b/>
+            <w:noProof/>
+          </w:rPr>
+          <w:t>Imagen 2. Código para generar clave secreta del servidor y certificado auto</w:t>
+        </w:r>
+        <w:r>
+          <w:rPr>
             <w:noProof/>
             <w:webHidden/>
           </w:rPr>
@@ -1410,7 +1421,6 @@
         </w:r>
         <w:r>
           <w:rPr>
-            <w:rFonts w:ascii="Arial" w:hAnsi="Arial" w:cs="Arial"/>
             <w:noProof/>
             <w:webHidden/>
           </w:rPr>
@@ -1418,22 +1428,19 @@
         </w:r>
         <w:r>
           <w:rPr>
-            <w:rFonts w:ascii="Arial" w:hAnsi="Arial" w:cs="Arial"/>
             <w:noProof/>
             <w:webHidden/>
           </w:rPr>
-          <w:instrText xml:space="preserve"> PAGEREF _Toc227449323 \h </w:instrText>
-        </w:r>
-        <w:r>
-          <w:rPr>
-            <w:rFonts w:ascii="Arial" w:hAnsi="Arial" w:cs="Arial"/>
+          <w:instrText xml:space="preserve"> PAGEREF _Toc227603159 \h </w:instrText>
+        </w:r>
+        <w:r>
+          <w:rPr>
             <w:noProof/>
             <w:webHidden/>
           </w:rPr>
         </w:r>
         <w:r>
           <w:rPr>
-            <w:rFonts w:ascii="Arial" w:hAnsi="Arial" w:cs="Arial"/>
             <w:noProof/>
             <w:webHidden/>
           </w:rPr>
@@ -1441,15 +1448,13 @@
         </w:r>
         <w:r>
           <w:rPr>
-            <w:rFonts w:ascii="Arial" w:hAnsi="Arial" w:cs="Arial"/>
             <w:noProof/>
             <w:webHidden/>
           </w:rPr>
-          <w:t>5</w:t>
-        </w:r>
-        <w:r>
-          <w:rPr>
-            <w:rFonts w:ascii="Arial" w:hAnsi="Arial" w:cs="Arial"/>
+          <w:t>6</w:t>
+        </w:r>
+        <w:r>
+          <w:rPr>
             <w:noProof/>
             <w:webHidden/>
           </w:rPr>
@@ -1463,24 +1468,25 @@
         <w:tabs>
           <w:tab w:val="right" w:leader="dot" w:pos="8828"/>
         </w:tabs>
-        <w:spacing w:line="480" w:lineRule="auto"/>
-        <w:rPr>
-          <w:rFonts w:ascii="Arial" w:hAnsi="Arial" w:cs="Arial"/>
+        <w:spacing w:line="360" w:lineRule="auto"/>
+        <w:rPr>
+          <w:rFonts w:eastAsiaTheme="minorEastAsia"/>
           <w:noProof/>
-        </w:rPr>
-      </w:pPr>
-      <w:hyperlink w:anchor="_Toc227449324" w:history="1">
+          <w:lang w:eastAsia="es-CL"/>
+        </w:rPr>
+      </w:pPr>
+      <w:hyperlink w:anchor="_Toc227603160" w:history="1">
         <w:r>
           <w:rPr>
             <w:rStyle w:val="Hipervnculo"/>
             <w:rFonts w:ascii="Arial" w:hAnsi="Arial" w:cs="Arial"/>
-            <w:noProof/>
-          </w:rPr>
-          <w:t>Ilustración 3. Datos internos de un certificado creado con openssl.</w:t>
-        </w:r>
-        <w:r>
-          <w:rPr>
-            <w:rFonts w:ascii="Arial" w:hAnsi="Arial" w:cs="Arial"/>
+            <w:b/>
+            <w:noProof/>
+          </w:rPr>
+          <w:t>Imagen 3. Datos internos de un certificado creado con openssl.</w:t>
+        </w:r>
+        <w:r>
+          <w:rPr>
             <w:noProof/>
             <w:webHidden/>
           </w:rPr>
@@ -1488,7 +1494,6 @@
         </w:r>
         <w:r>
           <w:rPr>
-            <w:rFonts w:ascii="Arial" w:hAnsi="Arial" w:cs="Arial"/>
             <w:noProof/>
             <w:webHidden/>
           </w:rPr>
@@ -1496,22 +1501,19 @@
         </w:r>
         <w:r>
           <w:rPr>
-            <w:rFonts w:ascii="Arial" w:hAnsi="Arial" w:cs="Arial"/>
             <w:noProof/>
             <w:webHidden/>
           </w:rPr>
-          <w:instrText xml:space="preserve"> PAGEREF _Toc227449324 \h </w:instrText>
-        </w:r>
-        <w:r>
-          <w:rPr>
-            <w:rFonts w:ascii="Arial" w:hAnsi="Arial" w:cs="Arial"/>
+          <w:instrText xml:space="preserve"> PAGEREF _Toc227603160 \h </w:instrText>
+        </w:r>
+        <w:r>
+          <w:rPr>
             <w:noProof/>
             <w:webHidden/>
           </w:rPr>
         </w:r>
         <w:r>
           <w:rPr>
-            <w:rFonts w:ascii="Arial" w:hAnsi="Arial" w:cs="Arial"/>
             <w:noProof/>
             <w:webHidden/>
           </w:rPr>
@@ -1519,15 +1521,13 @@
         </w:r>
         <w:r>
           <w:rPr>
-            <w:rFonts w:ascii="Arial" w:hAnsi="Arial" w:cs="Arial"/>
             <w:noProof/>
             <w:webHidden/>
           </w:rPr>
-          <w:t>6</w:t>
-        </w:r>
-        <w:r>
-          <w:rPr>
-            <w:rFonts w:ascii="Arial" w:hAnsi="Arial" w:cs="Arial"/>
+          <w:t>7</w:t>
+        </w:r>
+        <w:r>
+          <w:rPr>
             <w:noProof/>
             <w:webHidden/>
           </w:rPr>
@@ -1541,24 +1541,25 @@
         <w:tabs>
           <w:tab w:val="right" w:leader="dot" w:pos="8828"/>
         </w:tabs>
-        <w:spacing w:line="480" w:lineRule="auto"/>
-        <w:rPr>
-          <w:rFonts w:ascii="Arial" w:hAnsi="Arial" w:cs="Arial"/>
+        <w:spacing w:line="360" w:lineRule="auto"/>
+        <w:rPr>
+          <w:rFonts w:eastAsiaTheme="minorEastAsia"/>
           <w:noProof/>
-        </w:rPr>
-      </w:pPr>
-      <w:hyperlink w:anchor="_Toc227449325" w:history="1">
+          <w:lang w:eastAsia="es-CL"/>
+        </w:rPr>
+      </w:pPr>
+      <w:hyperlink w:anchor="_Toc227603161" w:history="1">
         <w:r>
           <w:rPr>
             <w:rStyle w:val="Hipervnculo"/>
             <w:rFonts w:ascii="Arial" w:hAnsi="Arial" w:cs="Arial"/>
-            <w:noProof/>
-          </w:rPr>
-          <w:t>Ilustración 4. Código de app.js, para habilitar HTTPS.</w:t>
-        </w:r>
-        <w:r>
-          <w:rPr>
-            <w:rFonts w:ascii="Arial" w:hAnsi="Arial" w:cs="Arial"/>
+            <w:b/>
+            <w:noProof/>
+          </w:rPr>
+          <w:t>Imagen 4. Código de app.js, para habilitar HTTPS.</w:t>
+        </w:r>
+        <w:r>
+          <w:rPr>
             <w:noProof/>
             <w:webHidden/>
           </w:rPr>
@@ -1566,7 +1567,6 @@
         </w:r>
         <w:r>
           <w:rPr>
-            <w:rFonts w:ascii="Arial" w:hAnsi="Arial" w:cs="Arial"/>
             <w:noProof/>
             <w:webHidden/>
           </w:rPr>
@@ -1574,22 +1574,19 @@
         </w:r>
         <w:r>
           <w:rPr>
-            <w:rFonts w:ascii="Arial" w:hAnsi="Arial" w:cs="Arial"/>
             <w:noProof/>
             <w:webHidden/>
           </w:rPr>
-          <w:instrText xml:space="preserve"> PAGEREF _Toc227449325 \h </w:instrText>
-        </w:r>
-        <w:r>
-          <w:rPr>
-            <w:rFonts w:ascii="Arial" w:hAnsi="Arial" w:cs="Arial"/>
+          <w:instrText xml:space="preserve"> PAGEREF _Toc227603161 \h </w:instrText>
+        </w:r>
+        <w:r>
+          <w:rPr>
             <w:noProof/>
             <w:webHidden/>
           </w:rPr>
         </w:r>
         <w:r>
           <w:rPr>
-            <w:rFonts w:ascii="Arial" w:hAnsi="Arial" w:cs="Arial"/>
             <w:noProof/>
             <w:webHidden/>
           </w:rPr>
@@ -1597,15 +1594,13 @@
         </w:r>
         <w:r>
           <w:rPr>
-            <w:rFonts w:ascii="Arial" w:hAnsi="Arial" w:cs="Arial"/>
             <w:noProof/>
             <w:webHidden/>
           </w:rPr>
-          <w:t>7</w:t>
-        </w:r>
-        <w:r>
-          <w:rPr>
-            <w:rFonts w:ascii="Arial" w:hAnsi="Arial" w:cs="Arial"/>
+          <w:t>8</w:t>
+        </w:r>
+        <w:r>
+          <w:rPr>
             <w:noProof/>
             <w:webHidden/>
           </w:rPr>
@@ -1619,24 +1614,25 @@
         <w:tabs>
           <w:tab w:val="right" w:leader="dot" w:pos="8828"/>
         </w:tabs>
-        <w:spacing w:line="480" w:lineRule="auto"/>
-        <w:rPr>
-          <w:rFonts w:ascii="Arial" w:hAnsi="Arial" w:cs="Arial"/>
+        <w:spacing w:line="360" w:lineRule="auto"/>
+        <w:rPr>
+          <w:rFonts w:eastAsiaTheme="minorEastAsia"/>
           <w:noProof/>
-        </w:rPr>
-      </w:pPr>
-      <w:hyperlink w:anchor="_Toc227449326" w:history="1">
+          <w:lang w:eastAsia="es-CL"/>
+        </w:rPr>
+      </w:pPr>
+      <w:hyperlink w:anchor="_Toc227603162" w:history="1">
         <w:r>
           <w:rPr>
             <w:rStyle w:val="Hipervnculo"/>
             <w:rFonts w:ascii="Arial" w:hAnsi="Arial" w:cs="Arial"/>
-            <w:noProof/>
-          </w:rPr>
-          <w:t>Ilustración 5. Inicio de servidor en la terminal de VSC mediante node.js</w:t>
-        </w:r>
-        <w:r>
-          <w:rPr>
-            <w:rFonts w:ascii="Arial" w:hAnsi="Arial" w:cs="Arial"/>
+            <w:b/>
+            <w:noProof/>
+          </w:rPr>
+          <w:t>Imagen 5. Inicio de servidor en la terminal de VSC mediante node.js</w:t>
+        </w:r>
+        <w:r>
+          <w:rPr>
             <w:noProof/>
             <w:webHidden/>
           </w:rPr>
@@ -1644,7 +1640,6 @@
         </w:r>
         <w:r>
           <w:rPr>
-            <w:rFonts w:ascii="Arial" w:hAnsi="Arial" w:cs="Arial"/>
             <w:noProof/>
             <w:webHidden/>
           </w:rPr>
@@ -1652,22 +1647,19 @@
         </w:r>
         <w:r>
           <w:rPr>
-            <w:rFonts w:ascii="Arial" w:hAnsi="Arial" w:cs="Arial"/>
             <w:noProof/>
             <w:webHidden/>
           </w:rPr>
-          <w:instrText xml:space="preserve"> PAGEREF _Toc227449326 \h </w:instrText>
-        </w:r>
-        <w:r>
-          <w:rPr>
-            <w:rFonts w:ascii="Arial" w:hAnsi="Arial" w:cs="Arial"/>
+          <w:instrText xml:space="preserve"> PAGEREF _Toc227603162 \h </w:instrText>
+        </w:r>
+        <w:r>
+          <w:rPr>
             <w:noProof/>
             <w:webHidden/>
           </w:rPr>
         </w:r>
         <w:r>
           <w:rPr>
-            <w:rFonts w:ascii="Arial" w:hAnsi="Arial" w:cs="Arial"/>
             <w:noProof/>
             <w:webHidden/>
           </w:rPr>
@@ -1675,15 +1667,13 @@
         </w:r>
         <w:r>
           <w:rPr>
-            <w:rFonts w:ascii="Arial" w:hAnsi="Arial" w:cs="Arial"/>
             <w:noProof/>
             <w:webHidden/>
           </w:rPr>
-          <w:t>8</w:t>
-        </w:r>
-        <w:r>
-          <w:rPr>
-            <w:rFonts w:ascii="Arial" w:hAnsi="Arial" w:cs="Arial"/>
+          <w:t>9</w:t>
+        </w:r>
+        <w:r>
+          <w:rPr>
             <w:noProof/>
             <w:webHidden/>
           </w:rPr>
@@ -1697,24 +1687,25 @@
         <w:tabs>
           <w:tab w:val="right" w:leader="dot" w:pos="8828"/>
         </w:tabs>
-        <w:spacing w:line="480" w:lineRule="auto"/>
-        <w:rPr>
-          <w:rFonts w:ascii="Arial" w:hAnsi="Arial" w:cs="Arial"/>
+        <w:spacing w:line="360" w:lineRule="auto"/>
+        <w:rPr>
+          <w:rFonts w:eastAsiaTheme="minorEastAsia"/>
           <w:noProof/>
-        </w:rPr>
-      </w:pPr>
-      <w:hyperlink w:anchor="_Toc227449327" w:history="1">
+          <w:lang w:eastAsia="es-CL"/>
+        </w:rPr>
+      </w:pPr>
+      <w:hyperlink w:anchor="_Toc227603163" w:history="1">
         <w:r>
           <w:rPr>
             <w:rStyle w:val="Hipervnculo"/>
             <w:rFonts w:ascii="Arial" w:hAnsi="Arial" w:cs="Arial"/>
-            <w:noProof/>
-          </w:rPr>
-          <w:t>Ilustración 6. Servidor HTTP funcionando correctamente.</w:t>
-        </w:r>
-        <w:r>
-          <w:rPr>
-            <w:rFonts w:ascii="Arial" w:hAnsi="Arial" w:cs="Arial"/>
+            <w:b/>
+            <w:noProof/>
+          </w:rPr>
+          <w:t>Imagen 6. Servidor HTTP funcionando correctamente.</w:t>
+        </w:r>
+        <w:r>
+          <w:rPr>
             <w:noProof/>
             <w:webHidden/>
           </w:rPr>
@@ -1722,7 +1713,6 @@
         </w:r>
         <w:r>
           <w:rPr>
-            <w:rFonts w:ascii="Arial" w:hAnsi="Arial" w:cs="Arial"/>
             <w:noProof/>
             <w:webHidden/>
           </w:rPr>
@@ -1730,22 +1720,19 @@
         </w:r>
         <w:r>
           <w:rPr>
-            <w:rFonts w:ascii="Arial" w:hAnsi="Arial" w:cs="Arial"/>
             <w:noProof/>
             <w:webHidden/>
           </w:rPr>
-          <w:instrText xml:space="preserve"> PAGEREF _Toc227449327 \h </w:instrText>
-        </w:r>
-        <w:r>
-          <w:rPr>
-            <w:rFonts w:ascii="Arial" w:hAnsi="Arial" w:cs="Arial"/>
+          <w:instrText xml:space="preserve"> PAGEREF _Toc227603163 \h </w:instrText>
+        </w:r>
+        <w:r>
+          <w:rPr>
             <w:noProof/>
             <w:webHidden/>
           </w:rPr>
         </w:r>
         <w:r>
           <w:rPr>
-            <w:rFonts w:ascii="Arial" w:hAnsi="Arial" w:cs="Arial"/>
             <w:noProof/>
             <w:webHidden/>
           </w:rPr>
@@ -1753,15 +1740,13 @@
         </w:r>
         <w:r>
           <w:rPr>
-            <w:rFonts w:ascii="Arial" w:hAnsi="Arial" w:cs="Arial"/>
             <w:noProof/>
             <w:webHidden/>
           </w:rPr>
-          <w:t>8</w:t>
-        </w:r>
-        <w:r>
-          <w:rPr>
-            <w:rFonts w:ascii="Arial" w:hAnsi="Arial" w:cs="Arial"/>
+          <w:t>9</w:t>
+        </w:r>
+        <w:r>
+          <w:rPr>
             <w:noProof/>
             <w:webHidden/>
           </w:rPr>
@@ -1775,24 +1760,25 @@
         <w:tabs>
           <w:tab w:val="right" w:leader="dot" w:pos="8828"/>
         </w:tabs>
-        <w:spacing w:line="480" w:lineRule="auto"/>
-        <w:rPr>
-          <w:rFonts w:ascii="Arial" w:hAnsi="Arial" w:cs="Arial"/>
+        <w:spacing w:line="360" w:lineRule="auto"/>
+        <w:rPr>
+          <w:rFonts w:eastAsiaTheme="minorEastAsia"/>
           <w:noProof/>
-        </w:rPr>
-      </w:pPr>
-      <w:hyperlink w:anchor="_Toc227449328" w:history="1">
+          <w:lang w:eastAsia="es-CL"/>
+        </w:rPr>
+      </w:pPr>
+      <w:hyperlink w:anchor="_Toc227603164" w:history="1">
         <w:r>
           <w:rPr>
             <w:rStyle w:val="Hipervnculo"/>
             <w:rFonts w:ascii="Arial" w:hAnsi="Arial" w:cs="Arial"/>
-            <w:noProof/>
-          </w:rPr>
-          <w:t>Ilustración 7. Servidor HTTPS funcionando correctamente.</w:t>
-        </w:r>
-        <w:r>
-          <w:rPr>
-            <w:rFonts w:ascii="Arial" w:hAnsi="Arial" w:cs="Arial"/>
+            <w:b/>
+            <w:noProof/>
+          </w:rPr>
+          <w:t>Imagen 7. Servidor HTTPS funcionando correctamente.</w:t>
+        </w:r>
+        <w:r>
+          <w:rPr>
             <w:noProof/>
             <w:webHidden/>
           </w:rPr>
@@ -1800,7 +1786,6 @@
         </w:r>
         <w:r>
           <w:rPr>
-            <w:rFonts w:ascii="Arial" w:hAnsi="Arial" w:cs="Arial"/>
             <w:noProof/>
             <w:webHidden/>
           </w:rPr>
@@ -1808,22 +1793,19 @@
         </w:r>
         <w:r>
           <w:rPr>
-            <w:rFonts w:ascii="Arial" w:hAnsi="Arial" w:cs="Arial"/>
             <w:noProof/>
             <w:webHidden/>
           </w:rPr>
-          <w:instrText xml:space="preserve"> PAGEREF _Toc227449328 \h </w:instrText>
-        </w:r>
-        <w:r>
-          <w:rPr>
-            <w:rFonts w:ascii="Arial" w:hAnsi="Arial" w:cs="Arial"/>
+          <w:instrText xml:space="preserve"> PAGEREF _Toc227603164 \h </w:instrText>
+        </w:r>
+        <w:r>
+          <w:rPr>
             <w:noProof/>
             <w:webHidden/>
           </w:rPr>
         </w:r>
         <w:r>
           <w:rPr>
-            <w:rFonts w:ascii="Arial" w:hAnsi="Arial" w:cs="Arial"/>
             <w:noProof/>
             <w:webHidden/>
           </w:rPr>
@@ -1831,15 +1813,13 @@
         </w:r>
         <w:r>
           <w:rPr>
-            <w:rFonts w:ascii="Arial" w:hAnsi="Arial" w:cs="Arial"/>
             <w:noProof/>
             <w:webHidden/>
           </w:rPr>
-          <w:t>8</w:t>
-        </w:r>
-        <w:r>
-          <w:rPr>
-            <w:rFonts w:ascii="Arial" w:hAnsi="Arial" w:cs="Arial"/>
+          <w:t>9</w:t>
+        </w:r>
+        <w:r>
+          <w:rPr>
             <w:noProof/>
             <w:webHidden/>
           </w:rPr>
@@ -1853,24 +1833,25 @@
         <w:tabs>
           <w:tab w:val="right" w:leader="dot" w:pos="8828"/>
         </w:tabs>
-        <w:spacing w:line="480" w:lineRule="auto"/>
-        <w:rPr>
-          <w:rFonts w:ascii="Arial" w:hAnsi="Arial" w:cs="Arial"/>
+        <w:spacing w:line="360" w:lineRule="auto"/>
+        <w:rPr>
+          <w:rFonts w:eastAsiaTheme="minorEastAsia"/>
           <w:noProof/>
-        </w:rPr>
-      </w:pPr>
-      <w:hyperlink w:anchor="_Toc227449329" w:history="1">
+          <w:lang w:eastAsia="es-CL"/>
+        </w:rPr>
+      </w:pPr>
+      <w:hyperlink w:anchor="_Toc227603165" w:history="1">
         <w:r>
           <w:rPr>
             <w:rStyle w:val="Hipervnculo"/>
             <w:rFonts w:ascii="Arial" w:hAnsi="Arial" w:cs="Arial"/>
-            <w:noProof/>
-          </w:rPr>
-          <w:t>Ilustración 8. Aplicación de lectura de archivos .pem.</w:t>
-        </w:r>
-        <w:r>
-          <w:rPr>
-            <w:rFonts w:ascii="Arial" w:hAnsi="Arial" w:cs="Arial"/>
+            <w:b/>
+            <w:noProof/>
+          </w:rPr>
+          <w:t>Imagen 8. Aplicación de lectura de archivos .pem.</w:t>
+        </w:r>
+        <w:r>
+          <w:rPr>
             <w:noProof/>
             <w:webHidden/>
           </w:rPr>
@@ -1878,7 +1859,6 @@
         </w:r>
         <w:r>
           <w:rPr>
-            <w:rFonts w:ascii="Arial" w:hAnsi="Arial" w:cs="Arial"/>
             <w:noProof/>
             <w:webHidden/>
           </w:rPr>
@@ -1886,22 +1866,19 @@
         </w:r>
         <w:r>
           <w:rPr>
-            <w:rFonts w:ascii="Arial" w:hAnsi="Arial" w:cs="Arial"/>
             <w:noProof/>
             <w:webHidden/>
           </w:rPr>
-          <w:instrText xml:space="preserve"> PAGEREF _Toc227449329 \h </w:instrText>
-        </w:r>
-        <w:r>
-          <w:rPr>
-            <w:rFonts w:ascii="Arial" w:hAnsi="Arial" w:cs="Arial"/>
+          <w:instrText xml:space="preserve"> PAGEREF _Toc227603165 \h </w:instrText>
+        </w:r>
+        <w:r>
+          <w:rPr>
             <w:noProof/>
             <w:webHidden/>
           </w:rPr>
         </w:r>
         <w:r>
           <w:rPr>
-            <w:rFonts w:ascii="Arial" w:hAnsi="Arial" w:cs="Arial"/>
             <w:noProof/>
             <w:webHidden/>
           </w:rPr>
@@ -1909,15 +1886,13 @@
         </w:r>
         <w:r>
           <w:rPr>
-            <w:rFonts w:ascii="Arial" w:hAnsi="Arial" w:cs="Arial"/>
             <w:noProof/>
             <w:webHidden/>
           </w:rPr>
-          <w:t>10</w:t>
-        </w:r>
-        <w:r>
-          <w:rPr>
-            <w:rFonts w:ascii="Arial" w:hAnsi="Arial" w:cs="Arial"/>
+          <w:t>11</w:t>
+        </w:r>
+        <w:r>
+          <w:rPr>
             <w:noProof/>
             <w:webHidden/>
           </w:rPr>
@@ -1931,24 +1906,25 @@
         <w:tabs>
           <w:tab w:val="right" w:leader="dot" w:pos="8828"/>
         </w:tabs>
-        <w:spacing w:line="480" w:lineRule="auto"/>
-        <w:rPr>
-          <w:rFonts w:ascii="Arial" w:hAnsi="Arial" w:cs="Arial"/>
+        <w:spacing w:line="360" w:lineRule="auto"/>
+        <w:rPr>
+          <w:rFonts w:eastAsiaTheme="minorEastAsia"/>
           <w:noProof/>
-        </w:rPr>
-      </w:pPr>
-      <w:hyperlink w:anchor="_Toc227449330" w:history="1">
+          <w:lang w:eastAsia="es-CL"/>
+        </w:rPr>
+      </w:pPr>
+      <w:hyperlink w:anchor="_Toc227603166" w:history="1">
         <w:r>
           <w:rPr>
             <w:rStyle w:val="Hipervnculo"/>
             <w:rFonts w:ascii="Arial" w:hAnsi="Arial" w:cs="Arial"/>
-            <w:noProof/>
-          </w:rPr>
-          <w:t>Ilustración 9. Creación del servidor utilizando https.createServer.</w:t>
-        </w:r>
-        <w:r>
-          <w:rPr>
-            <w:rFonts w:ascii="Arial" w:hAnsi="Arial" w:cs="Arial"/>
+            <w:b/>
+            <w:noProof/>
+          </w:rPr>
+          <w:t>Imagen 9. Creación del servidor utilizando https.createServer.</w:t>
+        </w:r>
+        <w:r>
+          <w:rPr>
             <w:noProof/>
             <w:webHidden/>
           </w:rPr>
@@ -1956,7 +1932,6 @@
         </w:r>
         <w:r>
           <w:rPr>
-            <w:rFonts w:ascii="Arial" w:hAnsi="Arial" w:cs="Arial"/>
             <w:noProof/>
             <w:webHidden/>
           </w:rPr>
@@ -1964,22 +1939,19 @@
         </w:r>
         <w:r>
           <w:rPr>
-            <w:rFonts w:ascii="Arial" w:hAnsi="Arial" w:cs="Arial"/>
             <w:noProof/>
             <w:webHidden/>
           </w:rPr>
-          <w:instrText xml:space="preserve"> PAGEREF _Toc227449330 \h </w:instrText>
-        </w:r>
-        <w:r>
-          <w:rPr>
-            <w:rFonts w:ascii="Arial" w:hAnsi="Arial" w:cs="Arial"/>
+          <w:instrText xml:space="preserve"> PAGEREF _Toc227603166 \h </w:instrText>
+        </w:r>
+        <w:r>
+          <w:rPr>
             <w:noProof/>
             <w:webHidden/>
           </w:rPr>
         </w:r>
         <w:r>
           <w:rPr>
-            <w:rFonts w:ascii="Arial" w:hAnsi="Arial" w:cs="Arial"/>
             <w:noProof/>
             <w:webHidden/>
           </w:rPr>
@@ -1987,15 +1959,13 @@
         </w:r>
         <w:r>
           <w:rPr>
-            <w:rFonts w:ascii="Arial" w:hAnsi="Arial" w:cs="Arial"/>
             <w:noProof/>
             <w:webHidden/>
           </w:rPr>
-          <w:t>11</w:t>
-        </w:r>
-        <w:r>
-          <w:rPr>
-            <w:rFonts w:ascii="Arial" w:hAnsi="Arial" w:cs="Arial"/>
+          <w:t>12</w:t>
+        </w:r>
+        <w:r>
+          <w:rPr>
             <w:noProof/>
             <w:webHidden/>
           </w:rPr>
@@ -2009,24 +1979,25 @@
         <w:tabs>
           <w:tab w:val="right" w:leader="dot" w:pos="8828"/>
         </w:tabs>
-        <w:spacing w:line="480" w:lineRule="auto"/>
-        <w:rPr>
-          <w:rFonts w:ascii="Arial" w:hAnsi="Arial" w:cs="Arial"/>
+        <w:spacing w:line="360" w:lineRule="auto"/>
+        <w:rPr>
+          <w:rFonts w:eastAsiaTheme="minorEastAsia"/>
           <w:noProof/>
-        </w:rPr>
-      </w:pPr>
-      <w:hyperlink w:anchor="_Toc227449331" w:history="1">
+          <w:lang w:eastAsia="es-CL"/>
+        </w:rPr>
+      </w:pPr>
+      <w:hyperlink w:anchor="_Toc227603167" w:history="1">
         <w:r>
           <w:rPr>
             <w:rStyle w:val="Hipervnculo"/>
             <w:rFonts w:ascii="Arial" w:hAnsi="Arial" w:cs="Arial"/>
-            <w:noProof/>
-          </w:rPr>
-          <w:t>Ilustración 10. Servidores HTTP y HTTPS funcionando con el backend en forma correcta.</w:t>
-        </w:r>
-        <w:r>
-          <w:rPr>
-            <w:rFonts w:ascii="Arial" w:hAnsi="Arial" w:cs="Arial"/>
+            <w:b/>
+            <w:noProof/>
+          </w:rPr>
+          <w:t>Imagen 10. Servidores HTTP y HTTPS funcionando con el backend de forma correcta.</w:t>
+        </w:r>
+        <w:r>
+          <w:rPr>
             <w:noProof/>
             <w:webHidden/>
           </w:rPr>
@@ -2034,7 +2005,6 @@
         </w:r>
         <w:r>
           <w:rPr>
-            <w:rFonts w:ascii="Arial" w:hAnsi="Arial" w:cs="Arial"/>
             <w:noProof/>
             <w:webHidden/>
           </w:rPr>
@@ -2042,22 +2012,19 @@
         </w:r>
         <w:r>
           <w:rPr>
-            <w:rFonts w:ascii="Arial" w:hAnsi="Arial" w:cs="Arial"/>
             <w:noProof/>
             <w:webHidden/>
           </w:rPr>
-          <w:instrText xml:space="preserve"> PAGEREF _Toc227449331 \h </w:instrText>
-        </w:r>
-        <w:r>
-          <w:rPr>
-            <w:rFonts w:ascii="Arial" w:hAnsi="Arial" w:cs="Arial"/>
+          <w:instrText xml:space="preserve"> PAGEREF _Toc227603167 \h </w:instrText>
+        </w:r>
+        <w:r>
+          <w:rPr>
             <w:noProof/>
             <w:webHidden/>
           </w:rPr>
         </w:r>
         <w:r>
           <w:rPr>
-            <w:rFonts w:ascii="Arial" w:hAnsi="Arial" w:cs="Arial"/>
             <w:noProof/>
             <w:webHidden/>
           </w:rPr>
@@ -2065,15 +2032,13 @@
         </w:r>
         <w:r>
           <w:rPr>
-            <w:rFonts w:ascii="Arial" w:hAnsi="Arial" w:cs="Arial"/>
             <w:noProof/>
             <w:webHidden/>
           </w:rPr>
-          <w:t>11</w:t>
-        </w:r>
-        <w:r>
-          <w:rPr>
-            <w:rFonts w:ascii="Arial" w:hAnsi="Arial" w:cs="Arial"/>
+          <w:t>12</w:t>
+        </w:r>
+        <w:r>
+          <w:rPr>
             <w:noProof/>
             <w:webHidden/>
           </w:rPr>
@@ -2087,24 +2052,25 @@
         <w:tabs>
           <w:tab w:val="right" w:leader="dot" w:pos="8828"/>
         </w:tabs>
-        <w:spacing w:line="480" w:lineRule="auto"/>
-        <w:rPr>
-          <w:rFonts w:ascii="Arial" w:hAnsi="Arial" w:cs="Arial"/>
+        <w:spacing w:line="360" w:lineRule="auto"/>
+        <w:rPr>
+          <w:rFonts w:eastAsiaTheme="minorEastAsia"/>
           <w:noProof/>
-        </w:rPr>
-      </w:pPr>
-      <w:hyperlink w:anchor="_Toc227449332" w:history="1">
+          <w:lang w:eastAsia="es-CL"/>
+        </w:rPr>
+      </w:pPr>
+      <w:hyperlink w:anchor="_Toc227603168" w:history="1">
         <w:r>
           <w:rPr>
             <w:rStyle w:val="Hipervnculo"/>
             <w:rFonts w:ascii="Arial" w:hAnsi="Arial" w:cs="Arial"/>
-            <w:noProof/>
-          </w:rPr>
-          <w:t>Ilustración 11. Funcionamiento del servidor HTTPS, acceso no autorizado.</w:t>
-        </w:r>
-        <w:r>
-          <w:rPr>
-            <w:rFonts w:ascii="Arial" w:hAnsi="Arial" w:cs="Arial"/>
+            <w:b/>
+            <w:noProof/>
+          </w:rPr>
+          <w:t>Imagen 11. Funcionamiento del servidor HTTPS, acceso no autorizado.</w:t>
+        </w:r>
+        <w:r>
+          <w:rPr>
             <w:noProof/>
             <w:webHidden/>
           </w:rPr>
@@ -2112,7 +2078,6 @@
         </w:r>
         <w:r>
           <w:rPr>
-            <w:rFonts w:ascii="Arial" w:hAnsi="Arial" w:cs="Arial"/>
             <w:noProof/>
             <w:webHidden/>
           </w:rPr>
@@ -2120,22 +2085,19 @@
         </w:r>
         <w:r>
           <w:rPr>
-            <w:rFonts w:ascii="Arial" w:hAnsi="Arial" w:cs="Arial"/>
             <w:noProof/>
             <w:webHidden/>
           </w:rPr>
-          <w:instrText xml:space="preserve"> PAGEREF _Toc227449332 \h </w:instrText>
-        </w:r>
-        <w:r>
-          <w:rPr>
-            <w:rFonts w:ascii="Arial" w:hAnsi="Arial" w:cs="Arial"/>
+          <w:instrText xml:space="preserve"> PAGEREF _Toc227603168 \h </w:instrText>
+        </w:r>
+        <w:r>
+          <w:rPr>
             <w:noProof/>
             <w:webHidden/>
           </w:rPr>
         </w:r>
         <w:r>
           <w:rPr>
-            <w:rFonts w:ascii="Arial" w:hAnsi="Arial" w:cs="Arial"/>
             <w:noProof/>
             <w:webHidden/>
           </w:rPr>
@@ -2143,15 +2105,13 @@
         </w:r>
         <w:r>
           <w:rPr>
-            <w:rFonts w:ascii="Arial" w:hAnsi="Arial" w:cs="Arial"/>
             <w:noProof/>
             <w:webHidden/>
           </w:rPr>
-          <w:t>12</w:t>
-        </w:r>
-        <w:r>
-          <w:rPr>
-            <w:rFonts w:ascii="Arial" w:hAnsi="Arial" w:cs="Arial"/>
+          <w:t>14</w:t>
+        </w:r>
+        <w:r>
+          <w:rPr>
             <w:noProof/>
             <w:webHidden/>
           </w:rPr>
@@ -2165,24 +2125,25 @@
         <w:tabs>
           <w:tab w:val="right" w:leader="dot" w:pos="8828"/>
         </w:tabs>
-        <w:spacing w:line="480" w:lineRule="auto"/>
-        <w:rPr>
-          <w:rFonts w:ascii="Arial" w:hAnsi="Arial" w:cs="Arial"/>
+        <w:spacing w:line="360" w:lineRule="auto"/>
+        <w:rPr>
+          <w:rFonts w:eastAsiaTheme="minorEastAsia"/>
           <w:noProof/>
-        </w:rPr>
-      </w:pPr>
-      <w:hyperlink w:anchor="_Toc227449333" w:history="1">
+          <w:lang w:eastAsia="es-CL"/>
+        </w:rPr>
+      </w:pPr>
+      <w:hyperlink w:anchor="_Toc227603169" w:history="1">
         <w:r>
           <w:rPr>
             <w:rStyle w:val="Hipervnculo"/>
             <w:rFonts w:ascii="Arial" w:hAnsi="Arial" w:cs="Arial"/>
-            <w:noProof/>
-          </w:rPr>
-          <w:t>Ilustración 12. Certificado de HTTPS del localhost.</w:t>
-        </w:r>
-        <w:r>
-          <w:rPr>
-            <w:rFonts w:ascii="Arial" w:hAnsi="Arial" w:cs="Arial"/>
+            <w:b/>
+            <w:noProof/>
+          </w:rPr>
+          <w:t>Imagen 12. Certificado de HTTPS del localhost.</w:t>
+        </w:r>
+        <w:r>
+          <w:rPr>
             <w:noProof/>
             <w:webHidden/>
           </w:rPr>
@@ -2190,7 +2151,6 @@
         </w:r>
         <w:r>
           <w:rPr>
-            <w:rFonts w:ascii="Arial" w:hAnsi="Arial" w:cs="Arial"/>
             <w:noProof/>
             <w:webHidden/>
           </w:rPr>
@@ -2198,22 +2158,19 @@
         </w:r>
         <w:r>
           <w:rPr>
-            <w:rFonts w:ascii="Arial" w:hAnsi="Arial" w:cs="Arial"/>
             <w:noProof/>
             <w:webHidden/>
           </w:rPr>
-          <w:instrText xml:space="preserve"> PAGEREF _Toc227449333 \h </w:instrText>
-        </w:r>
-        <w:r>
-          <w:rPr>
-            <w:rFonts w:ascii="Arial" w:hAnsi="Arial" w:cs="Arial"/>
+          <w:instrText xml:space="preserve"> PAGEREF _Toc227603169 \h </w:instrText>
+        </w:r>
+        <w:r>
+          <w:rPr>
             <w:noProof/>
             <w:webHidden/>
           </w:rPr>
         </w:r>
         <w:r>
           <w:rPr>
-            <w:rFonts w:ascii="Arial" w:hAnsi="Arial" w:cs="Arial"/>
             <w:noProof/>
             <w:webHidden/>
           </w:rPr>
@@ -2221,15 +2178,13 @@
         </w:r>
         <w:r>
           <w:rPr>
-            <w:rFonts w:ascii="Arial" w:hAnsi="Arial" w:cs="Arial"/>
             <w:noProof/>
             <w:webHidden/>
           </w:rPr>
-          <w:t>15</w:t>
-        </w:r>
-        <w:r>
-          <w:rPr>
-            <w:rFonts w:ascii="Arial" w:hAnsi="Arial" w:cs="Arial"/>
+          <w:t>17</w:t>
+        </w:r>
+        <w:r>
+          <w:rPr>
             <w:noProof/>
             <w:webHidden/>
           </w:rPr>
@@ -2243,24 +2198,25 @@
         <w:tabs>
           <w:tab w:val="right" w:leader="dot" w:pos="8828"/>
         </w:tabs>
-        <w:spacing w:line="480" w:lineRule="auto"/>
-        <w:rPr>
-          <w:rFonts w:ascii="Arial" w:hAnsi="Arial" w:cs="Arial"/>
+        <w:spacing w:line="360" w:lineRule="auto"/>
+        <w:rPr>
+          <w:rFonts w:eastAsiaTheme="minorEastAsia"/>
           <w:noProof/>
-        </w:rPr>
-      </w:pPr>
-      <w:hyperlink w:anchor="_Toc227449334" w:history="1">
+          <w:lang w:eastAsia="es-CL"/>
+        </w:rPr>
+      </w:pPr>
+      <w:hyperlink w:anchor="_Toc227603170" w:history="1">
         <w:r>
           <w:rPr>
             <w:rStyle w:val="Hipervnculo"/>
             <w:rFonts w:ascii="Arial" w:hAnsi="Arial" w:cs="Arial"/>
-            <w:noProof/>
-          </w:rPr>
-          <w:t>Ilustración 13. Detalles del certificado.</w:t>
-        </w:r>
-        <w:r>
-          <w:rPr>
-            <w:rFonts w:ascii="Arial" w:hAnsi="Arial" w:cs="Arial"/>
+            <w:b/>
+            <w:noProof/>
+          </w:rPr>
+          <w:t>Imagen 13. Detalles del certificado.</w:t>
+        </w:r>
+        <w:r>
+          <w:rPr>
             <w:noProof/>
             <w:webHidden/>
           </w:rPr>
@@ -2268,7 +2224,6 @@
         </w:r>
         <w:r>
           <w:rPr>
-            <w:rFonts w:ascii="Arial" w:hAnsi="Arial" w:cs="Arial"/>
             <w:noProof/>
             <w:webHidden/>
           </w:rPr>
@@ -2276,22 +2231,19 @@
         </w:r>
         <w:r>
           <w:rPr>
-            <w:rFonts w:ascii="Arial" w:hAnsi="Arial" w:cs="Arial"/>
             <w:noProof/>
             <w:webHidden/>
           </w:rPr>
-          <w:instrText xml:space="preserve"> PAGEREF _Toc227449334 \h </w:instrText>
-        </w:r>
-        <w:r>
-          <w:rPr>
-            <w:rFonts w:ascii="Arial" w:hAnsi="Arial" w:cs="Arial"/>
+          <w:instrText xml:space="preserve"> PAGEREF _Toc227603170 \h </w:instrText>
+        </w:r>
+        <w:r>
+          <w:rPr>
             <w:noProof/>
             <w:webHidden/>
           </w:rPr>
         </w:r>
         <w:r>
           <w:rPr>
-            <w:rFonts w:ascii="Arial" w:hAnsi="Arial" w:cs="Arial"/>
             <w:noProof/>
             <w:webHidden/>
           </w:rPr>
@@ -2299,15 +2251,13 @@
         </w:r>
         <w:r>
           <w:rPr>
-            <w:rFonts w:ascii="Arial" w:hAnsi="Arial" w:cs="Arial"/>
             <w:noProof/>
             <w:webHidden/>
           </w:rPr>
-          <w:t>16</w:t>
-        </w:r>
-        <w:r>
-          <w:rPr>
-            <w:rFonts w:ascii="Arial" w:hAnsi="Arial" w:cs="Arial"/>
+          <w:t>18</w:t>
+        </w:r>
+        <w:r>
+          <w:rPr>
             <w:noProof/>
             <w:webHidden/>
           </w:rPr>
@@ -2321,24 +2271,25 @@
         <w:tabs>
           <w:tab w:val="right" w:leader="dot" w:pos="8828"/>
         </w:tabs>
-        <w:spacing w:line="480" w:lineRule="auto"/>
-        <w:rPr>
-          <w:rFonts w:ascii="Arial" w:hAnsi="Arial" w:cs="Arial"/>
+        <w:spacing w:line="360" w:lineRule="auto"/>
+        <w:rPr>
+          <w:rFonts w:eastAsiaTheme="minorEastAsia"/>
           <w:noProof/>
-        </w:rPr>
-      </w:pPr>
-      <w:hyperlink w:anchor="_Toc227449335" w:history="1">
+          <w:lang w:eastAsia="es-CL"/>
+        </w:rPr>
+      </w:pPr>
+      <w:hyperlink w:anchor="_Toc227603171" w:history="1">
         <w:r>
           <w:rPr>
             <w:rStyle w:val="Hipervnculo"/>
             <w:rFonts w:ascii="Arial" w:hAnsi="Arial" w:cs="Arial"/>
-            <w:noProof/>
-          </w:rPr>
-          <w:t>Ilustración 14. Soporte técnico de Microsot, sitios seguros.</w:t>
-        </w:r>
-        <w:r>
-          <w:rPr>
-            <w:rFonts w:ascii="Arial" w:hAnsi="Arial" w:cs="Arial"/>
+            <w:b/>
+            <w:noProof/>
+          </w:rPr>
+          <w:t>Imagen 14. Soporte técnico de Microsoft, sitios seguros.</w:t>
+        </w:r>
+        <w:r>
+          <w:rPr>
             <w:noProof/>
             <w:webHidden/>
           </w:rPr>
@@ -2346,7 +2297,6 @@
         </w:r>
         <w:r>
           <w:rPr>
-            <w:rFonts w:ascii="Arial" w:hAnsi="Arial" w:cs="Arial"/>
             <w:noProof/>
             <w:webHidden/>
           </w:rPr>
@@ -2354,22 +2304,19 @@
         </w:r>
         <w:r>
           <w:rPr>
-            <w:rFonts w:ascii="Arial" w:hAnsi="Arial" w:cs="Arial"/>
             <w:noProof/>
             <w:webHidden/>
           </w:rPr>
-          <w:instrText xml:space="preserve"> PAGEREF _Toc227449335 \h </w:instrText>
-        </w:r>
-        <w:r>
-          <w:rPr>
-            <w:rFonts w:ascii="Arial" w:hAnsi="Arial" w:cs="Arial"/>
+          <w:instrText xml:space="preserve"> PAGEREF _Toc227603171 \h </w:instrText>
+        </w:r>
+        <w:r>
+          <w:rPr>
             <w:noProof/>
             <w:webHidden/>
           </w:rPr>
         </w:r>
         <w:r>
           <w:rPr>
-            <w:rFonts w:ascii="Arial" w:hAnsi="Arial" w:cs="Arial"/>
             <w:noProof/>
             <w:webHidden/>
           </w:rPr>
@@ -2377,15 +2324,13 @@
         </w:r>
         <w:r>
           <w:rPr>
-            <w:rFonts w:ascii="Arial" w:hAnsi="Arial" w:cs="Arial"/>
             <w:noProof/>
             <w:webHidden/>
           </w:rPr>
-          <w:t>17</w:t>
-        </w:r>
-        <w:r>
-          <w:rPr>
-            <w:rFonts w:ascii="Arial" w:hAnsi="Arial" w:cs="Arial"/>
+          <w:t>19</w:t>
+        </w:r>
+        <w:r>
+          <w:rPr>
             <w:noProof/>
             <w:webHidden/>
           </w:rPr>
@@ -2399,24 +2344,98 @@
         <w:tabs>
           <w:tab w:val="right" w:leader="dot" w:pos="8828"/>
         </w:tabs>
-        <w:spacing w:line="480" w:lineRule="auto"/>
-        <w:rPr>
-          <w:rFonts w:ascii="Arial" w:hAnsi="Arial" w:cs="Arial"/>
+        <w:spacing w:line="360" w:lineRule="auto"/>
+        <w:rPr>
+          <w:rFonts w:eastAsiaTheme="minorEastAsia"/>
           <w:noProof/>
-        </w:rPr>
-      </w:pPr>
-      <w:hyperlink w:anchor="_Toc227449336" w:history="1">
+          <w:lang w:eastAsia="es-CL"/>
+        </w:rPr>
+      </w:pPr>
+      <w:hyperlink w:anchor="_Toc227603172" w:history="1">
         <w:r>
           <w:rPr>
             <w:rStyle w:val="Hipervnculo"/>
             <w:rFonts w:ascii="Arial" w:hAnsi="Arial" w:cs="Arial"/>
-            <w:noProof/>
-          </w:rPr>
-          <w:t>Ilustración 15. Certificado valido de la página de AIEP.</w:t>
-        </w:r>
-        <w:r>
-          <w:rPr>
+            <w:b/>
+            <w:noProof/>
+          </w:rPr>
+          <w:t>Ilustración 15. Captura de Wireshark del protocolo HTTP.</w:t>
+        </w:r>
+        <w:r>
+          <w:rPr>
+            <w:noProof/>
+            <w:webHidden/>
+          </w:rPr>
+          <w:tab/>
+        </w:r>
+        <w:r>
+          <w:rPr>
+            <w:noProof/>
+            <w:webHidden/>
+          </w:rPr>
+          <w:fldChar w:fldCharType="begin"/>
+        </w:r>
+        <w:r>
+          <w:rPr>
+            <w:noProof/>
+            <w:webHidden/>
+          </w:rPr>
+          <w:instrText xml:space="preserve"> PAGEREF _Toc227603172 \h </w:instrText>
+        </w:r>
+        <w:r>
+          <w:rPr>
+            <w:noProof/>
+            <w:webHidden/>
+          </w:rPr>
+        </w:r>
+        <w:r>
+          <w:rPr>
+            <w:noProof/>
+            <w:webHidden/>
+          </w:rPr>
+          <w:fldChar w:fldCharType="separate"/>
+        </w:r>
+        <w:r>
+          <w:rPr>
+            <w:noProof/>
+            <w:webHidden/>
+          </w:rPr>
+          <w:t>21</w:t>
+        </w:r>
+        <w:r>
+          <w:rPr>
+            <w:noProof/>
+            <w:webHidden/>
+          </w:rPr>
+          <w:fldChar w:fldCharType="end"/>
+        </w:r>
+      </w:hyperlink>
+    </w:p>
+    <w:p>
+      <w:pPr>
+        <w:pStyle w:val="Tabladeilustraciones"/>
+        <w:tabs>
+          <w:tab w:val="right" w:leader="dot" w:pos="8828"/>
+        </w:tabs>
+        <w:spacing w:line="360" w:lineRule="auto"/>
+        <w:rPr>
+          <w:rFonts w:eastAsiaTheme="minorEastAsia"/>
+          <w:noProof/>
+          <w:lang w:eastAsia="es-CL"/>
+        </w:rPr>
+      </w:pPr>
+      <w:hyperlink w:anchor="_Toc227603173" w:history="1">
+        <w:r>
+          <w:rPr>
+            <w:rStyle w:val="Hipervnculo"/>
             <w:rFonts w:ascii="Arial" w:hAnsi="Arial" w:cs="Arial"/>
+            <w:b/>
+            <w:noProof/>
+          </w:rPr>
+          <w:t>Ilustración 16. Captura de Wireshark del protocolo HTTPS seguro.</w:t>
+        </w:r>
+        <w:r>
+          <w:rPr>
             <w:noProof/>
             <w:webHidden/>
           </w:rPr>
@@ -2424,46 +2443,186 @@
         </w:r>
         <w:r>
           <w:rPr>
+            <w:noProof/>
+            <w:webHidden/>
+          </w:rPr>
+          <w:fldChar w:fldCharType="begin"/>
+        </w:r>
+        <w:r>
+          <w:rPr>
+            <w:noProof/>
+            <w:webHidden/>
+          </w:rPr>
+          <w:instrText xml:space="preserve"> PAGEREF _Toc227603173 \h </w:instrText>
+        </w:r>
+        <w:r>
+          <w:rPr>
+            <w:noProof/>
+            <w:webHidden/>
+          </w:rPr>
+        </w:r>
+        <w:r>
+          <w:rPr>
+            <w:noProof/>
+            <w:webHidden/>
+          </w:rPr>
+          <w:fldChar w:fldCharType="separate"/>
+        </w:r>
+        <w:r>
+          <w:rPr>
+            <w:noProof/>
+            <w:webHidden/>
+          </w:rPr>
+          <w:t>22</w:t>
+        </w:r>
+        <w:r>
+          <w:rPr>
+            <w:noProof/>
+            <w:webHidden/>
+          </w:rPr>
+          <w:fldChar w:fldCharType="end"/>
+        </w:r>
+      </w:hyperlink>
+    </w:p>
+    <w:p>
+      <w:pPr>
+        <w:pStyle w:val="Tabladeilustraciones"/>
+        <w:tabs>
+          <w:tab w:val="right" w:leader="dot" w:pos="8828"/>
+        </w:tabs>
+        <w:spacing w:line="360" w:lineRule="auto"/>
+        <w:rPr>
+          <w:rFonts w:eastAsiaTheme="minorEastAsia"/>
+          <w:noProof/>
+          <w:lang w:eastAsia="es-CL"/>
+        </w:rPr>
+      </w:pPr>
+      <w:hyperlink w:anchor="_Toc227603174" w:history="1">
+        <w:r>
+          <w:rPr>
+            <w:rStyle w:val="Hipervnculo"/>
             <w:rFonts w:ascii="Arial" w:hAnsi="Arial" w:cs="Arial"/>
+            <w:b/>
+            <w:noProof/>
+          </w:rPr>
+          <w:t>Ilustración 17. Certificado valido de la página de AIEP</w:t>
+        </w:r>
+        <w:r>
+          <w:rPr>
             <w:noProof/>
             <w:webHidden/>
           </w:rPr>
+          <w:tab/>
+        </w:r>
+        <w:r>
+          <w:rPr>
+            <w:noProof/>
+            <w:webHidden/>
+          </w:rPr>
           <w:fldChar w:fldCharType="begin"/>
         </w:r>
         <w:r>
           <w:rPr>
+            <w:noProof/>
+            <w:webHidden/>
+          </w:rPr>
+          <w:instrText xml:space="preserve"> PAGEREF _Toc227603174 \h </w:instrText>
+        </w:r>
+        <w:r>
+          <w:rPr>
+            <w:noProof/>
+            <w:webHidden/>
+          </w:rPr>
+        </w:r>
+        <w:r>
+          <w:rPr>
+            <w:noProof/>
+            <w:webHidden/>
+          </w:rPr>
+          <w:fldChar w:fldCharType="separate"/>
+        </w:r>
+        <w:r>
+          <w:rPr>
+            <w:noProof/>
+            <w:webHidden/>
+          </w:rPr>
+          <w:t>25</w:t>
+        </w:r>
+        <w:r>
+          <w:rPr>
+            <w:noProof/>
+            <w:webHidden/>
+          </w:rPr>
+          <w:fldChar w:fldCharType="end"/>
+        </w:r>
+      </w:hyperlink>
+    </w:p>
+    <w:p>
+      <w:pPr>
+        <w:pStyle w:val="Tabladeilustraciones"/>
+        <w:tabs>
+          <w:tab w:val="right" w:leader="dot" w:pos="8828"/>
+        </w:tabs>
+        <w:spacing w:line="360" w:lineRule="auto"/>
+        <w:rPr>
+          <w:rFonts w:eastAsiaTheme="minorEastAsia"/>
+          <w:noProof/>
+          <w:lang w:eastAsia="es-CL"/>
+        </w:rPr>
+      </w:pPr>
+      <w:hyperlink w:anchor="_Toc227603175" w:history="1">
+        <w:r>
+          <w:rPr>
+            <w:rStyle w:val="Hipervnculo"/>
             <w:rFonts w:ascii="Arial" w:hAnsi="Arial" w:cs="Arial"/>
+            <w:b/>
+            <w:noProof/>
+          </w:rPr>
+          <w:t>Ilustración 18. Repositorio y commits del proyecto de la semana 5 en Github.</w:t>
+        </w:r>
+        <w:r>
+          <w:rPr>
             <w:noProof/>
             <w:webHidden/>
           </w:rPr>
-          <w:instrText xml:space="preserve"> PAGEREF _Toc227449336 \h </w:instrText>
-        </w:r>
-        <w:r>
-          <w:rPr>
-            <w:rFonts w:ascii="Arial" w:hAnsi="Arial" w:cs="Arial"/>
+          <w:tab/>
+        </w:r>
+        <w:r>
+          <w:rPr>
             <w:noProof/>
             <w:webHidden/>
           </w:rPr>
-        </w:r>
-        <w:r>
-          <w:rPr>
-            <w:rFonts w:ascii="Arial" w:hAnsi="Arial" w:cs="Arial"/>
+          <w:fldChar w:fldCharType="begin"/>
+        </w:r>
+        <w:r>
+          <w:rPr>
             <w:noProof/>
             <w:webHidden/>
           </w:rPr>
+          <w:instrText xml:space="preserve"> PAGEREF _Toc227603175 \h </w:instrText>
+        </w:r>
+        <w:r>
+          <w:rPr>
+            <w:noProof/>
+            <w:webHidden/>
+          </w:rPr>
+        </w:r>
+        <w:r>
+          <w:rPr>
+            <w:noProof/>
+            <w:webHidden/>
+          </w:rPr>
           <w:fldChar w:fldCharType="separate"/>
         </w:r>
         <w:r>
           <w:rPr>
-            <w:rFonts w:ascii="Arial" w:hAnsi="Arial" w:cs="Arial"/>
             <w:noProof/>
             <w:webHidden/>
           </w:rPr>
-          <w:t>19</w:t>
-        </w:r>
-        <w:r>
-          <w:rPr>
-            <w:rFonts w:ascii="Arial" w:hAnsi="Arial" w:cs="Arial"/>
+          <w:t>27</w:t>
+        </w:r>
+        <w:r>
+          <w:rPr>
             <w:noProof/>
             <w:webHidden/>
           </w:rPr>
@@ -3259,7 +3418,7 @@
               </wp:anchor>
             </w:drawing>
           </mc:Choice>
-          <mc:Fallback xmlns:w16sdtfl="http://schemas.microsoft.com/office/word/2024/wordml/sdtformatlock" xmlns:w16sdtdh="http://schemas.microsoft.com/office/word/2020/wordml/sdtdatahash" xmlns:w16du="http://schemas.microsoft.com/office/word/2023/wordml/word16du" xmlns:w16="http://schemas.microsoft.com/office/word/2018/wordml" xmlns:w16cid="http://schemas.microsoft.com/office/word/2016/wordml/cid" xmlns:w16cex="http://schemas.microsoft.com/office/word/2018/wordml/cex" xmlns:oel="http://schemas.microsoft.com/office/2019/extlst" xmlns:am3d="http://schemas.microsoft.com/office/drawing/2017/model3d" xmlns:aink="http://schemas.microsoft.com/office/drawing/2016/ink" xmlns:cx8="http://schemas.microsoft.com/office/drawing/2016/5/14/chartex" xmlns:cx7="http://schemas.microsoft.com/office/drawing/2016/5/13/chartex" xmlns:cx6="http://schemas.microsoft.com/office/drawing/2016/5/12/chartex" xmlns:cx5="http://schemas.microsoft.com/office/drawing/2016/5/11/chartex" xmlns:cx4="http://schemas.microsoft.com/office/drawing/2016/5/10/chartex" xmlns:cx3="http://schemas.microsoft.com/office/drawing/2016/5/9/chartex" xmlns:cx2="http://schemas.microsoft.com/office/drawing/2015/10/21/chartex" xmlns:cx1="http://schemas.microsoft.com/office/drawing/2015/9/8/chartex">
+          <mc:Fallback>
             <w:pict>
               <v:rect w14:anchorId="77D4EB65" id="Rectángulo 1" o:spid="_x0000_s1026" style="position:absolute;margin-left:.05pt;margin-top:.05pt;width:204.7pt;height:18.7pt;z-index:251663360;visibility:visible;mso-wrap-style:square;mso-width-percent:0;mso-height-percent:0;mso-wrap-distance-left:9pt;mso-wrap-distance-top:0;mso-wrap-distance-right:9pt;mso-wrap-distance-bottom:0;mso-position-horizontal:absolute;mso-position-horizontal-relative:text;mso-position-vertical:absolute;mso-position-vertical-relative:text;mso-width-percent:0;mso-height-percent:0;mso-width-relative:margin;mso-height-relative:margin;v-text-anchor:middle" o:gfxdata="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" fillcolor="yellow" strokecolor="#e00" strokeweight="3pt">
                 <v:fill opacity="20303f"/>
@@ -3290,7 +3449,7 @@
                     <pic:cNvPicPr/>
                   </pic:nvPicPr>
                   <pic:blipFill>
-                    <a:blip r:embed="rId9"/>
+                    <a:blip r:embed="rId11"/>
                     <a:stretch>
                       <a:fillRect/>
                     </a:stretch>
@@ -3325,7 +3484,7 @@
           <w:szCs w:val="24"/>
         </w:rPr>
       </w:pPr>
-      <w:bookmarkStart w:id="0" w:name="_Toc227449322"/>
+      <w:bookmarkStart w:id="0" w:name="_Toc227603158"/>
       <w:r>
         <w:rPr>
           <w:rFonts w:ascii="Arial" w:hAnsi="Arial" w:cs="Arial"/>
@@ -3413,31 +3572,7 @@
           <w:sz w:val="24"/>
           <w:szCs w:val="24"/>
         </w:rPr>
-        <w:t xml:space="preserve">. Terminal de </w:t>
-      </w:r>
-      <w:proofErr w:type="spellStart"/>
-      <w:r>
-        <w:rPr>
-          <w:rFonts w:ascii="Arial" w:hAnsi="Arial" w:cs="Arial"/>
-          <w:b/>
-          <w:i w:val="0"/>
-          <w:color w:val="000000" w:themeColor="text1"/>
-          <w:sz w:val="24"/>
-          <w:szCs w:val="24"/>
-        </w:rPr>
-        <w:t>OpenSSL</w:t>
-      </w:r>
-      <w:proofErr w:type="spellEnd"/>
-      <w:r>
-        <w:rPr>
-          <w:rFonts w:ascii="Arial" w:hAnsi="Arial" w:cs="Arial"/>
-          <w:b/>
-          <w:i w:val="0"/>
-          <w:color w:val="000000" w:themeColor="text1"/>
-          <w:sz w:val="24"/>
-          <w:szCs w:val="24"/>
-        </w:rPr>
-        <w:t xml:space="preserve"> en Windows 11.</w:t>
+        <w:t>. Terminal de OpenSSL en Windows 11.</w:t>
       </w:r>
       <w:bookmarkEnd w:id="0"/>
     </w:p>
@@ -3633,7 +3768,7 @@
               </wp:anchor>
             </w:drawing>
           </mc:Choice>
-          <mc:Fallback xmlns:w16sdtfl="http://schemas.microsoft.com/office/word/2024/wordml/sdtformatlock" xmlns:w16sdtdh="http://schemas.microsoft.com/office/word/2020/wordml/sdtdatahash" xmlns:w16du="http://schemas.microsoft.com/office/word/2023/wordml/word16du" xmlns:w16="http://schemas.microsoft.com/office/word/2018/wordml" xmlns:w16cid="http://schemas.microsoft.com/office/word/2016/wordml/cid" xmlns:w16cex="http://schemas.microsoft.com/office/word/2018/wordml/cex" xmlns:oel="http://schemas.microsoft.com/office/2019/extlst" xmlns:am3d="http://schemas.microsoft.com/office/drawing/2017/model3d" xmlns:aink="http://schemas.microsoft.com/office/drawing/2016/ink" xmlns:cx8="http://schemas.microsoft.com/office/drawing/2016/5/14/chartex" xmlns:cx7="http://schemas.microsoft.com/office/drawing/2016/5/13/chartex" xmlns:cx6="http://schemas.microsoft.com/office/drawing/2016/5/12/chartex" xmlns:cx5="http://schemas.microsoft.com/office/drawing/2016/5/11/chartex" xmlns:cx4="http://schemas.microsoft.com/office/drawing/2016/5/10/chartex" xmlns:cx3="http://schemas.microsoft.com/office/drawing/2016/5/9/chartex" xmlns:cx2="http://schemas.microsoft.com/office/drawing/2015/10/21/chartex" xmlns:cx1="http://schemas.microsoft.com/office/drawing/2015/9/8/chartex">
+          <mc:Fallback>
             <w:pict>
               <v:rect w14:anchorId="358959B3" id="Rectángulo 1" o:spid="_x0000_s1026" style="position:absolute;margin-left:0;margin-top:23.4pt;width:428.3pt;height:27.4pt;z-index:251661312;visibility:visible;mso-wrap-style:square;mso-width-percent:0;mso-height-percent:0;mso-wrap-distance-left:9pt;mso-wrap-distance-top:0;mso-wrap-distance-right:9pt;mso-wrap-distance-bottom:0;mso-position-horizontal:left;mso-position-horizontal-relative:margin;mso-position-vertical:absolute;mso-position-vertical-relative:text;mso-width-percent:0;mso-height-percent:0;mso-width-relative:margin;mso-height-relative:margin;v-text-anchor:middle" o:gfxdata="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" fillcolor="yellow" strokecolor="#e00" strokeweight="3pt">
                 <v:fill opacity="20303f"/>
@@ -3722,7 +3857,7 @@
               </wp:anchor>
             </w:drawing>
           </mc:Choice>
-          <mc:Fallback xmlns:w16sdtfl="http://schemas.microsoft.com/office/word/2024/wordml/sdtformatlock" xmlns:w16sdtdh="http://schemas.microsoft.com/office/word/2020/wordml/sdtdatahash" xmlns:w16du="http://schemas.microsoft.com/office/word/2023/wordml/word16du" xmlns:w16="http://schemas.microsoft.com/office/word/2018/wordml" xmlns:w16cid="http://schemas.microsoft.com/office/word/2016/wordml/cid" xmlns:w16cex="http://schemas.microsoft.com/office/word/2018/wordml/cex" xmlns:oel="http://schemas.microsoft.com/office/2019/extlst" xmlns:am3d="http://schemas.microsoft.com/office/drawing/2017/model3d" xmlns:aink="http://schemas.microsoft.com/office/drawing/2016/ink" xmlns:cx8="http://schemas.microsoft.com/office/drawing/2016/5/14/chartex" xmlns:cx7="http://schemas.microsoft.com/office/drawing/2016/5/13/chartex" xmlns:cx6="http://schemas.microsoft.com/office/drawing/2016/5/12/chartex" xmlns:cx5="http://schemas.microsoft.com/office/drawing/2016/5/11/chartex" xmlns:cx4="http://schemas.microsoft.com/office/drawing/2016/5/10/chartex" xmlns:cx3="http://schemas.microsoft.com/office/drawing/2016/5/9/chartex" xmlns:cx2="http://schemas.microsoft.com/office/drawing/2015/10/21/chartex" xmlns:cx1="http://schemas.microsoft.com/office/drawing/2015/9/8/chartex">
+          <mc:Fallback>
             <w:pict>
               <v:rect w14:anchorId="0FCD63E6" id="Rectángulo 1" o:spid="_x0000_s1026" style="position:absolute;margin-left:74.1pt;margin-top:2.1pt;width:204.7pt;height:18.7pt;z-index:251659264;visibility:visible;mso-wrap-style:square;mso-width-percent:0;mso-height-percent:0;mso-wrap-distance-left:9pt;mso-wrap-distance-top:0;mso-wrap-distance-right:9pt;mso-wrap-distance-bottom:0;mso-position-horizontal:absolute;mso-position-horizontal-relative:text;mso-position-vertical:absolute;mso-position-vertical-relative:text;mso-width-percent:0;mso-height-percent:0;mso-width-relative:margin;mso-height-relative:margin;v-text-anchor:middle" o:gfxdata="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" fillcolor="yellow" strokecolor="#e00" strokeweight="3pt">
                 <v:fill opacity="20303f"/>
@@ -3753,7 +3888,7 @@
                     <pic:cNvPicPr/>
                   </pic:nvPicPr>
                   <pic:blipFill>
-                    <a:blip r:embed="rId10"/>
+                    <a:blip r:embed="rId12"/>
                     <a:stretch>
                       <a:fillRect/>
                     </a:stretch>
@@ -3788,7 +3923,7 @@
           <w:szCs w:val="24"/>
         </w:rPr>
       </w:pPr>
-      <w:bookmarkStart w:id="1" w:name="_Toc227449323"/>
+      <w:bookmarkStart w:id="1" w:name="_Toc227603159"/>
       <w:r>
         <w:rPr>
           <w:rFonts w:ascii="Arial" w:hAnsi="Arial" w:cs="Arial"/>
@@ -4252,23 +4387,7 @@
           <w:rFonts w:ascii="Arial" w:hAnsi="Arial" w:cs="Arial"/>
           <w:highlight w:val="yellow"/>
         </w:rPr>
-        <w:t xml:space="preserve"> “/CN=</w:t>
-      </w:r>
-      <w:proofErr w:type="spellStart"/>
-      <w:r>
-        <w:rPr>
-          <w:rFonts w:ascii="Arial" w:hAnsi="Arial" w:cs="Arial"/>
-          <w:highlight w:val="yellow"/>
-        </w:rPr>
-        <w:t>localhost</w:t>
-      </w:r>
-      <w:proofErr w:type="spellEnd"/>
-      <w:r>
-        <w:rPr>
-          <w:rFonts w:ascii="Arial" w:hAnsi="Arial" w:cs="Arial"/>
-          <w:highlight w:val="yellow"/>
-        </w:rPr>
-        <w:t>””</w:t>
+        <w:t xml:space="preserve"> “/CN=localhost””</w:t>
       </w:r>
       <w:r>
         <w:rPr>
@@ -4392,7 +4511,7 @@
                     <pic:cNvPicPr/>
                   </pic:nvPicPr>
                   <pic:blipFill>
-                    <a:blip r:embed="rId11"/>
+                    <a:blip r:embed="rId13"/>
                     <a:stretch>
                       <a:fillRect/>
                     </a:stretch>
@@ -4431,7 +4550,7 @@
           <w:szCs w:val="24"/>
         </w:rPr>
       </w:pPr>
-      <w:bookmarkStart w:id="2" w:name="_Toc227449324"/>
+      <w:bookmarkStart w:id="2" w:name="_Toc227603160"/>
       <w:r>
         <w:rPr>
           <w:rFonts w:ascii="Arial" w:hAnsi="Arial" w:cs="Arial"/>
@@ -4791,7 +4910,7 @@
               </wp:anchor>
             </w:drawing>
           </mc:Choice>
-          <mc:Fallback xmlns:w16sdtfl="http://schemas.microsoft.com/office/word/2024/wordml/sdtformatlock" xmlns:w16sdtdh="http://schemas.microsoft.com/office/word/2020/wordml/sdtdatahash" xmlns:w16du="http://schemas.microsoft.com/office/word/2023/wordml/word16du" xmlns:w16="http://schemas.microsoft.com/office/word/2018/wordml" xmlns:w16cid="http://schemas.microsoft.com/office/word/2016/wordml/cid" xmlns:w16cex="http://schemas.microsoft.com/office/word/2018/wordml/cex" xmlns:oel="http://schemas.microsoft.com/office/2019/extlst" xmlns:am3d="http://schemas.microsoft.com/office/drawing/2017/model3d" xmlns:aink="http://schemas.microsoft.com/office/drawing/2016/ink" xmlns:cx8="http://schemas.microsoft.com/office/drawing/2016/5/14/chartex" xmlns:cx7="http://schemas.microsoft.com/office/drawing/2016/5/13/chartex" xmlns:cx6="http://schemas.microsoft.com/office/drawing/2016/5/12/chartex" xmlns:cx5="http://schemas.microsoft.com/office/drawing/2016/5/11/chartex" xmlns:cx4="http://schemas.microsoft.com/office/drawing/2016/5/10/chartex" xmlns:cx3="http://schemas.microsoft.com/office/drawing/2016/5/9/chartex" xmlns:cx2="http://schemas.microsoft.com/office/drawing/2015/10/21/chartex" xmlns:cx1="http://schemas.microsoft.com/office/drawing/2015/9/8/chartex">
+          <mc:Fallback>
             <w:pict>
               <v:rect w14:anchorId="27EB04A0" id="Rectángulo 1" o:spid="_x0000_s1026" style="position:absolute;margin-left:3.7pt;margin-top:17.1pt;width:428.3pt;height:34.95pt;z-index:251665408;visibility:visible;mso-wrap-style:square;mso-width-percent:0;mso-height-percent:0;mso-wrap-distance-left:9pt;mso-wrap-distance-top:0;mso-wrap-distance-right:9pt;mso-wrap-distance-bottom:0;mso-position-horizontal:absolute;mso-position-horizontal-relative:margin;mso-position-vertical:absolute;mso-position-vertical-relative:text;mso-width-percent:0;mso-height-percent:0;mso-width-relative:margin;mso-height-relative:margin;v-text-anchor:middle" o:gfxdata="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" fillcolor="yellow" strokecolor="#e00" strokeweight="3pt">
                 <v:fill opacity="20303f"/>
@@ -4823,7 +4942,7 @@
                     <pic:cNvPicPr/>
                   </pic:nvPicPr>
                   <pic:blipFill>
-                    <a:blip r:embed="rId12"/>
+                    <a:blip r:embed="rId14"/>
                     <a:stretch>
                       <a:fillRect/>
                     </a:stretch>
@@ -4863,7 +4982,7 @@
           <w:szCs w:val="24"/>
         </w:rPr>
       </w:pPr>
-      <w:bookmarkStart w:id="3" w:name="_Toc227449325"/>
+      <w:bookmarkStart w:id="3" w:name="_Toc227603161"/>
       <w:r>
         <w:rPr>
           <w:rFonts w:ascii="Arial" w:hAnsi="Arial" w:cs="Arial"/>
@@ -5135,7 +5254,7 @@
               </wp:anchor>
             </w:drawing>
           </mc:Choice>
-          <mc:Fallback xmlns:w16sdtfl="http://schemas.microsoft.com/office/word/2024/wordml/sdtformatlock" xmlns:w16sdtdh="http://schemas.microsoft.com/office/word/2020/wordml/sdtdatahash" xmlns:w16du="http://schemas.microsoft.com/office/word/2023/wordml/word16du" xmlns:w16="http://schemas.microsoft.com/office/word/2018/wordml" xmlns:w16cid="http://schemas.microsoft.com/office/word/2016/wordml/cid" xmlns:w16cex="http://schemas.microsoft.com/office/word/2018/wordml/cex" xmlns:oel="http://schemas.microsoft.com/office/2019/extlst" xmlns:am3d="http://schemas.microsoft.com/office/drawing/2017/model3d" xmlns:aink="http://schemas.microsoft.com/office/drawing/2016/ink" xmlns:cx8="http://schemas.microsoft.com/office/drawing/2016/5/14/chartex" xmlns:cx7="http://schemas.microsoft.com/office/drawing/2016/5/13/chartex" xmlns:cx6="http://schemas.microsoft.com/office/drawing/2016/5/12/chartex" xmlns:cx5="http://schemas.microsoft.com/office/drawing/2016/5/11/chartex" xmlns:cx4="http://schemas.microsoft.com/office/drawing/2016/5/10/chartex" xmlns:cx3="http://schemas.microsoft.com/office/drawing/2016/5/9/chartex" xmlns:cx2="http://schemas.microsoft.com/office/drawing/2015/10/21/chartex" xmlns:cx1="http://schemas.microsoft.com/office/drawing/2015/9/8/chartex">
+          <mc:Fallback>
             <w:pict>
               <v:rect w14:anchorId="42F4EAC2" id="Rectángulo 1" o:spid="_x0000_s1026" style="position:absolute;margin-left:366.15pt;margin-top:24.25pt;width:80.9pt;height:18.9pt;z-index:251667456;visibility:visible;mso-wrap-style:square;mso-width-percent:0;mso-height-percent:0;mso-wrap-distance-left:9pt;mso-wrap-distance-top:0;mso-wrap-distance-right:9pt;mso-wrap-distance-bottom:0;mso-position-horizontal:absolute;mso-position-horizontal-relative:margin;mso-position-vertical:absolute;mso-position-vertical-relative:text;mso-width-percent:0;mso-height-percent:0;mso-width-relative:margin;mso-height-relative:margin;v-text-anchor:middle" o:gfxdata="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" fillcolor="yellow" strokecolor="#e00" strokeweight="3pt">
                 <v:fill opacity="20303f"/>
@@ -5167,7 +5286,7 @@
                     <pic:cNvPicPr/>
                   </pic:nvPicPr>
                   <pic:blipFill>
-                    <a:blip r:embed="rId13"/>
+                    <a:blip r:embed="rId15"/>
                     <a:stretch>
                       <a:fillRect/>
                     </a:stretch>
@@ -5207,7 +5326,7 @@
           <w:szCs w:val="24"/>
         </w:rPr>
       </w:pPr>
-      <w:bookmarkStart w:id="4" w:name="_Toc227449326"/>
+      <w:bookmarkStart w:id="4" w:name="_Toc227603162"/>
       <w:r>
         <w:rPr>
           <w:rFonts w:ascii="Arial" w:hAnsi="Arial" w:cs="Arial"/>
@@ -5424,7 +5543,7 @@
               </wp:anchor>
             </w:drawing>
           </mc:Choice>
-          <mc:Fallback xmlns:w16sdtfl="http://schemas.microsoft.com/office/word/2024/wordml/sdtformatlock" xmlns:w16sdtdh="http://schemas.microsoft.com/office/word/2020/wordml/sdtdatahash" xmlns:w16du="http://schemas.microsoft.com/office/word/2023/wordml/word16du" xmlns:w16="http://schemas.microsoft.com/office/word/2018/wordml" xmlns:w16cid="http://schemas.microsoft.com/office/word/2016/wordml/cid" xmlns:w16cex="http://schemas.microsoft.com/office/word/2018/wordml/cex" xmlns:oel="http://schemas.microsoft.com/office/2019/extlst" xmlns:am3d="http://schemas.microsoft.com/office/drawing/2017/model3d" xmlns:aink="http://schemas.microsoft.com/office/drawing/2016/ink" xmlns:cx8="http://schemas.microsoft.com/office/drawing/2016/5/14/chartex" xmlns:cx7="http://schemas.microsoft.com/office/drawing/2016/5/13/chartex" xmlns:cx6="http://schemas.microsoft.com/office/drawing/2016/5/12/chartex" xmlns:cx5="http://schemas.microsoft.com/office/drawing/2016/5/11/chartex" xmlns:cx4="http://schemas.microsoft.com/office/drawing/2016/5/10/chartex" xmlns:cx3="http://schemas.microsoft.com/office/drawing/2016/5/9/chartex" xmlns:cx2="http://schemas.microsoft.com/office/drawing/2015/10/21/chartex" xmlns:cx1="http://schemas.microsoft.com/office/drawing/2015/9/8/chartex">
+          <mc:Fallback>
             <w:pict>
               <v:rect w14:anchorId="3F3499AF" id="Rectángulo 1" o:spid="_x0000_s1026" style="position:absolute;margin-left:14.25pt;margin-top:2.15pt;width:197.7pt;height:59.7pt;z-index:251669504;visibility:visible;mso-wrap-style:square;mso-width-percent:0;mso-height-percent:0;mso-wrap-distance-left:9pt;mso-wrap-distance-top:0;mso-wrap-distance-right:9pt;mso-wrap-distance-bottom:0;mso-position-horizontal:absolute;mso-position-horizontal-relative:margin;mso-position-vertical:absolute;mso-position-vertical-relative:text;mso-width-percent:0;mso-height-percent:0;mso-width-relative:margin;mso-height-relative:margin;v-text-anchor:middle" o:gfxdata="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" fillcolor="yellow" strokecolor="#e00" strokeweight="3pt">
                 <v:fill opacity="20303f"/>
@@ -5456,7 +5575,7 @@
                     <pic:cNvPicPr/>
                   </pic:nvPicPr>
                   <pic:blipFill>
-                    <a:blip r:embed="rId14"/>
+                    <a:blip r:embed="rId16"/>
                     <a:stretch>
                       <a:fillRect/>
                     </a:stretch>
@@ -5496,7 +5615,7 @@
           <w:szCs w:val="24"/>
         </w:rPr>
       </w:pPr>
-      <w:bookmarkStart w:id="5" w:name="_Toc227449327"/>
+      <w:bookmarkStart w:id="5" w:name="_Toc227603163"/>
       <w:r>
         <w:rPr>
           <w:rFonts w:ascii="Arial" w:hAnsi="Arial" w:cs="Arial"/>
@@ -5705,7 +5824,7 @@
               </wp:anchor>
             </w:drawing>
           </mc:Choice>
-          <mc:Fallback xmlns:w16sdtfl="http://schemas.microsoft.com/office/word/2024/wordml/sdtformatlock" xmlns:w16sdtdh="http://schemas.microsoft.com/office/word/2020/wordml/sdtdatahash" xmlns:w16du="http://schemas.microsoft.com/office/word/2023/wordml/word16du" xmlns:w16="http://schemas.microsoft.com/office/word/2018/wordml" xmlns:w16cid="http://schemas.microsoft.com/office/word/2016/wordml/cid" xmlns:w16cex="http://schemas.microsoft.com/office/word/2018/wordml/cex" xmlns:oel="http://schemas.microsoft.com/office/2019/extlst" xmlns:am3d="http://schemas.microsoft.com/office/drawing/2017/model3d" xmlns:aink="http://schemas.microsoft.com/office/drawing/2016/ink" xmlns:cx8="http://schemas.microsoft.com/office/drawing/2016/5/14/chartex" xmlns:cx7="http://schemas.microsoft.com/office/drawing/2016/5/13/chartex" xmlns:cx6="http://schemas.microsoft.com/office/drawing/2016/5/12/chartex" xmlns:cx5="http://schemas.microsoft.com/office/drawing/2016/5/11/chartex" xmlns:cx4="http://schemas.microsoft.com/office/drawing/2016/5/10/chartex" xmlns:cx3="http://schemas.microsoft.com/office/drawing/2016/5/9/chartex" xmlns:cx2="http://schemas.microsoft.com/office/drawing/2015/10/21/chartex" xmlns:cx1="http://schemas.microsoft.com/office/drawing/2015/9/8/chartex">
+          <mc:Fallback>
             <w:pict>
               <v:rect w14:anchorId="47138281" id="Rectángulo 1" o:spid="_x0000_s1026" style="position:absolute;margin-left:85.65pt;margin-top:2.1pt;width:241.5pt;height:59.7pt;z-index:251671552;visibility:visible;mso-wrap-style:square;mso-width-percent:0;mso-height-percent:0;mso-wrap-distance-left:9pt;mso-wrap-distance-top:0;mso-wrap-distance-right:9pt;mso-wrap-distance-bottom:0;mso-position-horizontal:absolute;mso-position-horizontal-relative:margin;mso-position-vertical:absolute;mso-position-vertical-relative:text;mso-width-percent:0;mso-height-percent:0;mso-width-relative:margin;mso-height-relative:margin;v-text-anchor:middle" o:gfxdata="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" fillcolor="yellow" strokecolor="#e00" strokeweight="3pt">
                 <v:fill opacity="20303f"/>
@@ -5737,7 +5856,7 @@
                     <pic:cNvPicPr/>
                   </pic:nvPicPr>
                   <pic:blipFill>
-                    <a:blip r:embed="rId15"/>
+                    <a:blip r:embed="rId17"/>
                     <a:stretch>
                       <a:fillRect/>
                     </a:stretch>
@@ -5777,7 +5896,7 @@
           <w:szCs w:val="24"/>
         </w:rPr>
       </w:pPr>
-      <w:bookmarkStart w:id="6" w:name="_Toc227449328"/>
+      <w:bookmarkStart w:id="6" w:name="_Toc227603164"/>
       <w:r>
         <w:rPr>
           <w:rFonts w:ascii="Arial" w:hAnsi="Arial" w:cs="Arial"/>
@@ -6040,7 +6159,7 @@
               </wp:anchor>
             </w:drawing>
           </mc:Choice>
-          <mc:Fallback xmlns:w16sdtfl="http://schemas.microsoft.com/office/word/2024/wordml/sdtformatlock" xmlns:w16sdtdh="http://schemas.microsoft.com/office/word/2020/wordml/sdtdatahash" xmlns:w16du="http://schemas.microsoft.com/office/word/2023/wordml/word16du" xmlns:w16="http://schemas.microsoft.com/office/word/2018/wordml" xmlns:w16cid="http://schemas.microsoft.com/office/word/2016/wordml/cid" xmlns:w16cex="http://schemas.microsoft.com/office/word/2018/wordml/cex" xmlns:oel="http://schemas.microsoft.com/office/2019/extlst" xmlns:am3d="http://schemas.microsoft.com/office/drawing/2017/model3d" xmlns:aink="http://schemas.microsoft.com/office/drawing/2016/ink" xmlns:cx8="http://schemas.microsoft.com/office/drawing/2016/5/14/chartex" xmlns:cx7="http://schemas.microsoft.com/office/drawing/2016/5/13/chartex" xmlns:cx6="http://schemas.microsoft.com/office/drawing/2016/5/12/chartex" xmlns:cx5="http://schemas.microsoft.com/office/drawing/2016/5/11/chartex" xmlns:cx4="http://schemas.microsoft.com/office/drawing/2016/5/10/chartex" xmlns:cx3="http://schemas.microsoft.com/office/drawing/2016/5/9/chartex" xmlns:cx2="http://schemas.microsoft.com/office/drawing/2015/10/21/chartex" xmlns:cx1="http://schemas.microsoft.com/office/drawing/2015/9/8/chartex">
+          <mc:Fallback>
             <w:pict>
               <v:rect w14:anchorId="6CA6319A" id="Rectángulo 1" o:spid="_x0000_s1026" style="position:absolute;margin-left:88.65pt;margin-top:42.3pt;width:340.5pt;height:32.7pt;z-index:251673600;visibility:visible;mso-wrap-style:square;mso-width-percent:0;mso-height-percent:0;mso-wrap-distance-left:9pt;mso-wrap-distance-top:0;mso-wrap-distance-right:9pt;mso-wrap-distance-bottom:0;mso-position-horizontal:absolute;mso-position-horizontal-relative:margin;mso-position-vertical:absolute;mso-position-vertical-relative:text;mso-width-percent:0;mso-height-percent:0;mso-width-relative:margin;mso-height-relative:margin;v-text-anchor:middle" o:gfxdata="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" fillcolor="yellow" strokecolor="#e00" strokeweight="3pt">
                 <v:fill opacity="20303f"/>
@@ -6072,7 +6191,7 @@
                     <pic:cNvPicPr/>
                   </pic:nvPicPr>
                   <pic:blipFill>
-                    <a:blip r:embed="rId16"/>
+                    <a:blip r:embed="rId18"/>
                     <a:stretch>
                       <a:fillRect/>
                     </a:stretch>
@@ -6112,7 +6231,7 @@
           <w:szCs w:val="24"/>
         </w:rPr>
       </w:pPr>
-      <w:bookmarkStart w:id="7" w:name="_Toc227449329"/>
+      <w:bookmarkStart w:id="7" w:name="_Toc227603165"/>
       <w:r>
         <w:rPr>
           <w:rFonts w:ascii="Arial" w:hAnsi="Arial" w:cs="Arial"/>
@@ -6419,7 +6538,7 @@
               </wp:anchor>
             </w:drawing>
           </mc:Choice>
-          <mc:Fallback xmlns:w16sdtfl="http://schemas.microsoft.com/office/word/2024/wordml/sdtformatlock" xmlns:w16sdtdh="http://schemas.microsoft.com/office/word/2020/wordml/sdtdatahash" xmlns:w16du="http://schemas.microsoft.com/office/word/2023/wordml/word16du" xmlns:w16="http://schemas.microsoft.com/office/word/2018/wordml" xmlns:w16cid="http://schemas.microsoft.com/office/word/2016/wordml/cid" xmlns:w16cex="http://schemas.microsoft.com/office/word/2018/wordml/cex" xmlns:oel="http://schemas.microsoft.com/office/2019/extlst" xmlns:am3d="http://schemas.microsoft.com/office/drawing/2017/model3d" xmlns:aink="http://schemas.microsoft.com/office/drawing/2016/ink" xmlns:cx8="http://schemas.microsoft.com/office/drawing/2016/5/14/chartex" xmlns:cx7="http://schemas.microsoft.com/office/drawing/2016/5/13/chartex" xmlns:cx6="http://schemas.microsoft.com/office/drawing/2016/5/12/chartex" xmlns:cx5="http://schemas.microsoft.com/office/drawing/2016/5/11/chartex" xmlns:cx4="http://schemas.microsoft.com/office/drawing/2016/5/10/chartex" xmlns:cx3="http://schemas.microsoft.com/office/drawing/2016/5/9/chartex" xmlns:cx2="http://schemas.microsoft.com/office/drawing/2015/10/21/chartex" xmlns:cx1="http://schemas.microsoft.com/office/drawing/2015/9/8/chartex">
+          <mc:Fallback>
             <w:pict>
               <v:rect w14:anchorId="09B47494" id="Rectángulo 1" o:spid="_x0000_s1026" style="position:absolute;margin-left:101.5pt;margin-top:16.35pt;width:204.8pt;height:18.5pt;z-index:251675648;visibility:visible;mso-wrap-style:square;mso-width-percent:0;mso-height-percent:0;mso-wrap-distance-left:9pt;mso-wrap-distance-top:0;mso-wrap-distance-right:9pt;mso-wrap-distance-bottom:0;mso-position-horizontal:absolute;mso-position-horizontal-relative:margin;mso-position-vertical:absolute;mso-position-vertical-relative:text;mso-width-percent:0;mso-height-percent:0;mso-width-relative:margin;mso-height-relative:margin;v-text-anchor:middle" o:gfxdata="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" fillcolor="yellow" strokecolor="#e00" strokeweight="3pt">
                 <v:fill opacity="20303f"/>
@@ -6451,7 +6570,7 @@
                     <pic:cNvPicPr/>
                   </pic:nvPicPr>
                   <pic:blipFill>
-                    <a:blip r:embed="rId17"/>
+                    <a:blip r:embed="rId19"/>
                     <a:stretch>
                       <a:fillRect/>
                     </a:stretch>
@@ -6491,7 +6610,7 @@
           <w:szCs w:val="24"/>
         </w:rPr>
       </w:pPr>
-      <w:bookmarkStart w:id="8" w:name="_Toc227449330"/>
+      <w:bookmarkStart w:id="8" w:name="_Toc227603166"/>
       <w:r>
         <w:rPr>
           <w:rFonts w:ascii="Arial" w:hAnsi="Arial" w:cs="Arial"/>
@@ -6648,6 +6767,7 @@
         <w:t>”, pasando como parámetros los certificados y la aplicación de Express, esto difiere de HTTP tradicional que usa “</w:t>
       </w:r>
       <w:proofErr w:type="spellStart"/>
+      <w:proofErr w:type="gramStart"/>
       <w:r>
         <w:rPr>
           <w:rFonts w:ascii="Arial" w:hAnsi="Arial" w:cs="Arial"/>
@@ -6661,6 +6781,7 @@
         <w:t>n</w:t>
       </w:r>
       <w:proofErr w:type="spellEnd"/>
+      <w:proofErr w:type="gramEnd"/>
       <w:r>
         <w:rPr>
           <w:rFonts w:ascii="Arial" w:hAnsi="Arial" w:cs="Arial"/>
@@ -6782,7 +6903,7 @@
                     <pic:cNvPicPr/>
                   </pic:nvPicPr>
                   <pic:blipFill>
-                    <a:blip r:embed="rId18"/>
+                    <a:blip r:embed="rId20"/>
                     <a:stretch>
                       <a:fillRect/>
                     </a:stretch>
@@ -6822,7 +6943,7 @@
           <w:szCs w:val="24"/>
         </w:rPr>
       </w:pPr>
-      <w:bookmarkStart w:id="9" w:name="_Toc227449331"/>
+      <w:bookmarkStart w:id="9" w:name="_Toc227603167"/>
       <w:r>
         <w:rPr>
           <w:rFonts w:ascii="Arial" w:hAnsi="Arial" w:cs="Arial"/>
@@ -7291,7 +7412,7 @@
               </wp:anchor>
             </w:drawing>
           </mc:Choice>
-          <mc:Fallback xmlns:w16sdtfl="http://schemas.microsoft.com/office/word/2024/wordml/sdtformatlock" xmlns:w16sdtdh="http://schemas.microsoft.com/office/word/2020/wordml/sdtdatahash" xmlns:w16du="http://schemas.microsoft.com/office/word/2023/wordml/word16du" xmlns:w16="http://schemas.microsoft.com/office/word/2018/wordml" xmlns:w16cid="http://schemas.microsoft.com/office/word/2016/wordml/cid" xmlns:w16cex="http://schemas.microsoft.com/office/word/2018/wordml/cex" xmlns:oel="http://schemas.microsoft.com/office/2019/extlst" xmlns:am3d="http://schemas.microsoft.com/office/drawing/2017/model3d" xmlns:aink="http://schemas.microsoft.com/office/drawing/2016/ink" xmlns:cx8="http://schemas.microsoft.com/office/drawing/2016/5/14/chartex" xmlns:cx7="http://schemas.microsoft.com/office/drawing/2016/5/13/chartex" xmlns:cx6="http://schemas.microsoft.com/office/drawing/2016/5/12/chartex" xmlns:cx5="http://schemas.microsoft.com/office/drawing/2016/5/11/chartex" xmlns:cx4="http://schemas.microsoft.com/office/drawing/2016/5/10/chartex" xmlns:cx3="http://schemas.microsoft.com/office/drawing/2016/5/9/chartex" xmlns:cx2="http://schemas.microsoft.com/office/drawing/2015/10/21/chartex" xmlns:cx1="http://schemas.microsoft.com/office/drawing/2015/9/8/chartex">
+          <mc:Fallback>
             <w:pict>
               <v:rect w14:anchorId="0478E76D" id="Rectángulo 1" o:spid="_x0000_s1026" style="position:absolute;margin-left:0;margin-top:125.55pt;width:341.05pt;height:35.6pt;z-index:251677696;visibility:visible;mso-wrap-style:square;mso-width-percent:0;mso-height-percent:0;mso-wrap-distance-left:9pt;mso-wrap-distance-top:0;mso-wrap-distance-right:9pt;mso-wrap-distance-bottom:0;mso-position-horizontal:left;mso-position-horizontal-relative:margin;mso-position-vertical:absolute;mso-position-vertical-relative:text;mso-width-percent:0;mso-height-percent:0;mso-width-relative:margin;mso-height-relative:margin;v-text-anchor:middle" o:gfxdata="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" fillcolor="yellow" strokecolor="#e00" strokeweight="3pt">
                 <v:fill opacity="20303f"/>
@@ -7323,7 +7444,7 @@
                     <pic:cNvPicPr/>
                   </pic:nvPicPr>
                   <pic:blipFill>
-                    <a:blip r:embed="rId19"/>
+                    <a:blip r:embed="rId21"/>
                     <a:stretch>
                       <a:fillRect/>
                     </a:stretch>
@@ -7363,7 +7484,7 @@
           <w:szCs w:val="24"/>
         </w:rPr>
       </w:pPr>
-      <w:bookmarkStart w:id="10" w:name="_Toc227449332"/>
+      <w:bookmarkStart w:id="10" w:name="_Toc227603168"/>
       <w:r>
         <w:rPr>
           <w:rFonts w:ascii="Arial" w:hAnsi="Arial" w:cs="Arial"/>
@@ -7625,7 +7746,7 @@
               </wp:anchor>
             </w:drawing>
           </mc:Choice>
-          <mc:Fallback xmlns:w16sdtfl="http://schemas.microsoft.com/office/word/2024/wordml/sdtformatlock" xmlns:w16sdtdh="http://schemas.microsoft.com/office/word/2020/wordml/sdtdatahash" xmlns:w16du="http://schemas.microsoft.com/office/word/2023/wordml/word16du" xmlns:w16="http://schemas.microsoft.com/office/word/2018/wordml" xmlns:w16cid="http://schemas.microsoft.com/office/word/2016/wordml/cid" xmlns:w16cex="http://schemas.microsoft.com/office/word/2018/wordml/cex" xmlns:oel="http://schemas.microsoft.com/office/2019/extlst" xmlns:am3d="http://schemas.microsoft.com/office/drawing/2017/model3d" xmlns:aink="http://schemas.microsoft.com/office/drawing/2016/ink" xmlns:cx8="http://schemas.microsoft.com/office/drawing/2016/5/14/chartex" xmlns:cx7="http://schemas.microsoft.com/office/drawing/2016/5/13/chartex" xmlns:cx6="http://schemas.microsoft.com/office/drawing/2016/5/12/chartex" xmlns:cx5="http://schemas.microsoft.com/office/drawing/2016/5/11/chartex" xmlns:cx4="http://schemas.microsoft.com/office/drawing/2016/5/10/chartex" xmlns:cx3="http://schemas.microsoft.com/office/drawing/2016/5/9/chartex" xmlns:cx2="http://schemas.microsoft.com/office/drawing/2015/10/21/chartex" xmlns:cx1="http://schemas.microsoft.com/office/drawing/2015/9/8/chartex">
+          <mc:Fallback>
             <w:pict>
               <v:rect w14:anchorId="6ADCC792" id="Rectángulo 1" o:spid="_x0000_s1026" style="position:absolute;margin-left:188.75pt;margin-top:34.85pt;width:202.3pt;height:35.6pt;z-index:251679744;visibility:visible;mso-wrap-style:square;mso-width-percent:0;mso-height-percent:0;mso-wrap-distance-left:9pt;mso-wrap-distance-top:0;mso-wrap-distance-right:9pt;mso-wrap-distance-bottom:0;mso-position-horizontal:absolute;mso-position-horizontal-relative:margin;mso-position-vertical:absolute;mso-position-vertical-relative:text;mso-width-percent:0;mso-height-percent:0;mso-width-relative:margin;mso-height-relative:margin;v-text-anchor:middle" o:gfxdata="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" fillcolor="yellow" strokecolor="#e00" strokeweight="3pt">
                 <v:fill opacity="20303f"/>
@@ -7657,7 +7778,7 @@
                     <pic:cNvPicPr/>
                   </pic:nvPicPr>
                   <pic:blipFill>
-                    <a:blip r:embed="rId20"/>
+                    <a:blip r:embed="rId22"/>
                     <a:stretch>
                       <a:fillRect/>
                     </a:stretch>
@@ -8185,7 +8306,7 @@
               </wp:anchor>
             </w:drawing>
           </mc:Choice>
-          <mc:Fallback xmlns:w16sdtfl="http://schemas.microsoft.com/office/word/2024/wordml/sdtformatlock" xmlns:w16sdtdh="http://schemas.microsoft.com/office/word/2020/wordml/sdtdatahash" xmlns:w16du="http://schemas.microsoft.com/office/word/2023/wordml/word16du" xmlns:w16="http://schemas.microsoft.com/office/word/2018/wordml" xmlns:w16cid="http://schemas.microsoft.com/office/word/2016/wordml/cid" xmlns:w16cex="http://schemas.microsoft.com/office/word/2018/wordml/cex" xmlns:oel="http://schemas.microsoft.com/office/2019/extlst" xmlns:am3d="http://schemas.microsoft.com/office/drawing/2017/model3d" xmlns:aink="http://schemas.microsoft.com/office/drawing/2016/ink" xmlns:cx8="http://schemas.microsoft.com/office/drawing/2016/5/14/chartex" xmlns:cx7="http://schemas.microsoft.com/office/drawing/2016/5/13/chartex" xmlns:cx6="http://schemas.microsoft.com/office/drawing/2016/5/12/chartex" xmlns:cx5="http://schemas.microsoft.com/office/drawing/2016/5/11/chartex" xmlns:cx4="http://schemas.microsoft.com/office/drawing/2016/5/10/chartex" xmlns:cx3="http://schemas.microsoft.com/office/drawing/2016/5/9/chartex" xmlns:cx2="http://schemas.microsoft.com/office/drawing/2015/10/21/chartex" xmlns:cx1="http://schemas.microsoft.com/office/drawing/2015/9/8/chartex">
+          <mc:Fallback>
             <w:pict>
               <v:rect w14:anchorId="4529021A" id="Rectángulo 1" o:spid="_x0000_s1026" style="position:absolute;margin-left:57.25pt;margin-top:209.4pt;width:270pt;height:24.9pt;z-index:251683840;visibility:visible;mso-wrap-style:square;mso-width-percent:0;mso-height-percent:0;mso-wrap-distance-left:9pt;mso-wrap-distance-top:0;mso-wrap-distance-right:9pt;mso-wrap-distance-bottom:0;mso-position-horizontal:absolute;mso-position-horizontal-relative:margin;mso-position-vertical:absolute;mso-position-vertical-relative:text;mso-width-percent:0;mso-height-percent:0;mso-width-relative:margin;mso-height-relative:margin;v-text-anchor:middle" o:gfxdata="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" fillcolor="yellow" strokecolor="#e00" strokeweight="3pt">
                 <v:fill opacity="20303f"/>
@@ -8274,7 +8395,7 @@
               </wp:anchor>
             </w:drawing>
           </mc:Choice>
-          <mc:Fallback xmlns:w16sdtfl="http://schemas.microsoft.com/office/word/2024/wordml/sdtformatlock" xmlns:w16sdtdh="http://schemas.microsoft.com/office/word/2020/wordml/sdtdatahash" xmlns:w16du="http://schemas.microsoft.com/office/word/2023/wordml/word16du" xmlns:w16="http://schemas.microsoft.com/office/word/2018/wordml" xmlns:w16cid="http://schemas.microsoft.com/office/word/2016/wordml/cid" xmlns:w16cex="http://schemas.microsoft.com/office/word/2018/wordml/cex" xmlns:oel="http://schemas.microsoft.com/office/2019/extlst" xmlns:am3d="http://schemas.microsoft.com/office/drawing/2017/model3d" xmlns:aink="http://schemas.microsoft.com/office/drawing/2016/ink" xmlns:cx8="http://schemas.microsoft.com/office/drawing/2016/5/14/chartex" xmlns:cx7="http://schemas.microsoft.com/office/drawing/2016/5/13/chartex" xmlns:cx6="http://schemas.microsoft.com/office/drawing/2016/5/12/chartex" xmlns:cx5="http://schemas.microsoft.com/office/drawing/2016/5/11/chartex" xmlns:cx4="http://schemas.microsoft.com/office/drawing/2016/5/10/chartex" xmlns:cx3="http://schemas.microsoft.com/office/drawing/2016/5/9/chartex" xmlns:cx2="http://schemas.microsoft.com/office/drawing/2015/10/21/chartex" xmlns:cx1="http://schemas.microsoft.com/office/drawing/2015/9/8/chartex">
+          <mc:Fallback>
             <w:pict>
               <v:rect w14:anchorId="20A26541" id="Rectángulo 1" o:spid="_x0000_s1026" style="position:absolute;margin-left:49.55pt;margin-top:148.4pt;width:210.85pt;height:35.8pt;z-index:251681792;visibility:visible;mso-wrap-style:square;mso-width-percent:0;mso-height-percent:0;mso-wrap-distance-left:9pt;mso-wrap-distance-top:0;mso-wrap-distance-right:9pt;mso-wrap-distance-bottom:0;mso-position-horizontal:absolute;mso-position-horizontal-relative:margin;mso-position-vertical:absolute;mso-position-vertical-relative:text;mso-width-percent:0;mso-height-percent:0;mso-width-relative:margin;mso-height-relative:margin;v-text-anchor:middle" o:gfxdata="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" fillcolor="yellow" strokecolor="#e00" strokeweight="3pt">
                 <v:fill opacity="20303f"/>
@@ -8306,7 +8427,7 @@
                     <pic:cNvPicPr/>
                   </pic:nvPicPr>
                   <pic:blipFill>
-                    <a:blip r:embed="rId21"/>
+                    <a:blip r:embed="rId23"/>
                     <a:stretch>
                       <a:fillRect/>
                     </a:stretch>
@@ -8346,7 +8467,7 @@
           <w:szCs w:val="24"/>
         </w:rPr>
       </w:pPr>
-      <w:bookmarkStart w:id="11" w:name="_Toc227449333"/>
+      <w:bookmarkStart w:id="11" w:name="_Toc227603169"/>
       <w:r>
         <w:rPr>
           <w:rFonts w:ascii="Arial" w:hAnsi="Arial" w:cs="Arial"/>
@@ -8513,7 +8634,7 @@
       <w:pPr>
         <w:keepNext/>
         <w:spacing w:line="480" w:lineRule="auto"/>
-        <w:jc w:val="both"/>
+        <w:jc w:val="center"/>
         <w:rPr>
           <w:rFonts w:ascii="Arial" w:hAnsi="Arial" w:cs="Arial"/>
         </w:rPr>
@@ -8598,7 +8719,7 @@
               </wp:anchor>
             </w:drawing>
           </mc:Choice>
-          <mc:Fallback xmlns:w16sdtfl="http://schemas.microsoft.com/office/word/2024/wordml/sdtformatlock" xmlns:w16sdtdh="http://schemas.microsoft.com/office/word/2020/wordml/sdtdatahash" xmlns:w16du="http://schemas.microsoft.com/office/word/2023/wordml/word16du" xmlns:w16="http://schemas.microsoft.com/office/word/2018/wordml" xmlns:w16cid="http://schemas.microsoft.com/office/word/2016/wordml/cid" xmlns:w16cex="http://schemas.microsoft.com/office/word/2018/wordml/cex" xmlns:oel="http://schemas.microsoft.com/office/2019/extlst" xmlns:am3d="http://schemas.microsoft.com/office/drawing/2017/model3d" xmlns:aink="http://schemas.microsoft.com/office/drawing/2016/ink" xmlns:cx8="http://schemas.microsoft.com/office/drawing/2016/5/14/chartex" xmlns:cx7="http://schemas.microsoft.com/office/drawing/2016/5/13/chartex" xmlns:cx6="http://schemas.microsoft.com/office/drawing/2016/5/12/chartex" xmlns:cx5="http://schemas.microsoft.com/office/drawing/2016/5/11/chartex" xmlns:cx4="http://schemas.microsoft.com/office/drawing/2016/5/10/chartex" xmlns:cx3="http://schemas.microsoft.com/office/drawing/2016/5/9/chartex" xmlns:cx2="http://schemas.microsoft.com/office/drawing/2015/10/21/chartex" xmlns:cx1="http://schemas.microsoft.com/office/drawing/2015/9/8/chartex">
+          <mc:Fallback>
             <w:pict>
               <v:rect w14:anchorId="10AA8B6F" id="Rectángulo 1" o:spid="_x0000_s1026" style="position:absolute;margin-left:52.8pt;margin-top:280.85pt;width:110.3pt;height:78.15pt;z-index:251687936;visibility:visible;mso-wrap-style:square;mso-width-percent:0;mso-height-percent:0;mso-wrap-distance-left:9pt;mso-wrap-distance-top:0;mso-wrap-distance-right:9pt;mso-wrap-distance-bottom:0;mso-position-horizontal:absolute;mso-position-horizontal-relative:margin;mso-position-vertical:absolute;mso-position-vertical-relative:text;mso-width-percent:0;mso-height-percent:0;mso-width-relative:margin;mso-height-relative:margin;v-text-anchor:middle" o:gfxdata="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" fillcolor="yellow" strokecolor="#e00" strokeweight="3pt">
                 <v:fill opacity="20303f"/>
@@ -8687,7 +8808,7 @@
               </wp:anchor>
             </w:drawing>
           </mc:Choice>
-          <mc:Fallback xmlns:w16sdtfl="http://schemas.microsoft.com/office/word/2024/wordml/sdtformatlock" xmlns:w16sdtdh="http://schemas.microsoft.com/office/word/2020/wordml/sdtdatahash" xmlns:w16du="http://schemas.microsoft.com/office/word/2023/wordml/word16du" xmlns:w16="http://schemas.microsoft.com/office/word/2018/wordml" xmlns:w16cid="http://schemas.microsoft.com/office/word/2016/wordml/cid" xmlns:w16cex="http://schemas.microsoft.com/office/word/2018/wordml/cex" xmlns:oel="http://schemas.microsoft.com/office/2019/extlst" xmlns:am3d="http://schemas.microsoft.com/office/drawing/2017/model3d" xmlns:aink="http://schemas.microsoft.com/office/drawing/2016/ink" xmlns:cx8="http://schemas.microsoft.com/office/drawing/2016/5/14/chartex" xmlns:cx7="http://schemas.microsoft.com/office/drawing/2016/5/13/chartex" xmlns:cx6="http://schemas.microsoft.com/office/drawing/2016/5/12/chartex" xmlns:cx5="http://schemas.microsoft.com/office/drawing/2016/5/11/chartex" xmlns:cx4="http://schemas.microsoft.com/office/drawing/2016/5/10/chartex" xmlns:cx3="http://schemas.microsoft.com/office/drawing/2016/5/9/chartex" xmlns:cx2="http://schemas.microsoft.com/office/drawing/2015/10/21/chartex" xmlns:cx1="http://schemas.microsoft.com/office/drawing/2015/9/8/chartex">
+          <mc:Fallback>
             <w:pict>
               <v:rect w14:anchorId="098CD17C" id="Rectángulo 1" o:spid="_x0000_s1026" style="position:absolute;margin-left:50.65pt;margin-top:49pt;width:340.5pt;height:68.3pt;z-index:251685888;visibility:visible;mso-wrap-style:square;mso-width-percent:0;mso-height-percent:0;mso-wrap-distance-left:9pt;mso-wrap-distance-top:0;mso-wrap-distance-right:9pt;mso-wrap-distance-bottom:0;mso-position-horizontal:absolute;mso-position-horizontal-relative:margin;mso-position-vertical:absolute;mso-position-vertical-relative:text;mso-width-percent:0;mso-height-percent:0;mso-width-relative:margin;mso-height-relative:margin;v-text-anchor:middle" o:gfxdata="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" fillcolor="yellow" strokecolor="#e00" strokeweight="3pt">
                 <v:fill opacity="20303f"/>
@@ -8719,7 +8840,7 @@
                     <pic:cNvPicPr/>
                   </pic:nvPicPr>
                   <pic:blipFill>
-                    <a:blip r:embed="rId22"/>
+                    <a:blip r:embed="rId24"/>
                     <a:stretch>
                       <a:fillRect/>
                     </a:stretch>
@@ -8759,7 +8880,7 @@
           <w:szCs w:val="24"/>
         </w:rPr>
       </w:pPr>
-      <w:bookmarkStart w:id="12" w:name="_Toc227449334"/>
+      <w:bookmarkStart w:id="12" w:name="_Toc227603170"/>
       <w:r>
         <w:rPr>
           <w:rFonts w:ascii="Arial" w:hAnsi="Arial" w:cs="Arial"/>
@@ -8955,7 +9076,7 @@
               </wp:anchor>
             </w:drawing>
           </mc:Choice>
-          <mc:Fallback xmlns:w16sdtfl="http://schemas.microsoft.com/office/word/2024/wordml/sdtformatlock" xmlns:w16sdtdh="http://schemas.microsoft.com/office/word/2020/wordml/sdtdatahash" xmlns:w16du="http://schemas.microsoft.com/office/word/2023/wordml/word16du" xmlns:w16="http://schemas.microsoft.com/office/word/2018/wordml" xmlns:w16cid="http://schemas.microsoft.com/office/word/2016/wordml/cid" xmlns:w16cex="http://schemas.microsoft.com/office/word/2018/wordml/cex" xmlns:oel="http://schemas.microsoft.com/office/2019/extlst" xmlns:am3d="http://schemas.microsoft.com/office/drawing/2017/model3d" xmlns:aink="http://schemas.microsoft.com/office/drawing/2016/ink" xmlns:cx8="http://schemas.microsoft.com/office/drawing/2016/5/14/chartex" xmlns:cx7="http://schemas.microsoft.com/office/drawing/2016/5/13/chartex" xmlns:cx6="http://schemas.microsoft.com/office/drawing/2016/5/12/chartex" xmlns:cx5="http://schemas.microsoft.com/office/drawing/2016/5/11/chartex" xmlns:cx4="http://schemas.microsoft.com/office/drawing/2016/5/10/chartex" xmlns:cx3="http://schemas.microsoft.com/office/drawing/2016/5/9/chartex" xmlns:cx2="http://schemas.microsoft.com/office/drawing/2015/10/21/chartex" xmlns:cx1="http://schemas.microsoft.com/office/drawing/2015/9/8/chartex">
+          <mc:Fallback>
             <w:pict>
               <v:rect w14:anchorId="102E155B" id="Rectángulo 1" o:spid="_x0000_s1026" style="position:absolute;margin-left:15.15pt;margin-top:2.1pt;width:398.85pt;height:144.7pt;z-index:251689984;visibility:visible;mso-wrap-style:square;mso-width-percent:0;mso-height-percent:0;mso-wrap-distance-left:9pt;mso-wrap-distance-top:0;mso-wrap-distance-right:9pt;mso-wrap-distance-bottom:0;mso-position-horizontal:absolute;mso-position-horizontal-relative:margin;mso-position-vertical:absolute;mso-position-vertical-relative:text;mso-width-percent:0;mso-height-percent:0;mso-width-relative:margin;mso-height-relative:margin;v-text-anchor:middle" o:gfxdata="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" fillcolor="yellow" strokecolor="#e00" strokeweight="3pt">
                 <v:fill opacity="20303f"/>
@@ -8987,7 +9108,7 @@
                     <pic:cNvPicPr/>
                   </pic:nvPicPr>
                   <pic:blipFill>
-                    <a:blip r:embed="rId23"/>
+                    <a:blip r:embed="rId25"/>
                     <a:stretch>
                       <a:fillRect/>
                     </a:stretch>
@@ -9027,7 +9148,7 @@
           <w:szCs w:val="24"/>
         </w:rPr>
       </w:pPr>
-      <w:bookmarkStart w:id="13" w:name="_Toc227449335"/>
+      <w:bookmarkStart w:id="13" w:name="_Toc227603171"/>
       <w:r>
         <w:rPr>
           <w:rFonts w:ascii="Arial" w:hAnsi="Arial" w:cs="Arial"/>
@@ -9128,8 +9249,6 @@
         </w:rPr>
         <w:t>f</w:t>
       </w:r>
-      <w:bookmarkStart w:id="14" w:name="_GoBack"/>
-      <w:bookmarkEnd w:id="14"/>
       <w:r>
         <w:rPr>
           <w:rFonts w:ascii="Arial" w:hAnsi="Arial" w:cs="Arial"/>
@@ -9492,28 +9611,14 @@
         <w:rPr>
           <w:rFonts w:ascii="Arial" w:hAnsi="Arial" w:cs="Arial"/>
         </w:rPr>
-        <w:t>-in-</w:t>
+        <w:t>-</w:t>
       </w:r>
       <w:proofErr w:type="spellStart"/>
       <w:r>
         <w:rPr>
           <w:rFonts w:ascii="Arial" w:hAnsi="Arial" w:cs="Arial"/>
         </w:rPr>
-        <w:t>the</w:t>
-      </w:r>
-      <w:proofErr w:type="spellEnd"/>
-      <w:r>
-        <w:rPr>
-          <w:rFonts w:ascii="Arial" w:hAnsi="Arial" w:cs="Arial"/>
-        </w:rPr>
-        <w:t>-</w:t>
-      </w:r>
-      <w:proofErr w:type="spellStart"/>
-      <w:r>
-        <w:rPr>
-          <w:rFonts w:ascii="Arial" w:hAnsi="Arial" w:cs="Arial"/>
-        </w:rPr>
-        <w:t>middle</w:t>
+        <w:t>in-the-middle</w:t>
       </w:r>
       <w:proofErr w:type="spellEnd"/>
       <w:r>
@@ -9642,158 +9747,429 @@
         <w:jc w:val="both"/>
         <w:rPr>
           <w:rFonts w:ascii="Arial" w:hAnsi="Arial" w:cs="Arial"/>
-          <w:b/>
-        </w:rPr>
-      </w:pPr>
-      <w:r>
-        <w:rPr>
-          <w:rFonts w:ascii="Arial" w:hAnsi="Arial" w:cs="Arial"/>
-          <w:b/>
+        </w:rPr>
+      </w:pPr>
+      <w:r>
+        <w:rPr>
+          <w:rFonts w:ascii="Arial" w:hAnsi="Arial" w:cs="Arial"/>
         </w:rPr>
         <w:lastRenderedPageBreak/>
-        <w:t>SEGURIDAD EN ENTORNOS PRODUCTIVOS Y USO DE CERTIFICADOS VALIDOS</w:t>
-      </w:r>
-    </w:p>
-    <w:p>
-      <w:pPr>
+        <w:t>Como una forma de presentar la visible diferencia entre el protocolo HTTP y HTTPS, procedemos a utilizar Wireshark para capturar los datos entre el cliente y el servidor.</w:t>
+      </w:r>
+    </w:p>
+    <w:p>
+      <w:pPr>
+        <w:keepNext/>
+        <w:spacing w:line="480" w:lineRule="auto"/>
+        <w:jc w:val="center"/>
+      </w:pPr>
+      <w:r>
+        <w:rPr>
+          <w:rFonts w:ascii="Arial" w:hAnsi="Arial" w:cs="Arial"/>
+          <w:noProof/>
+          <w:lang w:val="es-MX" w:eastAsia="es-MX"/>
+        </w:rPr>
+        <mc:AlternateContent>
+          <mc:Choice Requires="wps">
+            <w:drawing>
+              <wp:anchor distT="0" distB="0" distL="114300" distR="114300" simplePos="0" relativeHeight="251698176" behindDoc="0" locked="0" layoutInCell="1" allowOverlap="1" wp14:anchorId="354E1C89" wp14:editId="04AE07B4">
+                <wp:simplePos x="0" y="0"/>
+                <wp:positionH relativeFrom="margin">
+                  <wp:posOffset>4558665</wp:posOffset>
+                </wp:positionH>
+                <wp:positionV relativeFrom="paragraph">
+                  <wp:posOffset>3422015</wp:posOffset>
+                </wp:positionV>
+                <wp:extent cx="782782" cy="355023"/>
+                <wp:effectExtent l="19050" t="19050" r="17780" b="26035"/>
+                <wp:wrapNone/>
+                <wp:docPr id="1318506158" name="Rectángulo 1"/>
+                <wp:cNvGraphicFramePr/>
+                <a:graphic xmlns:a="http://schemas.openxmlformats.org/drawingml/2006/main">
+                  <a:graphicData uri="http://schemas.microsoft.com/office/word/2010/wordprocessingShape">
+                    <wps:wsp>
+                      <wps:cNvSpPr/>
+                      <wps:spPr>
+                        <a:xfrm>
+                          <a:off x="0" y="0"/>
+                          <a:ext cx="782782" cy="355023"/>
+                        </a:xfrm>
+                        <a:prstGeom prst="rect">
+                          <a:avLst/>
+                        </a:prstGeom>
+                        <a:solidFill>
+                          <a:srgbClr val="FFFF00">
+                            <a:alpha val="31000"/>
+                          </a:srgbClr>
+                        </a:solidFill>
+                        <a:ln w="38100">
+                          <a:solidFill>
+                            <a:srgbClr val="EE0000"/>
+                          </a:solidFill>
+                        </a:ln>
+                      </wps:spPr>
+                      <wps:style>
+                        <a:lnRef idx="2">
+                          <a:schemeClr val="accent1">
+                            <a:shade val="15000"/>
+                          </a:schemeClr>
+                        </a:lnRef>
+                        <a:fillRef idx="1">
+                          <a:schemeClr val="accent1"/>
+                        </a:fillRef>
+                        <a:effectRef idx="0">
+                          <a:schemeClr val="accent1"/>
+                        </a:effectRef>
+                        <a:fontRef idx="minor">
+                          <a:schemeClr val="lt1"/>
+                        </a:fontRef>
+                      </wps:style>
+                      <wps:bodyPr rot="0" spcFirstLastPara="0" vertOverflow="overflow" horzOverflow="overflow" vert="horz" wrap="square" lIns="91440" tIns="45720" rIns="91440" bIns="45720" numCol="1" spcCol="0" rtlCol="0" fromWordArt="0" anchor="ctr" anchorCtr="0" forceAA="0" compatLnSpc="1">
+                        <a:prstTxWarp prst="textNoShape">
+                          <a:avLst/>
+                        </a:prstTxWarp>
+                        <a:noAutofit/>
+                      </wps:bodyPr>
+                    </wps:wsp>
+                  </a:graphicData>
+                </a:graphic>
+                <wp14:sizeRelH relativeFrom="margin">
+                  <wp14:pctWidth>0</wp14:pctWidth>
+                </wp14:sizeRelH>
+                <wp14:sizeRelV relativeFrom="margin">
+                  <wp14:pctHeight>0</wp14:pctHeight>
+                </wp14:sizeRelV>
+              </wp:anchor>
+            </w:drawing>
+          </mc:Choice>
+          <mc:Fallback>
+            <w:pict>
+              <v:rect w14:anchorId="20E45DEA" id="Rectángulo 1" o:spid="_x0000_s1026" style="position:absolute;margin-left:358.95pt;margin-top:269.45pt;width:61.65pt;height:27.95pt;z-index:251698176;visibility:visible;mso-wrap-style:square;mso-width-percent:0;mso-height-percent:0;mso-wrap-distance-left:9pt;mso-wrap-distance-top:0;mso-wrap-distance-right:9pt;mso-wrap-distance-bottom:0;mso-position-horizontal:absolute;mso-position-horizontal-relative:margin;mso-position-vertical:absolute;mso-position-vertical-relative:text;mso-width-percent:0;mso-height-percent:0;mso-width-relative:margin;mso-height-relative:margin;v-text-anchor:middle" o:gfxdata="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" fillcolor="yellow" strokecolor="#e00" strokeweight="3pt">
+                <v:fill opacity="20303f"/>
+                <w10:wrap anchorx="margin"/>
+              </v:rect>
+            </w:pict>
+          </mc:Fallback>
+        </mc:AlternateContent>
+      </w:r>
+      <w:r>
+        <w:rPr>
+          <w:rFonts w:ascii="Arial" w:hAnsi="Arial" w:cs="Arial"/>
+          <w:noProof/>
+          <w:lang w:val="es-MX" w:eastAsia="es-MX"/>
+        </w:rPr>
+        <mc:AlternateContent>
+          <mc:Choice Requires="wps">
+            <w:drawing>
+              <wp:anchor distT="0" distB="0" distL="114300" distR="114300" simplePos="0" relativeHeight="251696128" behindDoc="0" locked="0" layoutInCell="1" allowOverlap="1" wp14:anchorId="13C15E35" wp14:editId="472209D2">
+                <wp:simplePos x="0" y="0"/>
+                <wp:positionH relativeFrom="margin">
+                  <wp:posOffset>289733</wp:posOffset>
+                </wp:positionH>
+                <wp:positionV relativeFrom="paragraph">
+                  <wp:posOffset>1807960</wp:posOffset>
+                </wp:positionV>
+                <wp:extent cx="2495550" cy="659823"/>
+                <wp:effectExtent l="19050" t="19050" r="19050" b="26035"/>
+                <wp:wrapNone/>
+                <wp:docPr id="218442301" name="Rectángulo 1"/>
+                <wp:cNvGraphicFramePr/>
+                <a:graphic xmlns:a="http://schemas.openxmlformats.org/drawingml/2006/main">
+                  <a:graphicData uri="http://schemas.microsoft.com/office/word/2010/wordprocessingShape">
+                    <wps:wsp>
+                      <wps:cNvSpPr/>
+                      <wps:spPr>
+                        <a:xfrm>
+                          <a:off x="0" y="0"/>
+                          <a:ext cx="2495550" cy="659823"/>
+                        </a:xfrm>
+                        <a:prstGeom prst="rect">
+                          <a:avLst/>
+                        </a:prstGeom>
+                        <a:solidFill>
+                          <a:srgbClr val="FFFF00">
+                            <a:alpha val="31000"/>
+                          </a:srgbClr>
+                        </a:solidFill>
+                        <a:ln w="38100">
+                          <a:solidFill>
+                            <a:srgbClr val="EE0000"/>
+                          </a:solidFill>
+                        </a:ln>
+                      </wps:spPr>
+                      <wps:style>
+                        <a:lnRef idx="2">
+                          <a:schemeClr val="accent1">
+                            <a:shade val="15000"/>
+                          </a:schemeClr>
+                        </a:lnRef>
+                        <a:fillRef idx="1">
+                          <a:schemeClr val="accent1"/>
+                        </a:fillRef>
+                        <a:effectRef idx="0">
+                          <a:schemeClr val="accent1"/>
+                        </a:effectRef>
+                        <a:fontRef idx="minor">
+                          <a:schemeClr val="lt1"/>
+                        </a:fontRef>
+                      </wps:style>
+                      <wps:bodyPr rot="0" spcFirstLastPara="0" vertOverflow="overflow" horzOverflow="overflow" vert="horz" wrap="square" lIns="91440" tIns="45720" rIns="91440" bIns="45720" numCol="1" spcCol="0" rtlCol="0" fromWordArt="0" anchor="ctr" anchorCtr="0" forceAA="0" compatLnSpc="1">
+                        <a:prstTxWarp prst="textNoShape">
+                          <a:avLst/>
+                        </a:prstTxWarp>
+                        <a:noAutofit/>
+                      </wps:bodyPr>
+                    </wps:wsp>
+                  </a:graphicData>
+                </a:graphic>
+                <wp14:sizeRelH relativeFrom="margin">
+                  <wp14:pctWidth>0</wp14:pctWidth>
+                </wp14:sizeRelH>
+                <wp14:sizeRelV relativeFrom="margin">
+                  <wp14:pctHeight>0</wp14:pctHeight>
+                </wp14:sizeRelV>
+              </wp:anchor>
+            </w:drawing>
+          </mc:Choice>
+          <mc:Fallback>
+            <w:pict>
+              <v:rect w14:anchorId="43E6F4C3" id="Rectángulo 1" o:spid="_x0000_s1026" style="position:absolute;margin-left:22.8pt;margin-top:142.35pt;width:196.5pt;height:51.95pt;z-index:251696128;visibility:visible;mso-wrap-style:square;mso-width-percent:0;mso-height-percent:0;mso-wrap-distance-left:9pt;mso-wrap-distance-top:0;mso-wrap-distance-right:9pt;mso-wrap-distance-bottom:0;mso-position-horizontal:absolute;mso-position-horizontal-relative:margin;mso-position-vertical:absolute;mso-position-vertical-relative:text;mso-width-percent:0;mso-height-percent:0;mso-width-relative:margin;mso-height-relative:margin;v-text-anchor:middle" o:gfxdata="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" fillcolor="yellow" strokecolor="#e00" strokeweight="3pt">
+                <v:fill opacity="20303f"/>
+                <w10:wrap anchorx="margin"/>
+              </v:rect>
+            </w:pict>
+          </mc:Fallback>
+        </mc:AlternateContent>
+      </w:r>
+      <w:r>
+        <w:rPr>
+          <w:rFonts w:ascii="Arial" w:hAnsi="Arial" w:cs="Arial"/>
+          <w:noProof/>
+          <w:lang w:val="es-MX" w:eastAsia="es-MX"/>
+        </w:rPr>
+        <mc:AlternateContent>
+          <mc:Choice Requires="wps">
+            <w:drawing>
+              <wp:anchor distT="0" distB="0" distL="114300" distR="114300" simplePos="0" relativeHeight="251694080" behindDoc="0" locked="0" layoutInCell="1" allowOverlap="1" wp14:anchorId="62B5C5C0" wp14:editId="1AD1720A">
+                <wp:simplePos x="0" y="0"/>
+                <wp:positionH relativeFrom="margin">
+                  <wp:posOffset>2582660</wp:posOffset>
+                </wp:positionH>
+                <wp:positionV relativeFrom="paragraph">
+                  <wp:posOffset>1371542</wp:posOffset>
+                </wp:positionV>
+                <wp:extent cx="2571750" cy="304396"/>
+                <wp:effectExtent l="19050" t="19050" r="19050" b="19685"/>
+                <wp:wrapNone/>
+                <wp:docPr id="749196114" name="Rectángulo 1"/>
+                <wp:cNvGraphicFramePr/>
+                <a:graphic xmlns:a="http://schemas.openxmlformats.org/drawingml/2006/main">
+                  <a:graphicData uri="http://schemas.microsoft.com/office/word/2010/wordprocessingShape">
+                    <wps:wsp>
+                      <wps:cNvSpPr/>
+                      <wps:spPr>
+                        <a:xfrm>
+                          <a:off x="0" y="0"/>
+                          <a:ext cx="2571750" cy="304396"/>
+                        </a:xfrm>
+                        <a:prstGeom prst="rect">
+                          <a:avLst/>
+                        </a:prstGeom>
+                        <a:solidFill>
+                          <a:srgbClr val="FFFF00">
+                            <a:alpha val="31000"/>
+                          </a:srgbClr>
+                        </a:solidFill>
+                        <a:ln w="38100">
+                          <a:solidFill>
+                            <a:srgbClr val="EE0000"/>
+                          </a:solidFill>
+                        </a:ln>
+                      </wps:spPr>
+                      <wps:style>
+                        <a:lnRef idx="2">
+                          <a:schemeClr val="accent1">
+                            <a:shade val="15000"/>
+                          </a:schemeClr>
+                        </a:lnRef>
+                        <a:fillRef idx="1">
+                          <a:schemeClr val="accent1"/>
+                        </a:fillRef>
+                        <a:effectRef idx="0">
+                          <a:schemeClr val="accent1"/>
+                        </a:effectRef>
+                        <a:fontRef idx="minor">
+                          <a:schemeClr val="lt1"/>
+                        </a:fontRef>
+                      </wps:style>
+                      <wps:bodyPr rot="0" spcFirstLastPara="0" vertOverflow="overflow" horzOverflow="overflow" vert="horz" wrap="square" lIns="91440" tIns="45720" rIns="91440" bIns="45720" numCol="1" spcCol="0" rtlCol="0" fromWordArt="0" anchor="ctr" anchorCtr="0" forceAA="0" compatLnSpc="1">
+                        <a:prstTxWarp prst="textNoShape">
+                          <a:avLst/>
+                        </a:prstTxWarp>
+                        <a:noAutofit/>
+                      </wps:bodyPr>
+                    </wps:wsp>
+                  </a:graphicData>
+                </a:graphic>
+                <wp14:sizeRelH relativeFrom="margin">
+                  <wp14:pctWidth>0</wp14:pctWidth>
+                </wp14:sizeRelH>
+                <wp14:sizeRelV relativeFrom="margin">
+                  <wp14:pctHeight>0</wp14:pctHeight>
+                </wp14:sizeRelV>
+              </wp:anchor>
+            </w:drawing>
+          </mc:Choice>
+          <mc:Fallback>
+            <w:pict>
+              <v:rect w14:anchorId="10BFAC28" id="Rectángulo 1" o:spid="_x0000_s1026" style="position:absolute;margin-left:203.35pt;margin-top:108pt;width:202.5pt;height:23.95pt;z-index:251694080;visibility:visible;mso-wrap-style:square;mso-width-percent:0;mso-height-percent:0;mso-wrap-distance-left:9pt;mso-wrap-distance-top:0;mso-wrap-distance-right:9pt;mso-wrap-distance-bottom:0;mso-position-horizontal:absolute;mso-position-horizontal-relative:margin;mso-position-vertical:absolute;mso-position-vertical-relative:text;mso-width-percent:0;mso-height-percent:0;mso-width-relative:margin;mso-height-relative:margin;v-text-anchor:middle" o:gfxdata="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" fillcolor="yellow" strokecolor="#e00" strokeweight="3pt">
+                <v:fill opacity="20303f"/>
+                <w10:wrap anchorx="margin"/>
+              </v:rect>
+            </w:pict>
+          </mc:Fallback>
+        </mc:AlternateContent>
+      </w:r>
+      <w:r>
+        <w:rPr>
+          <w:noProof/>
+        </w:rPr>
+        <w:drawing>
+          <wp:inline distT="0" distB="0" distL="0" distR="0" wp14:anchorId="447F8C8E" wp14:editId="23951148">
+            <wp:extent cx="5044094" cy="4203982"/>
+            <wp:effectExtent l="19050" t="19050" r="23495" b="25400"/>
+            <wp:docPr id="1755031103" name="Imagen 1"/>
+            <wp:cNvGraphicFramePr>
+              <a:graphicFrameLocks xmlns:a="http://schemas.openxmlformats.org/drawingml/2006/main" noChangeAspect="1"/>
+            </wp:cNvGraphicFramePr>
+            <a:graphic xmlns:a="http://schemas.openxmlformats.org/drawingml/2006/main">
+              <a:graphicData uri="http://schemas.openxmlformats.org/drawingml/2006/picture">
+                <pic:pic xmlns:pic="http://schemas.openxmlformats.org/drawingml/2006/picture">
+                  <pic:nvPicPr>
+                    <pic:cNvPr id="1755031103" name=""/>
+                    <pic:cNvPicPr/>
+                  </pic:nvPicPr>
+                  <pic:blipFill>
+                    <a:blip r:embed="rId26"/>
+                    <a:stretch>
+                      <a:fillRect/>
+                    </a:stretch>
+                  </pic:blipFill>
+                  <pic:spPr>
+                    <a:xfrm>
+                      <a:off x="0" y="0"/>
+                      <a:ext cx="5049574" cy="4208549"/>
+                    </a:xfrm>
+                    <a:prstGeom prst="rect">
+                      <a:avLst/>
+                    </a:prstGeom>
+                    <a:ln>
+                      <a:solidFill>
+                        <a:schemeClr val="tx1"/>
+                      </a:solidFill>
+                    </a:ln>
+                  </pic:spPr>
+                </pic:pic>
+              </a:graphicData>
+            </a:graphic>
+          </wp:inline>
+        </w:drawing>
+      </w:r>
+    </w:p>
+    <w:p>
+      <w:pPr>
+        <w:pStyle w:val="Descripcin"/>
         <w:spacing w:line="480" w:lineRule="auto"/>
         <w:jc w:val="both"/>
         <w:rPr>
           <w:rFonts w:ascii="Arial" w:hAnsi="Arial" w:cs="Arial"/>
-        </w:rPr>
-      </w:pPr>
-      <w:r>
-        <w:rPr>
-          <w:rFonts w:ascii="Arial" w:hAnsi="Arial" w:cs="Arial"/>
-        </w:rPr>
-        <w:t>En entornos</w:t>
-      </w:r>
-      <w:r>
-        <w:rPr>
-          <w:rFonts w:ascii="Arial" w:hAnsi="Arial" w:cs="Arial"/>
-        </w:rPr>
-        <w:t xml:space="preserve"> y </w:t>
-      </w:r>
-      <w:r>
-        <w:rPr>
-          <w:rFonts w:ascii="Arial" w:hAnsi="Arial" w:cs="Arial"/>
-        </w:rPr>
-        <w:t>áreas</w:t>
-      </w:r>
-      <w:r>
-        <w:rPr>
-          <w:rFonts w:ascii="Arial" w:hAnsi="Arial" w:cs="Arial"/>
-        </w:rPr>
-        <w:t xml:space="preserve"> productiv</w:t>
-      </w:r>
-      <w:r>
-        <w:rPr>
-          <w:rFonts w:ascii="Arial" w:hAnsi="Arial" w:cs="Arial"/>
-        </w:rPr>
-        <w:t>a</w:t>
-      </w:r>
-      <w:r>
-        <w:rPr>
-          <w:rFonts w:ascii="Arial" w:hAnsi="Arial" w:cs="Arial"/>
-        </w:rPr>
-        <w:t>s, el uso de certificados digitales válidos es fundamental para garantizar la seguridad y la confianza de los usuarios. A diferencia de los certificados autofirmados</w:t>
-      </w:r>
-      <w:r>
-        <w:rPr>
-          <w:rFonts w:ascii="Arial" w:hAnsi="Arial" w:cs="Arial"/>
-        </w:rPr>
-        <w:t xml:space="preserve"> que</w:t>
-      </w:r>
-      <w:r>
-        <w:rPr>
-          <w:rFonts w:ascii="Arial" w:hAnsi="Arial" w:cs="Arial"/>
-        </w:rPr>
-        <w:t xml:space="preserve"> utiliza</w:t>
-      </w:r>
-      <w:r>
-        <w:rPr>
-          <w:rFonts w:ascii="Arial" w:hAnsi="Arial" w:cs="Arial"/>
-        </w:rPr>
-        <w:t>mos</w:t>
-      </w:r>
-      <w:r>
-        <w:rPr>
-          <w:rFonts w:ascii="Arial" w:hAnsi="Arial" w:cs="Arial"/>
-        </w:rPr>
-        <w:t xml:space="preserve"> en</w:t>
-      </w:r>
-      <w:r>
-        <w:rPr>
-          <w:rFonts w:ascii="Arial" w:hAnsi="Arial" w:cs="Arial"/>
-        </w:rPr>
-        <w:t xml:space="preserve"> el</w:t>
-      </w:r>
-      <w:r>
-        <w:rPr>
-          <w:rFonts w:ascii="Arial" w:hAnsi="Arial" w:cs="Arial"/>
-        </w:rPr>
-        <w:t xml:space="preserve"> desarrollo</w:t>
-      </w:r>
-      <w:r>
-        <w:rPr>
-          <w:rFonts w:ascii="Arial" w:hAnsi="Arial" w:cs="Arial"/>
-        </w:rPr>
-        <w:t xml:space="preserve"> anterior</w:t>
-      </w:r>
-      <w:r>
-        <w:rPr>
-          <w:rFonts w:ascii="Arial" w:hAnsi="Arial" w:cs="Arial"/>
-        </w:rPr>
-        <w:t xml:space="preserve">, los certificados válidos son emitidos por Autoridades Certificadoras (CA) </w:t>
-      </w:r>
-      <w:r>
-        <w:rPr>
-          <w:rFonts w:ascii="Arial" w:hAnsi="Arial" w:cs="Arial"/>
-        </w:rPr>
-        <w:t xml:space="preserve">que son </w:t>
-      </w:r>
-      <w:r>
-        <w:rPr>
-          <w:rFonts w:ascii="Arial" w:hAnsi="Arial" w:cs="Arial"/>
-        </w:rPr>
-        <w:t>reconocidas</w:t>
-      </w:r>
-      <w:r>
-        <w:rPr>
-          <w:rFonts w:ascii="Arial" w:hAnsi="Arial" w:cs="Arial"/>
-        </w:rPr>
-        <w:t xml:space="preserve"> por el navegador</w:t>
-      </w:r>
-      <w:r>
-        <w:rPr>
-          <w:rFonts w:ascii="Arial" w:hAnsi="Arial" w:cs="Arial"/>
-        </w:rPr>
-        <w:t xml:space="preserve">, lo que permite a los </w:t>
-      </w:r>
-      <w:r>
-        <w:rPr>
-          <w:rFonts w:ascii="Arial" w:hAnsi="Arial" w:cs="Arial"/>
-        </w:rPr>
-        <w:t>mismos</w:t>
-      </w:r>
-      <w:r>
-        <w:rPr>
-          <w:rFonts w:ascii="Arial" w:hAnsi="Arial" w:cs="Arial"/>
-        </w:rPr>
-        <w:t xml:space="preserve"> verificar la autenticidad del servidor y evitar advertencias</w:t>
-      </w:r>
-      <w:r>
-        <w:rPr>
-          <w:rFonts w:ascii="Arial" w:hAnsi="Arial" w:cs="Arial"/>
-        </w:rPr>
-        <w:t xml:space="preserve"> o mensajes</w:t>
-      </w:r>
-      <w:r>
-        <w:rPr>
-          <w:rFonts w:ascii="Arial" w:hAnsi="Arial" w:cs="Arial"/>
-        </w:rPr>
-        <w:t xml:space="preserve"> de seguridad.</w:t>
-      </w:r>
+          <w:b/>
+          <w:i w:val="0"/>
+          <w:color w:val="000000" w:themeColor="text1"/>
+          <w:sz w:val="24"/>
+          <w:szCs w:val="24"/>
+        </w:rPr>
+      </w:pPr>
+      <w:bookmarkStart w:id="14" w:name="_Toc227603172"/>
+      <w:r>
+        <w:rPr>
+          <w:rFonts w:ascii="Arial" w:hAnsi="Arial" w:cs="Arial"/>
+          <w:b/>
+          <w:i w:val="0"/>
+          <w:color w:val="000000" w:themeColor="text1"/>
+          <w:sz w:val="24"/>
+          <w:szCs w:val="24"/>
+        </w:rPr>
+        <w:t xml:space="preserve">Ilustración </w:t>
+      </w:r>
+      <w:r>
+        <w:rPr>
+          <w:rFonts w:ascii="Arial" w:hAnsi="Arial" w:cs="Arial"/>
+          <w:b/>
+          <w:i w:val="0"/>
+          <w:color w:val="000000" w:themeColor="text1"/>
+          <w:sz w:val="24"/>
+          <w:szCs w:val="24"/>
+        </w:rPr>
+        <w:fldChar w:fldCharType="begin"/>
+      </w:r>
+      <w:r>
+        <w:rPr>
+          <w:rFonts w:ascii="Arial" w:hAnsi="Arial" w:cs="Arial"/>
+          <w:b/>
+          <w:i w:val="0"/>
+          <w:color w:val="000000" w:themeColor="text1"/>
+          <w:sz w:val="24"/>
+          <w:szCs w:val="24"/>
+        </w:rPr>
+        <w:instrText xml:space="preserve"> SEQ Ilustración \* ARABIC </w:instrText>
+      </w:r>
+      <w:r>
+        <w:rPr>
+          <w:rFonts w:ascii="Arial" w:hAnsi="Arial" w:cs="Arial"/>
+          <w:b/>
+          <w:i w:val="0"/>
+          <w:color w:val="000000" w:themeColor="text1"/>
+          <w:sz w:val="24"/>
+          <w:szCs w:val="24"/>
+        </w:rPr>
+        <w:fldChar w:fldCharType="separate"/>
+      </w:r>
+      <w:r>
+        <w:rPr>
+          <w:rFonts w:ascii="Arial" w:hAnsi="Arial" w:cs="Arial"/>
+          <w:b/>
+          <w:i w:val="0"/>
+          <w:noProof/>
+          <w:color w:val="000000" w:themeColor="text1"/>
+          <w:sz w:val="24"/>
+          <w:szCs w:val="24"/>
+        </w:rPr>
+        <w:t>15</w:t>
+      </w:r>
+      <w:r>
+        <w:rPr>
+          <w:rFonts w:ascii="Arial" w:hAnsi="Arial" w:cs="Arial"/>
+          <w:b/>
+          <w:i w:val="0"/>
+          <w:color w:val="000000" w:themeColor="text1"/>
+          <w:sz w:val="24"/>
+          <w:szCs w:val="24"/>
+        </w:rPr>
+        <w:fldChar w:fldCharType="end"/>
+      </w:r>
+      <w:r>
+        <w:rPr>
+          <w:rFonts w:ascii="Arial" w:hAnsi="Arial" w:cs="Arial"/>
+          <w:b/>
+          <w:i w:val="0"/>
+          <w:color w:val="000000" w:themeColor="text1"/>
+          <w:sz w:val="24"/>
+          <w:szCs w:val="24"/>
+        </w:rPr>
+        <w:t>. Captura de Wireshark del protocolo HTTP.</w:t>
+      </w:r>
+      <w:bookmarkEnd w:id="14"/>
     </w:p>
     <w:p>
       <w:pPr>
@@ -9807,173 +10183,980 @@
         <w:rPr>
           <w:rFonts w:ascii="Arial" w:hAnsi="Arial" w:cs="Arial"/>
         </w:rPr>
-        <w:t xml:space="preserve">Cuando </w:t>
-      </w:r>
-      <w:r>
-        <w:rPr>
-          <w:rFonts w:ascii="Arial" w:hAnsi="Arial" w:cs="Arial"/>
-        </w:rPr>
-        <w:t xml:space="preserve">se utiliza un certificado </w:t>
-      </w:r>
-      <w:r>
-        <w:rPr>
-          <w:rFonts w:ascii="Arial" w:hAnsi="Arial" w:cs="Arial"/>
-        </w:rPr>
-        <w:t>emitido</w:t>
-      </w:r>
-      <w:r>
-        <w:rPr>
-          <w:rFonts w:ascii="Arial" w:hAnsi="Arial" w:cs="Arial"/>
-        </w:rPr>
-        <w:t xml:space="preserve"> por una CA en un sitio web</w:t>
-      </w:r>
-      <w:r>
-        <w:rPr>
-          <w:rFonts w:ascii="Arial" w:hAnsi="Arial" w:cs="Arial"/>
-        </w:rPr>
-        <w:t xml:space="preserve">, el navegador establece </w:t>
-      </w:r>
-      <w:r>
-        <w:rPr>
-          <w:rFonts w:ascii="Arial" w:hAnsi="Arial" w:cs="Arial"/>
-        </w:rPr>
-        <w:t xml:space="preserve">de manera </w:t>
-      </w:r>
-      <w:r>
-        <w:rPr>
-          <w:rFonts w:ascii="Arial" w:hAnsi="Arial" w:cs="Arial"/>
-        </w:rPr>
-        <w:t>automática una</w:t>
-      </w:r>
-      <w:r>
-        <w:rPr>
-          <w:rFonts w:ascii="Arial" w:hAnsi="Arial" w:cs="Arial"/>
-        </w:rPr>
-        <w:t xml:space="preserve"> conexión segura sin mostrar</w:t>
-      </w:r>
-      <w:r>
-        <w:rPr>
-          <w:rFonts w:ascii="Arial" w:hAnsi="Arial" w:cs="Arial"/>
-        </w:rPr>
-        <w:t xml:space="preserve"> algún tipo de</w:t>
-      </w:r>
-      <w:r>
-        <w:rPr>
-          <w:rFonts w:ascii="Arial" w:hAnsi="Arial" w:cs="Arial"/>
-        </w:rPr>
-        <w:t xml:space="preserve"> alerta, lo que mejora </w:t>
-      </w:r>
-      <w:r>
-        <w:rPr>
-          <w:rFonts w:ascii="Arial" w:hAnsi="Arial" w:cs="Arial"/>
-        </w:rPr>
-        <w:t>significativamente</w:t>
-      </w:r>
-      <w:r>
-        <w:rPr>
-          <w:rFonts w:ascii="Arial" w:hAnsi="Arial" w:cs="Arial"/>
-        </w:rPr>
-        <w:t xml:space="preserve"> </w:t>
-      </w:r>
-      <w:r>
-        <w:rPr>
-          <w:rFonts w:ascii="Arial" w:hAnsi="Arial" w:cs="Arial"/>
-        </w:rPr>
-        <w:t xml:space="preserve">la experiencia del usuario y </w:t>
-      </w:r>
-      <w:r>
-        <w:rPr>
-          <w:rFonts w:ascii="Arial" w:hAnsi="Arial" w:cs="Arial"/>
-        </w:rPr>
-        <w:t>mejora</w:t>
-      </w:r>
-      <w:r>
-        <w:rPr>
-          <w:rFonts w:ascii="Arial" w:hAnsi="Arial" w:cs="Arial"/>
-        </w:rPr>
-        <w:t xml:space="preserve"> la credibilidad</w:t>
-      </w:r>
-      <w:r>
-        <w:rPr>
-          <w:rFonts w:ascii="Arial" w:hAnsi="Arial" w:cs="Arial"/>
-        </w:rPr>
-        <w:t xml:space="preserve"> y confianza</w:t>
-      </w:r>
-      <w:r>
-        <w:rPr>
-          <w:rFonts w:ascii="Arial" w:hAnsi="Arial" w:cs="Arial"/>
-        </w:rPr>
-        <w:t xml:space="preserve"> </w:t>
-      </w:r>
-      <w:r>
-        <w:rPr>
-          <w:rFonts w:ascii="Arial" w:hAnsi="Arial" w:cs="Arial"/>
-        </w:rPr>
-        <w:t>con</w:t>
-      </w:r>
-      <w:r>
-        <w:rPr>
-          <w:rFonts w:ascii="Arial" w:hAnsi="Arial" w:cs="Arial"/>
-        </w:rPr>
-        <w:t xml:space="preserve"> la plataforma. Esto </w:t>
-      </w:r>
-      <w:r>
-        <w:rPr>
-          <w:rFonts w:ascii="Arial" w:hAnsi="Arial" w:cs="Arial"/>
-        </w:rPr>
-        <w:t>resulta esencial</w:t>
-      </w:r>
-      <w:r>
-        <w:rPr>
-          <w:rFonts w:ascii="Arial" w:hAnsi="Arial" w:cs="Arial"/>
-        </w:rPr>
-        <w:t xml:space="preserve"> en aplicaciones que manejan </w:t>
-      </w:r>
-      <w:r>
-        <w:rPr>
-          <w:rFonts w:ascii="Arial" w:hAnsi="Arial" w:cs="Arial"/>
-        </w:rPr>
-        <w:t xml:space="preserve">y transmiten </w:t>
-      </w:r>
-      <w:r>
-        <w:rPr>
-          <w:rFonts w:ascii="Arial" w:hAnsi="Arial" w:cs="Arial"/>
-        </w:rPr>
-        <w:t>información sensible, como</w:t>
-      </w:r>
-      <w:r>
-        <w:rPr>
-          <w:rFonts w:ascii="Arial" w:hAnsi="Arial" w:cs="Arial"/>
-        </w:rPr>
-        <w:t xml:space="preserve"> lo son los</w:t>
-      </w:r>
-      <w:r>
-        <w:rPr>
-          <w:rFonts w:ascii="Arial" w:hAnsi="Arial" w:cs="Arial"/>
-        </w:rPr>
-        <w:t xml:space="preserve"> datos personales, credenciales de acceso</w:t>
-      </w:r>
-      <w:r>
-        <w:rPr>
-          <w:rFonts w:ascii="Arial" w:hAnsi="Arial" w:cs="Arial"/>
-        </w:rPr>
-        <w:t>, etc</w:t>
-      </w:r>
-      <w:r>
-        <w:rPr>
-          <w:rFonts w:ascii="Arial" w:hAnsi="Arial" w:cs="Arial"/>
-        </w:rPr>
-        <w:t>.</w:t>
-      </w:r>
+        <w:t>En esta captura de Wireshark se observa el tráfico generado por una petición HTTP enviada desde Postman hacia el servidor local en el puerto 3000</w:t>
+      </w:r>
+      <w:r>
+        <w:rPr>
+          <w:rFonts w:ascii="Arial" w:hAnsi="Arial" w:cs="Arial"/>
+        </w:rPr>
+        <w:t xml:space="preserve">, este </w:t>
+      </w:r>
+      <w:r>
+        <w:rPr>
+          <w:rFonts w:ascii="Arial" w:hAnsi="Arial" w:cs="Arial"/>
+        </w:rPr>
+        <w:t xml:space="preserve">protocolo </w:t>
+      </w:r>
+      <w:r>
+        <w:rPr>
+          <w:rFonts w:ascii="Arial" w:hAnsi="Arial" w:cs="Arial"/>
+          <w:highlight w:val="yellow"/>
+          <w:u w:val="single"/>
+        </w:rPr>
+        <w:t>NO</w:t>
+      </w:r>
+      <w:r>
+        <w:rPr>
+          <w:rFonts w:ascii="Arial" w:hAnsi="Arial" w:cs="Arial"/>
+          <w:highlight w:val="yellow"/>
+          <w:u w:val="single"/>
+        </w:rPr>
+        <w:t xml:space="preserve"> aplica ningún tipo de cifrado</w:t>
+      </w:r>
+      <w:r>
+        <w:rPr>
+          <w:rFonts w:ascii="Arial" w:hAnsi="Arial" w:cs="Arial"/>
+          <w:i/>
+          <w:iCs/>
+          <w:highlight w:val="yellow"/>
+        </w:rPr>
+        <w:t>,</w:t>
+      </w:r>
+      <w:r>
+        <w:rPr>
+          <w:rFonts w:ascii="Arial" w:hAnsi="Arial" w:cs="Arial"/>
+        </w:rPr>
+        <w:t xml:space="preserve"> por lo que tanto los encabezados como el contenido del mensaje pueden visualizarse en texto plano. En el panel central se aprecia claramente el método POST /</w:t>
+      </w:r>
+      <w:proofErr w:type="spellStart"/>
+      <w:r>
+        <w:rPr>
+          <w:rFonts w:ascii="Arial" w:hAnsi="Arial" w:cs="Arial"/>
+        </w:rPr>
+        <w:t>login</w:t>
+      </w:r>
+      <w:proofErr w:type="spellEnd"/>
+      <w:r>
+        <w:rPr>
+          <w:rFonts w:ascii="Arial" w:hAnsi="Arial" w:cs="Arial"/>
+        </w:rPr>
+        <w:t xml:space="preserve">, junto con los encabezados de la solicitud y el cuerpo JSON que contiene las credenciales enviadas (usuario y </w:t>
+      </w:r>
+      <w:proofErr w:type="spellStart"/>
+      <w:proofErr w:type="gramStart"/>
+      <w:r>
+        <w:rPr>
+          <w:rFonts w:ascii="Arial" w:hAnsi="Arial" w:cs="Arial"/>
+        </w:rPr>
+        <w:t>password</w:t>
+      </w:r>
+      <w:proofErr w:type="spellEnd"/>
+      <w:proofErr w:type="gramEnd"/>
+      <w:r>
+        <w:rPr>
+          <w:rFonts w:ascii="Arial" w:hAnsi="Arial" w:cs="Arial"/>
+        </w:rPr>
+        <w:t xml:space="preserve">). Esta evidencia demuestra que, bajo HTTP, cualquier herramienta de captura de tráfico </w:t>
+      </w:r>
+      <w:r>
+        <w:rPr>
+          <w:rFonts w:ascii="Arial" w:hAnsi="Arial" w:cs="Arial"/>
+        </w:rPr>
+        <w:lastRenderedPageBreak/>
+        <w:t>puede leer la información transmitida sin restricciones, lo que representa un riesgo significativo para datos sensibles.</w:t>
+      </w:r>
+    </w:p>
+    <w:p>
+      <w:pPr>
+        <w:spacing w:line="480" w:lineRule="auto"/>
+        <w:jc w:val="both"/>
+        <w:rPr>
+          <w:rFonts w:ascii="Arial" w:hAnsi="Arial" w:cs="Arial"/>
+        </w:rPr>
+      </w:pPr>
     </w:p>
     <w:p>
       <w:pPr>
         <w:keepNext/>
         <w:spacing w:line="480" w:lineRule="auto"/>
         <w:jc w:val="both"/>
-        <w:rPr>
-          <w:rFonts w:ascii="Arial" w:hAnsi="Arial" w:cs="Arial"/>
-        </w:rPr>
+      </w:pPr>
+      <w:r>
+        <w:rPr>
+          <w:rFonts w:ascii="Arial" w:hAnsi="Arial" w:cs="Arial"/>
+          <w:noProof/>
+          <w:lang w:val="es-MX" w:eastAsia="es-MX"/>
+        </w:rPr>
+        <mc:AlternateContent>
+          <mc:Choice Requires="wps">
+            <w:drawing>
+              <wp:anchor distT="0" distB="0" distL="114300" distR="114300" simplePos="0" relativeHeight="251704320" behindDoc="0" locked="0" layoutInCell="1" allowOverlap="1" wp14:anchorId="6720ED6A" wp14:editId="5FF25269">
+                <wp:simplePos x="0" y="0"/>
+                <wp:positionH relativeFrom="margin">
+                  <wp:posOffset>4482465</wp:posOffset>
+                </wp:positionH>
+                <wp:positionV relativeFrom="paragraph">
+                  <wp:posOffset>1425113</wp:posOffset>
+                </wp:positionV>
+                <wp:extent cx="1059700" cy="2689514"/>
+                <wp:effectExtent l="19050" t="19050" r="26670" b="15875"/>
+                <wp:wrapNone/>
+                <wp:docPr id="1690216522" name="Rectángulo 1"/>
+                <wp:cNvGraphicFramePr/>
+                <a:graphic xmlns:a="http://schemas.openxmlformats.org/drawingml/2006/main">
+                  <a:graphicData uri="http://schemas.microsoft.com/office/word/2010/wordprocessingShape">
+                    <wps:wsp>
+                      <wps:cNvSpPr/>
+                      <wps:spPr>
+                        <a:xfrm>
+                          <a:off x="0" y="0"/>
+                          <a:ext cx="1059700" cy="2689514"/>
+                        </a:xfrm>
+                        <a:prstGeom prst="rect">
+                          <a:avLst/>
+                        </a:prstGeom>
+                        <a:solidFill>
+                          <a:srgbClr val="FFFF00">
+                            <a:alpha val="31000"/>
+                          </a:srgbClr>
+                        </a:solidFill>
+                        <a:ln w="38100">
+                          <a:solidFill>
+                            <a:srgbClr val="EE0000"/>
+                          </a:solidFill>
+                        </a:ln>
+                      </wps:spPr>
+                      <wps:style>
+                        <a:lnRef idx="2">
+                          <a:schemeClr val="accent1">
+                            <a:shade val="15000"/>
+                          </a:schemeClr>
+                        </a:lnRef>
+                        <a:fillRef idx="1">
+                          <a:schemeClr val="accent1"/>
+                        </a:fillRef>
+                        <a:effectRef idx="0">
+                          <a:schemeClr val="accent1"/>
+                        </a:effectRef>
+                        <a:fontRef idx="minor">
+                          <a:schemeClr val="lt1"/>
+                        </a:fontRef>
+                      </wps:style>
+                      <wps:bodyPr rot="0" spcFirstLastPara="0" vertOverflow="overflow" horzOverflow="overflow" vert="horz" wrap="square" lIns="91440" tIns="45720" rIns="91440" bIns="45720" numCol="1" spcCol="0" rtlCol="0" fromWordArt="0" anchor="ctr" anchorCtr="0" forceAA="0" compatLnSpc="1">
+                        <a:prstTxWarp prst="textNoShape">
+                          <a:avLst/>
+                        </a:prstTxWarp>
+                        <a:noAutofit/>
+                      </wps:bodyPr>
+                    </wps:wsp>
+                  </a:graphicData>
+                </a:graphic>
+                <wp14:sizeRelH relativeFrom="margin">
+                  <wp14:pctWidth>0</wp14:pctWidth>
+                </wp14:sizeRelH>
+                <wp14:sizeRelV relativeFrom="margin">
+                  <wp14:pctHeight>0</wp14:pctHeight>
+                </wp14:sizeRelV>
+              </wp:anchor>
+            </w:drawing>
+          </mc:Choice>
+          <mc:Fallback>
+            <w:pict>
+              <v:rect w14:anchorId="1E6A2F2D" id="Rectángulo 1" o:spid="_x0000_s1026" style="position:absolute;margin-left:352.95pt;margin-top:112.2pt;width:83.45pt;height:211.75pt;z-index:251704320;visibility:visible;mso-wrap-style:square;mso-width-percent:0;mso-height-percent:0;mso-wrap-distance-left:9pt;mso-wrap-distance-top:0;mso-wrap-distance-right:9pt;mso-wrap-distance-bottom:0;mso-position-horizontal:absolute;mso-position-horizontal-relative:margin;mso-position-vertical:absolute;mso-position-vertical-relative:text;mso-width-percent:0;mso-height-percent:0;mso-width-relative:margin;mso-height-relative:margin;v-text-anchor:middle" o:gfxdata="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" fillcolor="yellow" strokecolor="#e00" strokeweight="3pt">
+                <v:fill opacity="20303f"/>
+                <w10:wrap anchorx="margin"/>
+              </v:rect>
+            </w:pict>
+          </mc:Fallback>
+        </mc:AlternateContent>
+      </w:r>
+      <w:r>
+        <w:rPr>
+          <w:rFonts w:ascii="Arial" w:hAnsi="Arial" w:cs="Arial"/>
+          <w:noProof/>
+          <w:lang w:val="es-MX" w:eastAsia="es-MX"/>
+        </w:rPr>
+        <mc:AlternateContent>
+          <mc:Choice Requires="wps">
+            <w:drawing>
+              <wp:anchor distT="0" distB="0" distL="114300" distR="114300" simplePos="0" relativeHeight="251702272" behindDoc="0" locked="0" layoutInCell="1" allowOverlap="1" wp14:anchorId="6F2912F3" wp14:editId="718BDCB6">
+                <wp:simplePos x="0" y="0"/>
+                <wp:positionH relativeFrom="margin">
+                  <wp:align>left</wp:align>
+                </wp:positionH>
+                <wp:positionV relativeFrom="paragraph">
+                  <wp:posOffset>1814772</wp:posOffset>
+                </wp:positionV>
+                <wp:extent cx="2703368" cy="438150"/>
+                <wp:effectExtent l="19050" t="19050" r="20955" b="19050"/>
+                <wp:wrapNone/>
+                <wp:docPr id="664788518" name="Rectángulo 1"/>
+                <wp:cNvGraphicFramePr/>
+                <a:graphic xmlns:a="http://schemas.openxmlformats.org/drawingml/2006/main">
+                  <a:graphicData uri="http://schemas.microsoft.com/office/word/2010/wordprocessingShape">
+                    <wps:wsp>
+                      <wps:cNvSpPr/>
+                      <wps:spPr>
+                        <a:xfrm>
+                          <a:off x="0" y="0"/>
+                          <a:ext cx="2703368" cy="438150"/>
+                        </a:xfrm>
+                        <a:prstGeom prst="rect">
+                          <a:avLst/>
+                        </a:prstGeom>
+                        <a:solidFill>
+                          <a:srgbClr val="FFFF00">
+                            <a:alpha val="31000"/>
+                          </a:srgbClr>
+                        </a:solidFill>
+                        <a:ln w="38100">
+                          <a:solidFill>
+                            <a:srgbClr val="EE0000"/>
+                          </a:solidFill>
+                        </a:ln>
+                      </wps:spPr>
+                      <wps:style>
+                        <a:lnRef idx="2">
+                          <a:schemeClr val="accent1">
+                            <a:shade val="15000"/>
+                          </a:schemeClr>
+                        </a:lnRef>
+                        <a:fillRef idx="1">
+                          <a:schemeClr val="accent1"/>
+                        </a:fillRef>
+                        <a:effectRef idx="0">
+                          <a:schemeClr val="accent1"/>
+                        </a:effectRef>
+                        <a:fontRef idx="minor">
+                          <a:schemeClr val="lt1"/>
+                        </a:fontRef>
+                      </wps:style>
+                      <wps:bodyPr rot="0" spcFirstLastPara="0" vertOverflow="overflow" horzOverflow="overflow" vert="horz" wrap="square" lIns="91440" tIns="45720" rIns="91440" bIns="45720" numCol="1" spcCol="0" rtlCol="0" fromWordArt="0" anchor="ctr" anchorCtr="0" forceAA="0" compatLnSpc="1">
+                        <a:prstTxWarp prst="textNoShape">
+                          <a:avLst/>
+                        </a:prstTxWarp>
+                        <a:noAutofit/>
+                      </wps:bodyPr>
+                    </wps:wsp>
+                  </a:graphicData>
+                </a:graphic>
+                <wp14:sizeRelH relativeFrom="margin">
+                  <wp14:pctWidth>0</wp14:pctWidth>
+                </wp14:sizeRelH>
+                <wp14:sizeRelV relativeFrom="margin">
+                  <wp14:pctHeight>0</wp14:pctHeight>
+                </wp14:sizeRelV>
+              </wp:anchor>
+            </w:drawing>
+          </mc:Choice>
+          <mc:Fallback>
+            <w:pict>
+              <v:rect w14:anchorId="0DAEA190" id="Rectángulo 1" o:spid="_x0000_s1026" style="position:absolute;margin-left:0;margin-top:142.9pt;width:212.85pt;height:34.5pt;z-index:251702272;visibility:visible;mso-wrap-style:square;mso-width-percent:0;mso-height-percent:0;mso-wrap-distance-left:9pt;mso-wrap-distance-top:0;mso-wrap-distance-right:9pt;mso-wrap-distance-bottom:0;mso-position-horizontal:left;mso-position-horizontal-relative:margin;mso-position-vertical:absolute;mso-position-vertical-relative:text;mso-width-percent:0;mso-height-percent:0;mso-width-relative:margin;mso-height-relative:margin;v-text-anchor:middle" o:gfxdata="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" fillcolor="yellow" strokecolor="#e00" strokeweight="3pt">
+                <v:fill opacity="20303f"/>
+                <w10:wrap anchorx="margin"/>
+              </v:rect>
+            </w:pict>
+          </mc:Fallback>
+        </mc:AlternateContent>
+      </w:r>
+      <w:r>
+        <w:rPr>
+          <w:rFonts w:ascii="Arial" w:hAnsi="Arial" w:cs="Arial"/>
+          <w:noProof/>
+          <w:lang w:val="es-MX" w:eastAsia="es-MX"/>
+        </w:rPr>
+        <mc:AlternateContent>
+          <mc:Choice Requires="wps">
+            <w:drawing>
+              <wp:anchor distT="0" distB="0" distL="114300" distR="114300" simplePos="0" relativeHeight="251700224" behindDoc="0" locked="0" layoutInCell="1" allowOverlap="1" wp14:anchorId="7ED0FE09" wp14:editId="66CD1D25">
+                <wp:simplePos x="0" y="0"/>
+                <wp:positionH relativeFrom="margin">
+                  <wp:align>left</wp:align>
+                </wp:positionH>
+                <wp:positionV relativeFrom="paragraph">
+                  <wp:posOffset>18877</wp:posOffset>
+                </wp:positionV>
+                <wp:extent cx="5405004" cy="1234786"/>
+                <wp:effectExtent l="19050" t="19050" r="24765" b="22860"/>
+                <wp:wrapNone/>
+                <wp:docPr id="1965820536" name="Rectángulo 1"/>
+                <wp:cNvGraphicFramePr/>
+                <a:graphic xmlns:a="http://schemas.openxmlformats.org/drawingml/2006/main">
+                  <a:graphicData uri="http://schemas.microsoft.com/office/word/2010/wordprocessingShape">
+                    <wps:wsp>
+                      <wps:cNvSpPr/>
+                      <wps:spPr>
+                        <a:xfrm>
+                          <a:off x="0" y="0"/>
+                          <a:ext cx="5405004" cy="1234786"/>
+                        </a:xfrm>
+                        <a:prstGeom prst="rect">
+                          <a:avLst/>
+                        </a:prstGeom>
+                        <a:solidFill>
+                          <a:srgbClr val="FFFF00">
+                            <a:alpha val="31000"/>
+                          </a:srgbClr>
+                        </a:solidFill>
+                        <a:ln w="38100">
+                          <a:solidFill>
+                            <a:srgbClr val="EE0000"/>
+                          </a:solidFill>
+                        </a:ln>
+                      </wps:spPr>
+                      <wps:style>
+                        <a:lnRef idx="2">
+                          <a:schemeClr val="accent1">
+                            <a:shade val="15000"/>
+                          </a:schemeClr>
+                        </a:lnRef>
+                        <a:fillRef idx="1">
+                          <a:schemeClr val="accent1"/>
+                        </a:fillRef>
+                        <a:effectRef idx="0">
+                          <a:schemeClr val="accent1"/>
+                        </a:effectRef>
+                        <a:fontRef idx="minor">
+                          <a:schemeClr val="lt1"/>
+                        </a:fontRef>
+                      </wps:style>
+                      <wps:bodyPr rot="0" spcFirstLastPara="0" vertOverflow="overflow" horzOverflow="overflow" vert="horz" wrap="square" lIns="91440" tIns="45720" rIns="91440" bIns="45720" numCol="1" spcCol="0" rtlCol="0" fromWordArt="0" anchor="ctr" anchorCtr="0" forceAA="0" compatLnSpc="1">
+                        <a:prstTxWarp prst="textNoShape">
+                          <a:avLst/>
+                        </a:prstTxWarp>
+                        <a:noAutofit/>
+                      </wps:bodyPr>
+                    </wps:wsp>
+                  </a:graphicData>
+                </a:graphic>
+                <wp14:sizeRelH relativeFrom="margin">
+                  <wp14:pctWidth>0</wp14:pctWidth>
+                </wp14:sizeRelH>
+                <wp14:sizeRelV relativeFrom="margin">
+                  <wp14:pctHeight>0</wp14:pctHeight>
+                </wp14:sizeRelV>
+              </wp:anchor>
+            </w:drawing>
+          </mc:Choice>
+          <mc:Fallback>
+            <w:pict>
+              <v:rect w14:anchorId="1A1FA340" id="Rectángulo 1" o:spid="_x0000_s1026" style="position:absolute;margin-left:0;margin-top:1.5pt;width:425.6pt;height:97.25pt;z-index:251700224;visibility:visible;mso-wrap-style:square;mso-width-percent:0;mso-height-percent:0;mso-wrap-distance-left:9pt;mso-wrap-distance-top:0;mso-wrap-distance-right:9pt;mso-wrap-distance-bottom:0;mso-position-horizontal:left;mso-position-horizontal-relative:margin;mso-position-vertical:absolute;mso-position-vertical-relative:text;mso-width-percent:0;mso-height-percent:0;mso-width-relative:margin;mso-height-relative:margin;v-text-anchor:middle" o:gfxdata="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" fillcolor="yellow" strokecolor="#e00" strokeweight="3pt">
+                <v:fill opacity="20303f"/>
+                <w10:wrap anchorx="margin"/>
+              </v:rect>
+            </w:pict>
+          </mc:Fallback>
+        </mc:AlternateContent>
+      </w:r>
+      <w:r>
+        <w:rPr>
+          <w:noProof/>
+        </w:rPr>
+        <w:drawing>
+          <wp:inline distT="0" distB="0" distL="0" distR="0" wp14:anchorId="37E73546" wp14:editId="33F8FB53">
+            <wp:extent cx="5612130" cy="4386580"/>
+            <wp:effectExtent l="19050" t="19050" r="26670" b="13970"/>
+            <wp:docPr id="76274057" name="Imagen 1"/>
+            <wp:cNvGraphicFramePr>
+              <a:graphicFrameLocks xmlns:a="http://schemas.openxmlformats.org/drawingml/2006/main" noChangeAspect="1"/>
+            </wp:cNvGraphicFramePr>
+            <a:graphic xmlns:a="http://schemas.openxmlformats.org/drawingml/2006/main">
+              <a:graphicData uri="http://schemas.openxmlformats.org/drawingml/2006/picture">
+                <pic:pic xmlns:pic="http://schemas.openxmlformats.org/drawingml/2006/picture">
+                  <pic:nvPicPr>
+                    <pic:cNvPr id="76274057" name=""/>
+                    <pic:cNvPicPr/>
+                  </pic:nvPicPr>
+                  <pic:blipFill>
+                    <a:blip r:embed="rId27"/>
+                    <a:stretch>
+                      <a:fillRect/>
+                    </a:stretch>
+                  </pic:blipFill>
+                  <pic:spPr>
+                    <a:xfrm>
+                      <a:off x="0" y="0"/>
+                      <a:ext cx="5612130" cy="4386580"/>
+                    </a:xfrm>
+                    <a:prstGeom prst="rect">
+                      <a:avLst/>
+                    </a:prstGeom>
+                    <a:ln>
+                      <a:solidFill>
+                        <a:schemeClr val="tx1"/>
+                      </a:solidFill>
+                    </a:ln>
+                  </pic:spPr>
+                </pic:pic>
+              </a:graphicData>
+            </a:graphic>
+          </wp:inline>
+        </w:drawing>
+      </w:r>
+    </w:p>
+    <w:p>
+      <w:pPr>
+        <w:pStyle w:val="Descripcin"/>
+        <w:jc w:val="both"/>
+        <w:rPr>
+          <w:rFonts w:ascii="Arial" w:hAnsi="Arial" w:cs="Arial"/>
+          <w:b/>
+          <w:i w:val="0"/>
+          <w:color w:val="000000" w:themeColor="text1"/>
+          <w:sz w:val="24"/>
+          <w:szCs w:val="24"/>
+        </w:rPr>
+      </w:pPr>
+      <w:bookmarkStart w:id="15" w:name="_Toc227603173"/>
+      <w:r>
+        <w:rPr>
+          <w:rFonts w:ascii="Arial" w:hAnsi="Arial" w:cs="Arial"/>
+          <w:b/>
+          <w:i w:val="0"/>
+          <w:color w:val="000000" w:themeColor="text1"/>
+          <w:sz w:val="24"/>
+          <w:szCs w:val="24"/>
+        </w:rPr>
+        <w:t xml:space="preserve">Ilustración </w:t>
+      </w:r>
+      <w:r>
+        <w:rPr>
+          <w:rFonts w:ascii="Arial" w:hAnsi="Arial" w:cs="Arial"/>
+          <w:b/>
+          <w:i w:val="0"/>
+          <w:color w:val="000000" w:themeColor="text1"/>
+          <w:sz w:val="24"/>
+          <w:szCs w:val="24"/>
+        </w:rPr>
+        <w:fldChar w:fldCharType="begin"/>
+      </w:r>
+      <w:r>
+        <w:rPr>
+          <w:rFonts w:ascii="Arial" w:hAnsi="Arial" w:cs="Arial"/>
+          <w:b/>
+          <w:i w:val="0"/>
+          <w:color w:val="000000" w:themeColor="text1"/>
+          <w:sz w:val="24"/>
+          <w:szCs w:val="24"/>
+        </w:rPr>
+        <w:instrText xml:space="preserve"> SEQ Ilustración \* ARABIC </w:instrText>
+      </w:r>
+      <w:r>
+        <w:rPr>
+          <w:rFonts w:ascii="Arial" w:hAnsi="Arial" w:cs="Arial"/>
+          <w:b/>
+          <w:i w:val="0"/>
+          <w:color w:val="000000" w:themeColor="text1"/>
+          <w:sz w:val="24"/>
+          <w:szCs w:val="24"/>
+        </w:rPr>
+        <w:fldChar w:fldCharType="separate"/>
+      </w:r>
+      <w:r>
+        <w:rPr>
+          <w:rFonts w:ascii="Arial" w:hAnsi="Arial" w:cs="Arial"/>
+          <w:b/>
+          <w:i w:val="0"/>
+          <w:noProof/>
+          <w:color w:val="000000" w:themeColor="text1"/>
+          <w:sz w:val="24"/>
+          <w:szCs w:val="24"/>
+        </w:rPr>
+        <w:t>16</w:t>
+      </w:r>
+      <w:r>
+        <w:rPr>
+          <w:rFonts w:ascii="Arial" w:hAnsi="Arial" w:cs="Arial"/>
+          <w:b/>
+          <w:i w:val="0"/>
+          <w:color w:val="000000" w:themeColor="text1"/>
+          <w:sz w:val="24"/>
+          <w:szCs w:val="24"/>
+        </w:rPr>
+        <w:fldChar w:fldCharType="end"/>
+      </w:r>
+      <w:r>
+        <w:rPr>
+          <w:rFonts w:ascii="Arial" w:hAnsi="Arial" w:cs="Arial"/>
+          <w:b/>
+          <w:i w:val="0"/>
+          <w:color w:val="000000" w:themeColor="text1"/>
+          <w:sz w:val="24"/>
+          <w:szCs w:val="24"/>
+        </w:rPr>
+        <w:t xml:space="preserve">. </w:t>
+      </w:r>
+      <w:r>
+        <w:rPr>
+          <w:rFonts w:ascii="Arial" w:hAnsi="Arial" w:cs="Arial"/>
+          <w:b/>
+          <w:i w:val="0"/>
+          <w:color w:val="000000" w:themeColor="text1"/>
+          <w:sz w:val="24"/>
+          <w:szCs w:val="24"/>
+        </w:rPr>
+        <w:t>Captura de Wireshark del protocolo HTTP</w:t>
+      </w:r>
+      <w:r>
+        <w:rPr>
+          <w:rFonts w:ascii="Arial" w:hAnsi="Arial" w:cs="Arial"/>
+          <w:b/>
+          <w:i w:val="0"/>
+          <w:color w:val="000000" w:themeColor="text1"/>
+          <w:sz w:val="24"/>
+          <w:szCs w:val="24"/>
+        </w:rPr>
+        <w:t>S seguro</w:t>
+      </w:r>
+      <w:r>
+        <w:rPr>
+          <w:rFonts w:ascii="Arial" w:hAnsi="Arial" w:cs="Arial"/>
+          <w:b/>
+          <w:i w:val="0"/>
+          <w:color w:val="000000" w:themeColor="text1"/>
+          <w:sz w:val="24"/>
+          <w:szCs w:val="24"/>
+        </w:rPr>
+        <w:t>.</w:t>
+      </w:r>
+      <w:bookmarkEnd w:id="15"/>
+    </w:p>
+    <w:p>
+      <w:pPr>
+        <w:spacing w:line="480" w:lineRule="auto"/>
+        <w:jc w:val="both"/>
+        <w:rPr>
+          <w:rFonts w:ascii="Arial" w:hAnsi="Arial" w:cs="Arial"/>
+        </w:rPr>
+      </w:pPr>
+      <w:r>
+        <w:rPr>
+          <w:rFonts w:ascii="Arial" w:hAnsi="Arial" w:cs="Arial"/>
+        </w:rPr>
+        <w:t>En la captura de Wireshark se observa el intercambio de paquetes bajo el protocolo TLS 1.3, correspondiente a la comunicación realizada mediante HTTPS</w:t>
+      </w:r>
+      <w:r>
+        <w:rPr>
+          <w:rFonts w:ascii="Arial" w:hAnsi="Arial" w:cs="Arial"/>
+        </w:rPr>
+        <w:t>, en la parte de arriba</w:t>
+      </w:r>
+      <w:r>
+        <w:rPr>
+          <w:rFonts w:ascii="Arial" w:hAnsi="Arial" w:cs="Arial"/>
+        </w:rPr>
+        <w:t xml:space="preserve"> se identifican mensajes como “Client </w:t>
+      </w:r>
+      <w:proofErr w:type="spellStart"/>
+      <w:r>
+        <w:rPr>
+          <w:rFonts w:ascii="Arial" w:hAnsi="Arial" w:cs="Arial"/>
+        </w:rPr>
+        <w:t>Hello</w:t>
+      </w:r>
+      <w:proofErr w:type="spellEnd"/>
+      <w:r>
+        <w:rPr>
+          <w:rFonts w:ascii="Arial" w:hAnsi="Arial" w:cs="Arial"/>
+        </w:rPr>
+        <w:t xml:space="preserve">” y “Server </w:t>
+      </w:r>
+      <w:proofErr w:type="spellStart"/>
+      <w:r>
+        <w:rPr>
+          <w:rFonts w:ascii="Arial" w:hAnsi="Arial" w:cs="Arial"/>
+        </w:rPr>
+        <w:t>Hello</w:t>
+      </w:r>
+      <w:proofErr w:type="spellEnd"/>
+      <w:r>
+        <w:rPr>
+          <w:rFonts w:ascii="Arial" w:hAnsi="Arial" w:cs="Arial"/>
+        </w:rPr>
+        <w:t>”, los cuales forman parte del proceso de negociación inicial donde cliente y servidor acuerdan los algoritmos de cifrado que se utilizarán</w:t>
+      </w:r>
+      <w:r>
+        <w:rPr>
+          <w:rFonts w:ascii="Arial" w:hAnsi="Arial" w:cs="Arial"/>
+        </w:rPr>
+        <w:t>, luego</w:t>
+      </w:r>
+      <w:r>
+        <w:rPr>
+          <w:rFonts w:ascii="Arial" w:hAnsi="Arial" w:cs="Arial"/>
+        </w:rPr>
+        <w:t xml:space="preserve"> todos los paquetes aparecen como “</w:t>
+      </w:r>
+      <w:proofErr w:type="spellStart"/>
+      <w:r>
+        <w:rPr>
+          <w:rFonts w:ascii="Arial" w:hAnsi="Arial" w:cs="Arial"/>
+        </w:rPr>
+        <w:t>Application</w:t>
+      </w:r>
+      <w:proofErr w:type="spellEnd"/>
+      <w:r>
+        <w:rPr>
+          <w:rFonts w:ascii="Arial" w:hAnsi="Arial" w:cs="Arial"/>
+        </w:rPr>
+        <w:t xml:space="preserve"> Data”, lo que indica que el contenido de la comunicación —incluyendo </w:t>
+      </w:r>
+      <w:r>
+        <w:rPr>
+          <w:rFonts w:ascii="Arial" w:hAnsi="Arial" w:cs="Arial"/>
+        </w:rPr>
+        <w:lastRenderedPageBreak/>
+        <w:t>el cuerpo del POST, credenciales y cualquier dato sensible— se encuentra completamente cifrado. En el panel derecho se aprecia que los datos no son legibles, ya que el cifrado TLS impide visualizar el contenido real de la solicitud. Esta evidencia demuestra que, a diferencia de HTTP, la información transmitida mediante HTTPS no puede ser interpretada por herramientas de captura de tráfico.</w:t>
+      </w:r>
+    </w:p>
+    <w:p>
+      <w:pPr>
+        <w:rPr>
+          <w:rFonts w:ascii="Arial" w:hAnsi="Arial" w:cs="Arial"/>
+        </w:rPr>
+      </w:pPr>
+      <w:r>
+        <w:rPr>
+          <w:rFonts w:ascii="Arial" w:hAnsi="Arial" w:cs="Arial"/>
+        </w:rPr>
+        <w:br w:type="page"/>
+      </w:r>
+    </w:p>
+    <w:p>
+      <w:pPr>
+        <w:spacing w:line="480" w:lineRule="auto"/>
+        <w:jc w:val="both"/>
+        <w:rPr>
+          <w:rFonts w:ascii="Arial" w:hAnsi="Arial" w:cs="Arial"/>
+          <w:b/>
+        </w:rPr>
+      </w:pPr>
+      <w:r>
+        <w:rPr>
+          <w:rFonts w:ascii="Arial" w:hAnsi="Arial" w:cs="Arial"/>
+          <w:b/>
+        </w:rPr>
+        <w:lastRenderedPageBreak/>
+        <w:t>SEGURIDAD EN ENTORNOS PRODUCTIVOS Y USO DE CERTIFICADOS VALIDOS</w:t>
+      </w:r>
+    </w:p>
+    <w:p>
+      <w:pPr>
+        <w:spacing w:line="480" w:lineRule="auto"/>
+        <w:jc w:val="both"/>
+        <w:rPr>
+          <w:rFonts w:ascii="Arial" w:hAnsi="Arial" w:cs="Arial"/>
+        </w:rPr>
+      </w:pPr>
+      <w:r>
+        <w:rPr>
+          <w:rFonts w:ascii="Arial" w:hAnsi="Arial" w:cs="Arial"/>
+        </w:rPr>
+        <w:t>En entornos</w:t>
+      </w:r>
+      <w:r>
+        <w:rPr>
+          <w:rFonts w:ascii="Arial" w:hAnsi="Arial" w:cs="Arial"/>
+        </w:rPr>
+        <w:t xml:space="preserve"> y </w:t>
+      </w:r>
+      <w:r>
+        <w:rPr>
+          <w:rFonts w:ascii="Arial" w:hAnsi="Arial" w:cs="Arial"/>
+        </w:rPr>
+        <w:t>áreas</w:t>
+      </w:r>
+      <w:r>
+        <w:rPr>
+          <w:rFonts w:ascii="Arial" w:hAnsi="Arial" w:cs="Arial"/>
+        </w:rPr>
+        <w:t xml:space="preserve"> productiv</w:t>
+      </w:r>
+      <w:r>
+        <w:rPr>
+          <w:rFonts w:ascii="Arial" w:hAnsi="Arial" w:cs="Arial"/>
+        </w:rPr>
+        <w:t>a</w:t>
+      </w:r>
+      <w:r>
+        <w:rPr>
+          <w:rFonts w:ascii="Arial" w:hAnsi="Arial" w:cs="Arial"/>
+        </w:rPr>
+        <w:t>s, el uso de certificados digitales válidos es fundamental para garantizar la seguridad y la confianza de los usuarios. A diferencia de los certificados autofirmados</w:t>
+      </w:r>
+      <w:r>
+        <w:rPr>
+          <w:rFonts w:ascii="Arial" w:hAnsi="Arial" w:cs="Arial"/>
+        </w:rPr>
+        <w:t xml:space="preserve"> que</w:t>
+      </w:r>
+      <w:r>
+        <w:rPr>
+          <w:rFonts w:ascii="Arial" w:hAnsi="Arial" w:cs="Arial"/>
+        </w:rPr>
+        <w:t xml:space="preserve"> utiliza</w:t>
+      </w:r>
+      <w:r>
+        <w:rPr>
+          <w:rFonts w:ascii="Arial" w:hAnsi="Arial" w:cs="Arial"/>
+        </w:rPr>
+        <w:t>mos</w:t>
+      </w:r>
+      <w:r>
+        <w:rPr>
+          <w:rFonts w:ascii="Arial" w:hAnsi="Arial" w:cs="Arial"/>
+        </w:rPr>
+        <w:t xml:space="preserve"> en</w:t>
+      </w:r>
+      <w:r>
+        <w:rPr>
+          <w:rFonts w:ascii="Arial" w:hAnsi="Arial" w:cs="Arial"/>
+        </w:rPr>
+        <w:t xml:space="preserve"> el</w:t>
+      </w:r>
+      <w:r>
+        <w:rPr>
+          <w:rFonts w:ascii="Arial" w:hAnsi="Arial" w:cs="Arial"/>
+        </w:rPr>
+        <w:t xml:space="preserve"> desarrollo</w:t>
+      </w:r>
+      <w:r>
+        <w:rPr>
+          <w:rFonts w:ascii="Arial" w:hAnsi="Arial" w:cs="Arial"/>
+        </w:rPr>
+        <w:t xml:space="preserve"> anterior</w:t>
+      </w:r>
+      <w:r>
+        <w:rPr>
+          <w:rFonts w:ascii="Arial" w:hAnsi="Arial" w:cs="Arial"/>
+        </w:rPr>
+        <w:t xml:space="preserve">, los certificados válidos son emitidos por Autoridades Certificadoras (CA) </w:t>
+      </w:r>
+      <w:r>
+        <w:rPr>
+          <w:rFonts w:ascii="Arial" w:hAnsi="Arial" w:cs="Arial"/>
+        </w:rPr>
+        <w:t xml:space="preserve">que son </w:t>
+      </w:r>
+      <w:r>
+        <w:rPr>
+          <w:rFonts w:ascii="Arial" w:hAnsi="Arial" w:cs="Arial"/>
+        </w:rPr>
+        <w:t>reconocidas</w:t>
+      </w:r>
+      <w:r>
+        <w:rPr>
+          <w:rFonts w:ascii="Arial" w:hAnsi="Arial" w:cs="Arial"/>
+        </w:rPr>
+        <w:t xml:space="preserve"> por el navegador</w:t>
+      </w:r>
+      <w:r>
+        <w:rPr>
+          <w:rFonts w:ascii="Arial" w:hAnsi="Arial" w:cs="Arial"/>
+        </w:rPr>
+        <w:t xml:space="preserve">, lo que permite a los </w:t>
+      </w:r>
+      <w:r>
+        <w:rPr>
+          <w:rFonts w:ascii="Arial" w:hAnsi="Arial" w:cs="Arial"/>
+        </w:rPr>
+        <w:t>mismos</w:t>
+      </w:r>
+      <w:r>
+        <w:rPr>
+          <w:rFonts w:ascii="Arial" w:hAnsi="Arial" w:cs="Arial"/>
+        </w:rPr>
+        <w:t xml:space="preserve"> verificar la autenticidad del servidor y evitar advertencias</w:t>
+      </w:r>
+      <w:r>
+        <w:rPr>
+          <w:rFonts w:ascii="Arial" w:hAnsi="Arial" w:cs="Arial"/>
+        </w:rPr>
+        <w:t xml:space="preserve"> o mensajes</w:t>
+      </w:r>
+      <w:r>
+        <w:rPr>
+          <w:rFonts w:ascii="Arial" w:hAnsi="Arial" w:cs="Arial"/>
+        </w:rPr>
+        <w:t xml:space="preserve"> de seguridad.</w:t>
+      </w:r>
+    </w:p>
+    <w:p>
+      <w:pPr>
+        <w:spacing w:line="480" w:lineRule="auto"/>
+        <w:jc w:val="both"/>
+        <w:rPr>
+          <w:rFonts w:ascii="Arial" w:hAnsi="Arial" w:cs="Arial"/>
+        </w:rPr>
+      </w:pPr>
+      <w:r>
+        <w:rPr>
+          <w:rFonts w:ascii="Arial" w:hAnsi="Arial" w:cs="Arial"/>
+        </w:rPr>
+        <w:t xml:space="preserve">Cuando </w:t>
+      </w:r>
+      <w:r>
+        <w:rPr>
+          <w:rFonts w:ascii="Arial" w:hAnsi="Arial" w:cs="Arial"/>
+        </w:rPr>
+        <w:t xml:space="preserve">se utiliza un certificado </w:t>
+      </w:r>
+      <w:r>
+        <w:rPr>
+          <w:rFonts w:ascii="Arial" w:hAnsi="Arial" w:cs="Arial"/>
+        </w:rPr>
+        <w:t>emitido</w:t>
+      </w:r>
+      <w:r>
+        <w:rPr>
+          <w:rFonts w:ascii="Arial" w:hAnsi="Arial" w:cs="Arial"/>
+        </w:rPr>
+        <w:t xml:space="preserve"> por una CA en un sitio web</w:t>
+      </w:r>
+      <w:r>
+        <w:rPr>
+          <w:rFonts w:ascii="Arial" w:hAnsi="Arial" w:cs="Arial"/>
+        </w:rPr>
+        <w:t xml:space="preserve">, el navegador establece </w:t>
+      </w:r>
+      <w:r>
+        <w:rPr>
+          <w:rFonts w:ascii="Arial" w:hAnsi="Arial" w:cs="Arial"/>
+        </w:rPr>
+        <w:t xml:space="preserve">de manera </w:t>
+      </w:r>
+      <w:r>
+        <w:rPr>
+          <w:rFonts w:ascii="Arial" w:hAnsi="Arial" w:cs="Arial"/>
+        </w:rPr>
+        <w:t>automática una</w:t>
+      </w:r>
+      <w:r>
+        <w:rPr>
+          <w:rFonts w:ascii="Arial" w:hAnsi="Arial" w:cs="Arial"/>
+        </w:rPr>
+        <w:t xml:space="preserve"> conexión segura sin mostrar</w:t>
+      </w:r>
+      <w:r>
+        <w:rPr>
+          <w:rFonts w:ascii="Arial" w:hAnsi="Arial" w:cs="Arial"/>
+        </w:rPr>
+        <w:t xml:space="preserve"> algún tipo de</w:t>
+      </w:r>
+      <w:r>
+        <w:rPr>
+          <w:rFonts w:ascii="Arial" w:hAnsi="Arial" w:cs="Arial"/>
+        </w:rPr>
+        <w:t xml:space="preserve"> alerta, lo que mejora </w:t>
+      </w:r>
+      <w:r>
+        <w:rPr>
+          <w:rFonts w:ascii="Arial" w:hAnsi="Arial" w:cs="Arial"/>
+        </w:rPr>
+        <w:t>significativamente</w:t>
+      </w:r>
+      <w:r>
+        <w:rPr>
+          <w:rFonts w:ascii="Arial" w:hAnsi="Arial" w:cs="Arial"/>
+        </w:rPr>
+        <w:t xml:space="preserve"> </w:t>
+      </w:r>
+      <w:r>
+        <w:rPr>
+          <w:rFonts w:ascii="Arial" w:hAnsi="Arial" w:cs="Arial"/>
+        </w:rPr>
+        <w:t xml:space="preserve">la experiencia del usuario y </w:t>
+      </w:r>
+      <w:r>
+        <w:rPr>
+          <w:rFonts w:ascii="Arial" w:hAnsi="Arial" w:cs="Arial"/>
+        </w:rPr>
+        <w:t>mejora</w:t>
+      </w:r>
+      <w:r>
+        <w:rPr>
+          <w:rFonts w:ascii="Arial" w:hAnsi="Arial" w:cs="Arial"/>
+        </w:rPr>
+        <w:t xml:space="preserve"> la credibilidad</w:t>
+      </w:r>
+      <w:r>
+        <w:rPr>
+          <w:rFonts w:ascii="Arial" w:hAnsi="Arial" w:cs="Arial"/>
+        </w:rPr>
+        <w:t xml:space="preserve"> y confianza</w:t>
+      </w:r>
+      <w:r>
+        <w:rPr>
+          <w:rFonts w:ascii="Arial" w:hAnsi="Arial" w:cs="Arial"/>
+        </w:rPr>
+        <w:t xml:space="preserve"> </w:t>
+      </w:r>
+      <w:r>
+        <w:rPr>
+          <w:rFonts w:ascii="Arial" w:hAnsi="Arial" w:cs="Arial"/>
+        </w:rPr>
+        <w:t>con</w:t>
+      </w:r>
+      <w:r>
+        <w:rPr>
+          <w:rFonts w:ascii="Arial" w:hAnsi="Arial" w:cs="Arial"/>
+        </w:rPr>
+        <w:t xml:space="preserve"> la plataforma. Esto </w:t>
+      </w:r>
+      <w:r>
+        <w:rPr>
+          <w:rFonts w:ascii="Arial" w:hAnsi="Arial" w:cs="Arial"/>
+        </w:rPr>
+        <w:t>resulta esencial</w:t>
+      </w:r>
+      <w:r>
+        <w:rPr>
+          <w:rFonts w:ascii="Arial" w:hAnsi="Arial" w:cs="Arial"/>
+        </w:rPr>
+        <w:t xml:space="preserve"> en aplicaciones que manejan </w:t>
+      </w:r>
+      <w:r>
+        <w:rPr>
+          <w:rFonts w:ascii="Arial" w:hAnsi="Arial" w:cs="Arial"/>
+        </w:rPr>
+        <w:t xml:space="preserve">y transmiten </w:t>
+      </w:r>
+      <w:r>
+        <w:rPr>
+          <w:rFonts w:ascii="Arial" w:hAnsi="Arial" w:cs="Arial"/>
+        </w:rPr>
+        <w:t>información sensible, como</w:t>
+      </w:r>
+      <w:r>
+        <w:rPr>
+          <w:rFonts w:ascii="Arial" w:hAnsi="Arial" w:cs="Arial"/>
+        </w:rPr>
+        <w:t xml:space="preserve"> lo son los</w:t>
+      </w:r>
+      <w:r>
+        <w:rPr>
+          <w:rFonts w:ascii="Arial" w:hAnsi="Arial" w:cs="Arial"/>
+        </w:rPr>
+        <w:t xml:space="preserve"> datos personales, credenciales de acceso</w:t>
+      </w:r>
+      <w:r>
+        <w:rPr>
+          <w:rFonts w:ascii="Arial" w:hAnsi="Arial" w:cs="Arial"/>
+        </w:rPr>
+        <w:t>, etc</w:t>
+      </w:r>
+      <w:r>
+        <w:rPr>
+          <w:rFonts w:ascii="Arial" w:hAnsi="Arial" w:cs="Arial"/>
+        </w:rPr>
+        <w:t>.</w:t>
+      </w:r>
+    </w:p>
+    <w:p>
+      <w:pPr>
+        <w:keepNext/>
+        <w:spacing w:line="480" w:lineRule="auto"/>
+        <w:jc w:val="center"/>
       </w:pPr>
       <w:r>
         <w:rPr>
@@ -10055,7 +11238,7 @@
               </wp:anchor>
             </w:drawing>
           </mc:Choice>
-          <mc:Fallback xmlns:w16sdtfl="http://schemas.microsoft.com/office/word/2024/wordml/sdtformatlock" xmlns:w16sdtdh="http://schemas.microsoft.com/office/word/2020/wordml/sdtdatahash" xmlns:w16du="http://schemas.microsoft.com/office/word/2023/wordml/word16du" xmlns:w16="http://schemas.microsoft.com/office/word/2018/wordml" xmlns:w16cid="http://schemas.microsoft.com/office/word/2016/wordml/cid" xmlns:w16cex="http://schemas.microsoft.com/office/word/2018/wordml/cex" xmlns:oel="http://schemas.microsoft.com/office/2019/extlst" xmlns:am3d="http://schemas.microsoft.com/office/drawing/2017/model3d" xmlns:aink="http://schemas.microsoft.com/office/drawing/2016/ink" xmlns:cx8="http://schemas.microsoft.com/office/drawing/2016/5/14/chartex" xmlns:cx7="http://schemas.microsoft.com/office/drawing/2016/5/13/chartex" xmlns:cx6="http://schemas.microsoft.com/office/drawing/2016/5/12/chartex" xmlns:cx5="http://schemas.microsoft.com/office/drawing/2016/5/11/chartex" xmlns:cx4="http://schemas.microsoft.com/office/drawing/2016/5/10/chartex" xmlns:cx3="http://schemas.microsoft.com/office/drawing/2016/5/9/chartex" xmlns:cx2="http://schemas.microsoft.com/office/drawing/2015/10/21/chartex" xmlns:cx1="http://schemas.microsoft.com/office/drawing/2015/9/8/chartex">
+          <mc:Fallback>
             <w:pict>
               <v:rect w14:anchorId="0EE6FEBA" id="Rectángulo 1" o:spid="_x0000_s1026" style="position:absolute;margin-left:92.65pt;margin-top:50.4pt;width:187.25pt;height:111.4pt;z-index:251692032;visibility:visible;mso-wrap-style:square;mso-width-percent:0;mso-height-percent:0;mso-wrap-distance-left:9pt;mso-wrap-distance-top:0;mso-wrap-distance-right:9pt;mso-wrap-distance-bottom:0;mso-position-horizontal:absolute;mso-position-horizontal-relative:margin;mso-position-vertical:absolute;mso-position-vertical-relative:text;mso-width-percent:0;mso-height-percent:0;mso-width-relative:margin;mso-height-relative:margin;v-text-anchor:middle" o:gfxdata="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" fillcolor="yellow" strokecolor="#e00" strokeweight="3pt">
                 <v:fill opacity="20303f"/>
@@ -10087,7 +11270,7 @@
                     <pic:cNvPicPr/>
                   </pic:nvPicPr>
                   <pic:blipFill>
-                    <a:blip r:embed="rId24"/>
+                    <a:blip r:embed="rId28"/>
                     <a:stretch>
                       <a:fillRect/>
                     </a:stretch>
@@ -10114,110 +11297,82 @@
       </w:r>
     </w:p>
     <w:p>
-      <w:pPr>
-        <w:pStyle w:val="Descripcin"/>
+      <w:bookmarkStart w:id="16" w:name="_Toc227603174"/>
+      <w:r>
+        <w:rPr>
+          <w:rFonts w:ascii="Arial" w:hAnsi="Arial" w:cs="Arial"/>
+          <w:b/>
+          <w:color w:val="000000" w:themeColor="text1"/>
+        </w:rPr>
+        <w:t xml:space="preserve">Ilustración </w:t>
+      </w:r>
+      <w:r>
+        <w:rPr>
+          <w:rFonts w:ascii="Arial" w:hAnsi="Arial" w:cs="Arial"/>
+          <w:b/>
+          <w:color w:val="000000" w:themeColor="text1"/>
+        </w:rPr>
+        <w:fldChar w:fldCharType="begin"/>
+      </w:r>
+      <w:r>
+        <w:rPr>
+          <w:rFonts w:ascii="Arial" w:hAnsi="Arial" w:cs="Arial"/>
+          <w:b/>
+          <w:color w:val="000000" w:themeColor="text1"/>
+        </w:rPr>
+        <w:instrText xml:space="preserve"> SEQ Ilustración \* ARABIC </w:instrText>
+      </w:r>
+      <w:r>
+        <w:rPr>
+          <w:rFonts w:ascii="Arial" w:hAnsi="Arial" w:cs="Arial"/>
+          <w:b/>
+          <w:color w:val="000000" w:themeColor="text1"/>
+        </w:rPr>
+        <w:fldChar w:fldCharType="separate"/>
+      </w:r>
+      <w:r>
+        <w:rPr>
+          <w:rFonts w:ascii="Arial" w:hAnsi="Arial" w:cs="Arial"/>
+          <w:b/>
+          <w:noProof/>
+          <w:color w:val="000000" w:themeColor="text1"/>
+        </w:rPr>
+        <w:t>17</w:t>
+      </w:r>
+      <w:r>
+        <w:rPr>
+          <w:rFonts w:ascii="Arial" w:hAnsi="Arial" w:cs="Arial"/>
+          <w:b/>
+          <w:color w:val="000000" w:themeColor="text1"/>
+        </w:rPr>
+        <w:fldChar w:fldCharType="end"/>
+      </w:r>
+      <w:r>
+        <w:rPr>
+          <w:rFonts w:ascii="Arial" w:hAnsi="Arial" w:cs="Arial"/>
+          <w:b/>
+          <w:color w:val="000000" w:themeColor="text1"/>
+        </w:rPr>
+        <w:t xml:space="preserve">. </w:t>
+      </w:r>
+      <w:r>
+        <w:rPr>
+          <w:rFonts w:ascii="Arial" w:hAnsi="Arial" w:cs="Arial"/>
+          <w:b/>
+          <w:color w:val="000000" w:themeColor="text1"/>
+        </w:rPr>
+        <w:t>Certificado valido de la página de AIEP</w:t>
+      </w:r>
+      <w:bookmarkEnd w:id="16"/>
+    </w:p>
+    <w:p>
+      <w:pPr>
         <w:spacing w:line="480" w:lineRule="auto"/>
         <w:jc w:val="both"/>
         <w:rPr>
           <w:rFonts w:ascii="Arial" w:hAnsi="Arial" w:cs="Arial"/>
-          <w:b/>
-          <w:i w:val="0"/>
-          <w:color w:val="000000" w:themeColor="text1"/>
-          <w:sz w:val="24"/>
-          <w:szCs w:val="24"/>
-        </w:rPr>
-      </w:pPr>
-      <w:bookmarkStart w:id="15" w:name="_Toc227449336"/>
-      <w:r>
-        <w:rPr>
-          <w:rFonts w:ascii="Arial" w:hAnsi="Arial" w:cs="Arial"/>
-          <w:b/>
-          <w:i w:val="0"/>
-          <w:color w:val="000000" w:themeColor="text1"/>
-          <w:sz w:val="24"/>
-          <w:szCs w:val="24"/>
-        </w:rPr>
-        <w:t>Imagen</w:t>
-      </w:r>
-      <w:r>
-        <w:rPr>
-          <w:rFonts w:ascii="Arial" w:hAnsi="Arial" w:cs="Arial"/>
-          <w:b/>
-          <w:i w:val="0"/>
-          <w:color w:val="000000" w:themeColor="text1"/>
-          <w:sz w:val="24"/>
-          <w:szCs w:val="24"/>
-        </w:rPr>
-        <w:t xml:space="preserve"> </w:t>
-      </w:r>
-      <w:r>
-        <w:rPr>
-          <w:rFonts w:ascii="Arial" w:hAnsi="Arial" w:cs="Arial"/>
-          <w:b/>
-          <w:i w:val="0"/>
-          <w:color w:val="000000" w:themeColor="text1"/>
-          <w:sz w:val="24"/>
-          <w:szCs w:val="24"/>
-        </w:rPr>
-        <w:fldChar w:fldCharType="begin"/>
-      </w:r>
-      <w:r>
-        <w:rPr>
-          <w:rFonts w:ascii="Arial" w:hAnsi="Arial" w:cs="Arial"/>
-          <w:b/>
-          <w:i w:val="0"/>
-          <w:color w:val="000000" w:themeColor="text1"/>
-          <w:sz w:val="24"/>
-          <w:szCs w:val="24"/>
-        </w:rPr>
-        <w:instrText xml:space="preserve"> SEQ Ilustración \* ARABIC </w:instrText>
-      </w:r>
-      <w:r>
-        <w:rPr>
-          <w:rFonts w:ascii="Arial" w:hAnsi="Arial" w:cs="Arial"/>
-          <w:b/>
-          <w:i w:val="0"/>
-          <w:color w:val="000000" w:themeColor="text1"/>
-          <w:sz w:val="24"/>
-          <w:szCs w:val="24"/>
-        </w:rPr>
-        <w:fldChar w:fldCharType="separate"/>
-      </w:r>
-      <w:r>
-        <w:rPr>
-          <w:rFonts w:ascii="Arial" w:hAnsi="Arial" w:cs="Arial"/>
-          <w:b/>
-          <w:i w:val="0"/>
-          <w:noProof/>
-          <w:color w:val="000000" w:themeColor="text1"/>
-          <w:sz w:val="24"/>
-          <w:szCs w:val="24"/>
-        </w:rPr>
-        <w:t>15</w:t>
-      </w:r>
-      <w:r>
-        <w:rPr>
-          <w:rFonts w:ascii="Arial" w:hAnsi="Arial" w:cs="Arial"/>
-          <w:b/>
-          <w:i w:val="0"/>
-          <w:color w:val="000000" w:themeColor="text1"/>
-          <w:sz w:val="24"/>
-          <w:szCs w:val="24"/>
-        </w:rPr>
-        <w:fldChar w:fldCharType="end"/>
-      </w:r>
-      <w:r>
-        <w:rPr>
-          <w:rFonts w:ascii="Arial" w:hAnsi="Arial" w:cs="Arial"/>
-          <w:b/>
-          <w:i w:val="0"/>
-          <w:color w:val="000000" w:themeColor="text1"/>
-          <w:sz w:val="24"/>
-          <w:szCs w:val="24"/>
-        </w:rPr>
-        <w:t>. Certificado valido de la página de AIEP.</w:t>
-      </w:r>
-      <w:bookmarkEnd w:id="15"/>
+        </w:rPr>
+      </w:pPr>
     </w:p>
     <w:p>
       <w:pPr>
@@ -10865,11 +12020,9 @@
     </w:p>
     <w:p>
       <w:pPr>
+        <w:keepNext/>
         <w:spacing w:line="480" w:lineRule="auto"/>
         <w:jc w:val="both"/>
-        <w:rPr>
-          <w:rFonts w:ascii="Arial" w:hAnsi="Arial" w:cs="Arial"/>
-        </w:rPr>
       </w:pPr>
       <w:r>
         <w:rPr>
@@ -10878,9 +12031,9 @@
         </w:rPr>
         <w:lastRenderedPageBreak/>
         <w:drawing>
-          <wp:inline distT="0" distB="0" distL="0" distR="0" wp14:anchorId="1D069D91" wp14:editId="146EEAFF">
+          <wp:inline distT="0" distB="0" distL="0" distR="0" wp14:anchorId="1D069D91" wp14:editId="72E2146A">
             <wp:extent cx="5612130" cy="3156585"/>
-            <wp:effectExtent l="0" t="0" r="7620" b="5715"/>
+            <wp:effectExtent l="19050" t="19050" r="26670" b="24765"/>
             <wp:docPr id="1" name="Imagen 1"/>
             <wp:cNvGraphicFramePr>
               <a:graphicFrameLocks xmlns:a="http://schemas.openxmlformats.org/drawingml/2006/main" noChangeAspect="1"/>
@@ -10893,7 +12046,7 @@
                     <pic:cNvPicPr/>
                   </pic:nvPicPr>
                   <pic:blipFill>
-                    <a:blip r:embed="rId25"/>
+                    <a:blip r:embed="rId29"/>
                     <a:stretch>
                       <a:fillRect/>
                     </a:stretch>
@@ -10906,6 +12059,11 @@
                     <a:prstGeom prst="rect">
                       <a:avLst/>
                     </a:prstGeom>
+                    <a:ln>
+                      <a:solidFill>
+                        <a:schemeClr val="tx1"/>
+                      </a:solidFill>
+                    </a:ln>
                   </pic:spPr>
                 </pic:pic>
               </a:graphicData>
@@ -10920,15 +12078,64 @@
         <w:jc w:val="both"/>
         <w:rPr>
           <w:rFonts w:ascii="Arial" w:hAnsi="Arial" w:cs="Arial"/>
-          <w:b/>
-        </w:rPr>
-      </w:pPr>
-      <w:r>
-        <w:rPr>
-          <w:rFonts w:ascii="Arial" w:hAnsi="Arial" w:cs="Arial"/>
-          <w:b/>
-        </w:rPr>
-        <w:t>Imagen 16. Rep</w:t>
+        </w:rPr>
+      </w:pPr>
+      <w:bookmarkStart w:id="17" w:name="_Toc227603175"/>
+      <w:r>
+        <w:rPr>
+          <w:rFonts w:ascii="Arial" w:hAnsi="Arial" w:cs="Arial"/>
+          <w:b/>
+        </w:rPr>
+        <w:t xml:space="preserve">Ilustración </w:t>
+      </w:r>
+      <w:r>
+        <w:rPr>
+          <w:rFonts w:ascii="Arial" w:hAnsi="Arial" w:cs="Arial"/>
+          <w:b/>
+        </w:rPr>
+        <w:fldChar w:fldCharType="begin"/>
+      </w:r>
+      <w:r>
+        <w:rPr>
+          <w:rFonts w:ascii="Arial" w:hAnsi="Arial" w:cs="Arial"/>
+          <w:b/>
+        </w:rPr>
+        <w:instrText xml:space="preserve"> SEQ Ilustración \* ARABIC </w:instrText>
+      </w:r>
+      <w:r>
+        <w:rPr>
+          <w:rFonts w:ascii="Arial" w:hAnsi="Arial" w:cs="Arial"/>
+          <w:b/>
+        </w:rPr>
+        <w:fldChar w:fldCharType="separate"/>
+      </w:r>
+      <w:r>
+        <w:rPr>
+          <w:rFonts w:ascii="Arial" w:hAnsi="Arial" w:cs="Arial"/>
+          <w:b/>
+        </w:rPr>
+        <w:t>18</w:t>
+      </w:r>
+      <w:r>
+        <w:rPr>
+          <w:rFonts w:ascii="Arial" w:hAnsi="Arial" w:cs="Arial"/>
+          <w:b/>
+        </w:rPr>
+        <w:fldChar w:fldCharType="end"/>
+      </w:r>
+      <w:r>
+        <w:rPr>
+          <w:rFonts w:ascii="Arial" w:hAnsi="Arial" w:cs="Arial"/>
+          <w:b/>
+        </w:rPr>
+        <w:t xml:space="preserve">. </w:t>
+      </w:r>
+      <w:r>
+        <w:rPr>
+          <w:rFonts w:ascii="Arial" w:hAnsi="Arial" w:cs="Arial"/>
+          <w:b/>
+        </w:rPr>
+        <w:t>Rep</w:t>
       </w:r>
       <w:r>
         <w:rPr>
@@ -10990,6 +12197,13 @@
         </w:rPr>
         <w:t>.</w:t>
       </w:r>
+      <w:bookmarkEnd w:id="17"/>
+    </w:p>
+    <w:p>
+      <w:pPr>
+        <w:pStyle w:val="Descripcin"/>
+        <w:jc w:val="both"/>
+      </w:pPr>
     </w:p>
     <w:p>
       <w:pPr>
@@ -11411,8 +12625,74 @@
 </w:document>
 </file>
 
+<file path=word/endnotes.xml><?xml version="1.0" encoding="utf-8"?>
+<w:endnotes xmlns:wpc="http://schemas.microsoft.com/office/word/2010/wordprocessingCanvas" xmlns:cx="http://schemas.microsoft.com/office/drawing/2014/chartex" xmlns:cx1="http://schemas.microsoft.com/office/drawing/2015/9/8/chartex" xmlns:cx2="http://schemas.microsoft.com/office/drawing/2015/10/21/chartex" xmlns:cx3="http://schemas.microsoft.com/office/drawing/2016/5/9/chartex" xmlns:cx4="http://schemas.microsoft.com/office/drawing/2016/5/10/chartex" xmlns:cx5="http://schemas.microsoft.com/office/drawing/2016/5/11/chartex" xmlns:cx6="http://schemas.microsoft.com/office/drawing/2016/5/12/chartex" xmlns:cx7="http://schemas.microsoft.com/office/drawing/2016/5/13/chartex" xmlns:cx8="http://schemas.microsoft.com/office/drawing/2016/5/14/chartex" xmlns:mc="http://schemas.openxmlformats.org/markup-compatibility/2006" xmlns:aink="http://schemas.microsoft.com/office/drawing/2016/ink" xmlns:am3d="http://schemas.microsoft.com/office/drawing/2017/model3d" xmlns:o="urn:schemas-microsoft-com:office:office" xmlns:oel="http://schemas.microsoft.com/office/2019/extlst" xmlns:r="http://schemas.openxmlformats.org/officeDocument/2006/relationships" xmlns:m="http://schemas.openxmlformats.org/officeDocument/2006/math" xmlns:v="urn:schemas-microsoft-com:vml" xmlns:wp14="http://schemas.microsoft.com/office/word/2010/wordprocessingDrawing" xmlns:wp="http://schemas.openxmlformats.org/drawingml/2006/wordprocessingDrawing" xmlns:w10="urn:schemas-microsoft-com:office:word" xmlns:w="http://schemas.openxmlformats.org/wordprocessingml/2006/main" xmlns:w14="http://schemas.microsoft.com/office/word/2010/wordml" xmlns:w15="http://schemas.microsoft.com/office/word/2012/wordml" xmlns:w16cex="http://schemas.microsoft.com/office/word/2018/wordml/cex" xmlns:w16cid="http://schemas.microsoft.com/office/word/2016/wordml/cid" xmlns:w16="http://schemas.microsoft.com/office/word/2018/wordml" xmlns:w16du="http://schemas.microsoft.com/office/word/2023/wordml/word16du" xmlns:w16sdtdh="http://schemas.microsoft.com/office/word/2020/wordml/sdtdatahash" xmlns:w16sdtfl="http://schemas.microsoft.com/office/word/2024/wordml/sdtformatlock" xmlns:w16se="http://schemas.microsoft.com/office/word/2015/wordml/symex" xmlns:wpg="http://schemas.microsoft.com/office/word/2010/wordprocessingGroup" xmlns:wpi="http://schemas.microsoft.com/office/word/2010/wordprocessingInk" xmlns:wne="http://schemas.microsoft.com/office/word/2006/wordml" xmlns:wps="http://schemas.microsoft.com/office/word/2010/wordprocessingShape" mc:Ignorable="w14 w15 w16se w16cid w16 w16cex w16sdtdh w16sdtfl w16du wp14">
+  <w:endnote w:type="separator" w:id="-1">
+    <w:p>
+      <w:pPr>
+        <w:spacing w:after="0" w:line="240" w:lineRule="auto"/>
+      </w:pPr>
+      <w:r>
+        <w:separator/>
+      </w:r>
+    </w:p>
+  </w:endnote>
+  <w:endnote w:type="continuationSeparator" w:id="0">
+    <w:p>
+      <w:pPr>
+        <w:spacing w:after="0" w:line="240" w:lineRule="auto"/>
+      </w:pPr>
+      <w:r>
+        <w:continuationSeparator/>
+      </w:r>
+    </w:p>
+  </w:endnote>
+</w:endnotes>
+</file>
+
+<file path=word/footnotes.xml><?xml version="1.0" encoding="utf-8"?>
+<w:footnotes xmlns:wpc="http://schemas.microsoft.com/office/word/2010/wordprocessingCanvas" xmlns:cx="http://schemas.microsoft.com/office/drawing/2014/chartex" xmlns:cx1="http://schemas.microsoft.com/office/drawing/2015/9/8/chartex" xmlns:cx2="http://schemas.microsoft.com/office/drawing/2015/10/21/chartex" xmlns:cx3="http://schemas.microsoft.com/office/drawing/2016/5/9/chartex" xmlns:cx4="http://schemas.microsoft.com/office/drawing/2016/5/10/chartex" xmlns:cx5="http://schemas.microsoft.com/office/drawing/2016/5/11/chartex" xmlns:cx6="http://schemas.microsoft.com/office/drawing/2016/5/12/chartex" xmlns:cx7="http://schemas.microsoft.com/office/drawing/2016/5/13/chartex" xmlns:cx8="http://schemas.microsoft.com/office/drawing/2016/5/14/chartex" xmlns:mc="http://schemas.openxmlformats.org/markup-compatibility/2006" xmlns:aink="http://schemas.microsoft.com/office/drawing/2016/ink" xmlns:am3d="http://schemas.microsoft.com/office/drawing/2017/model3d" xmlns:o="urn:schemas-microsoft-com:office:office" xmlns:oel="http://schemas.microsoft.com/office/2019/extlst" xmlns:r="http://schemas.openxmlformats.org/officeDocument/2006/relationships" xmlns:m="http://schemas.openxmlformats.org/officeDocument/2006/math" xmlns:v="urn:schemas-microsoft-com:vml" xmlns:wp14="http://schemas.microsoft.com/office/word/2010/wordprocessingDrawing" xmlns:wp="http://schemas.openxmlformats.org/drawingml/2006/wordprocessingDrawing" xmlns:w10="urn:schemas-microsoft-com:office:word" xmlns:w="http://schemas.openxmlformats.org/wordprocessingml/2006/main" xmlns:w14="http://schemas.microsoft.com/office/word/2010/wordml" xmlns:w15="http://schemas.microsoft.com/office/word/2012/wordml" xmlns:w16cex="http://schemas.microsoft.com/office/word/2018/wordml/cex" xmlns:w16cid="http://schemas.microsoft.com/office/word/2016/wordml/cid" xmlns:w16="http://schemas.microsoft.com/office/word/2018/wordml" xmlns:w16du="http://schemas.microsoft.com/office/word/2023/wordml/word16du" xmlns:w16sdtdh="http://schemas.microsoft.com/office/word/2020/wordml/sdtdatahash" xmlns:w16sdtfl="http://schemas.microsoft.com/office/word/2024/wordml/sdtformatlock" xmlns:w16se="http://schemas.microsoft.com/office/word/2015/wordml/symex" xmlns:wpg="http://schemas.microsoft.com/office/word/2010/wordprocessingGroup" xmlns:wpi="http://schemas.microsoft.com/office/word/2010/wordprocessingInk" xmlns:wne="http://schemas.microsoft.com/office/word/2006/wordml" xmlns:wps="http://schemas.microsoft.com/office/word/2010/wordprocessingShape" mc:Ignorable="w14 w15 w16se w16cid w16 w16cex w16sdtdh w16sdtfl w16du wp14">
+  <w:footnote w:type="separator" w:id="-1">
+    <w:p>
+      <w:pPr>
+        <w:spacing w:after="0" w:line="240" w:lineRule="auto"/>
+      </w:pPr>
+      <w:r>
+        <w:separator/>
+      </w:r>
+    </w:p>
+  </w:footnote>
+  <w:footnote w:type="continuationSeparator" w:id="0">
+    <w:p>
+      <w:pPr>
+        <w:spacing w:after="0" w:line="240" w:lineRule="auto"/>
+      </w:pPr>
+      <w:r>
+        <w:continuationSeparator/>
+      </w:r>
+    </w:p>
+  </w:footnote>
+  <w:footnote w:id="1">
+    <w:p>
+      <w:pPr>
+        <w:pStyle w:val="Textonotapie"/>
+      </w:pPr>
+      <w:r>
+        <w:rPr>
+          <w:rStyle w:val="Refdenotaalpie"/>
+        </w:rPr>
+        <w:footnoteRef/>
+      </w:r>
+      <w:r>
+        <w:t xml:space="preserve"> </w:t>
+      </w:r>
+    </w:p>
+  </w:footnote>
+</w:footnotes>
+</file>
+
 <file path=word/styles.xml><?xml version="1.0" encoding="utf-8"?>
-<w:styles xmlns:mc="http://schemas.openxmlformats.org/markup-compatibility/2006" xmlns:r="http://schemas.openxmlformats.org/officeDocument/2006/relationships" xmlns:w="http://schemas.openxmlformats.org/wordprocessingml/2006/main" xmlns:w14="http://schemas.microsoft.com/office/word/2010/wordml" xmlns:w15="http://schemas.microsoft.com/office/word/2012/wordml" xmlns:w16se="http://schemas.microsoft.com/office/word/2015/wordml/symex" mc:Ignorable="w14 w15 w16se">
+<w:styles xmlns:mc="http://schemas.openxmlformats.org/markup-compatibility/2006" xmlns:r="http://schemas.openxmlformats.org/officeDocument/2006/relationships" xmlns:w="http://schemas.openxmlformats.org/wordprocessingml/2006/main" xmlns:w14="http://schemas.microsoft.com/office/word/2010/wordml" xmlns:w15="http://schemas.microsoft.com/office/word/2012/wordml" xmlns:w16cex="http://schemas.microsoft.com/office/word/2018/wordml/cex" xmlns:w16cid="http://schemas.microsoft.com/office/word/2016/wordml/cid" xmlns:w16="http://schemas.microsoft.com/office/word/2018/wordml" xmlns:w16du="http://schemas.microsoft.com/office/word/2023/wordml/word16du" xmlns:w16sdtdh="http://schemas.microsoft.com/office/word/2020/wordml/sdtdatahash" xmlns:w16sdtfl="http://schemas.microsoft.com/office/word/2024/wordml/sdtformatlock" xmlns:w16se="http://schemas.microsoft.com/office/word/2015/wordml/symex" mc:Ignorable="w14 w15 w16se w16cid w16 w16cex w16sdtdh w16sdtfl w16du">
   <w:docDefaults>
     <w:rPrDefault>
       <w:rPr>
@@ -11430,7 +12710,7 @@
       </w:pPr>
     </w:pPrDefault>
   </w:docDefaults>
-  <w:latentStyles w:defLockedState="0" w:defUIPriority="99" w:defSemiHidden="0" w:defUnhideWhenUsed="0" w:defQFormat="0" w:count="371">
+  <w:latentStyles w:defLockedState="0" w:defUIPriority="99" w:defSemiHidden="0" w:defUnhideWhenUsed="0" w:defQFormat="0" w:count="376">
     <w:lsdException w:name="Normal" w:uiPriority="0" w:qFormat="1"/>
     <w:lsdException w:name="heading 1" w:uiPriority="9" w:qFormat="1"/>
     <w:lsdException w:name="heading 2" w:semiHidden="1" w:uiPriority="9" w:unhideWhenUsed="1" w:qFormat="1"/>
@@ -11802,6 +13082,11 @@
     <w:lsdException w:name="List Table 5 Dark Accent 6" w:uiPriority="50"/>
     <w:lsdException w:name="List Table 6 Colorful Accent 6" w:uiPriority="51"/>
     <w:lsdException w:name="List Table 7 Colorful Accent 6" w:uiPriority="52"/>
+    <w:lsdException w:name="Mention" w:semiHidden="1" w:unhideWhenUsed="1"/>
+    <w:lsdException w:name="Smart Hyperlink" w:semiHidden="1" w:unhideWhenUsed="1"/>
+    <w:lsdException w:name="Hashtag" w:semiHidden="1" w:unhideWhenUsed="1"/>
+    <w:lsdException w:name="Unresolved Mention" w:semiHidden="1" w:unhideWhenUsed="1"/>
+    <w:lsdException w:name="Smart Link" w:semiHidden="1" w:unhideWhenUsed="1"/>
   </w:latentStyles>
   <w:style w:type="paragraph" w:default="1" w:styleId="Normal">
     <w:name w:val="Normal"/>
@@ -12385,8 +13670,8 @@
       <w:szCs w:val="18"/>
     </w:rPr>
   </w:style>
-  <w:style w:type="character" w:customStyle="1" w:styleId="UnresolvedMention">
-    <w:name w:val="Unresolved Mention"/>
+  <w:style w:type="character" w:customStyle="1" w:styleId="Mencinsinresolver1">
+    <w:name w:val="Mención sin resolver1"/>
     <w:basedOn w:val="Fuentedeprrafopredeter"/>
     <w:uiPriority w:val="99"/>
     <w:semiHidden/>
@@ -12418,6 +13703,45 @@
     <w:rPr>
       <w:color w:val="96607D" w:themeColor="followedHyperlink"/>
       <w:u w:val="single"/>
+    </w:rPr>
+  </w:style>
+  <w:style w:type="paragraph" w:styleId="Textonotapie">
+    <w:name w:val="footnote text"/>
+    <w:basedOn w:val="Normal"/>
+    <w:link w:val="TextonotapieCar"/>
+    <w:uiPriority w:val="99"/>
+    <w:semiHidden/>
+    <w:unhideWhenUsed/>
+    <w:rsid w:val="006E1B54"/>
+    <w:pPr>
+      <w:spacing w:after="0" w:line="240" w:lineRule="auto"/>
+    </w:pPr>
+    <w:rPr>
+      <w:sz w:val="20"/>
+      <w:szCs w:val="20"/>
+    </w:rPr>
+  </w:style>
+  <w:style w:type="character" w:customStyle="1" w:styleId="TextonotapieCar">
+    <w:name w:val="Texto nota pie Car"/>
+    <w:basedOn w:val="Fuentedeprrafopredeter"/>
+    <w:link w:val="Textonotapie"/>
+    <w:uiPriority w:val="99"/>
+    <w:semiHidden/>
+    <w:rsid w:val="006E1B54"/>
+    <w:rPr>
+      <w:sz w:val="20"/>
+      <w:szCs w:val="20"/>
+    </w:rPr>
+  </w:style>
+  <w:style w:type="character" w:styleId="Refdenotaalpie">
+    <w:name w:val="footnote reference"/>
+    <w:basedOn w:val="Fuentedeprrafopredeter"/>
+    <w:uiPriority w:val="99"/>
+    <w:semiHidden/>
+    <w:unhideWhenUsed/>
+    <w:rsid w:val="006E1B54"/>
+    <w:rPr>
+      <w:vertAlign w:val="superscript"/>
     </w:rPr>
   </w:style>
 </w:styles>

</xml_diff>